<commit_message>
Added levels 1-4, with a message at level 5 (Most likely will be boss fight.
</commit_message>
<xml_diff>
--- a/Brick Blitz Documentation - Berkay Topal.docx
+++ b/Brick Blitz Documentation - Berkay Topal.docx
@@ -1581,6 +1581,388 @@
             </a:graphic>
           </wp:inline>
         </w:drawing>
+      </w:r>
+    </w:p>
+    <w:p>
+      <w:pPr>
+        <w:rPr>
+          <w:b/>
+          <w:bCs/>
+        </w:rPr>
+      </w:pPr>
+    </w:p>
+    <w:p>
+      <w:pPr>
+        <w:rPr>
+          <w:b/>
+          <w:bCs/>
+        </w:rPr>
+      </w:pPr>
+    </w:p>
+    <w:p>
+      <w:pPr>
+        <w:rPr>
+          <w:b/>
+          <w:bCs/>
+        </w:rPr>
+      </w:pPr>
+    </w:p>
+    <w:p>
+      <w:pPr>
+        <w:rPr>
+          <w:b/>
+          <w:bCs/>
+        </w:rPr>
+      </w:pPr>
+    </w:p>
+    <w:p>
+      <w:pPr>
+        <w:rPr>
+          <w:b/>
+          <w:bCs/>
+        </w:rPr>
+      </w:pPr>
+    </w:p>
+    <w:p>
+      <w:pPr>
+        <w:rPr>
+          <w:b/>
+          <w:bCs/>
+        </w:rPr>
+      </w:pPr>
+    </w:p>
+    <w:p>
+      <w:pPr>
+        <w:rPr>
+          <w:b/>
+          <w:bCs/>
+        </w:rPr>
+      </w:pPr>
+    </w:p>
+    <w:p>
+      <w:pPr>
+        <w:rPr>
+          <w:b/>
+          <w:bCs/>
+        </w:rPr>
+      </w:pPr>
+    </w:p>
+    <w:p>
+      <w:pPr>
+        <w:rPr>
+          <w:b/>
+          <w:bCs/>
+        </w:rPr>
+      </w:pPr>
+    </w:p>
+    <w:p>
+      <w:pPr>
+        <w:rPr>
+          <w:b/>
+          <w:bCs/>
+        </w:rPr>
+      </w:pPr>
+    </w:p>
+    <w:p>
+      <w:pPr>
+        <w:rPr>
+          <w:b/>
+          <w:bCs/>
+        </w:rPr>
+      </w:pPr>
+    </w:p>
+    <w:p>
+      <w:pPr>
+        <w:rPr>
+          <w:b/>
+          <w:bCs/>
+        </w:rPr>
+      </w:pPr>
+    </w:p>
+    <w:p>
+      <w:pPr>
+        <w:rPr>
+          <w:b/>
+          <w:bCs/>
+        </w:rPr>
+      </w:pPr>
+    </w:p>
+    <w:p>
+      <w:pPr>
+        <w:rPr>
+          <w:b/>
+          <w:bCs/>
+          <w:color w:val="00B0F0"/>
+          <w:sz w:val="40"/>
+          <w:szCs w:val="40"/>
+          <w:u w:val="single"/>
+        </w:rPr>
+      </w:pPr>
+      <w:r>
+        <w:rPr>
+          <w:b/>
+          <w:bCs/>
+          <w:color w:val="00B0F0"/>
+          <w:sz w:val="40"/>
+          <w:szCs w:val="40"/>
+          <w:u w:val="single"/>
+        </w:rPr>
+        <w:lastRenderedPageBreak/>
+        <w:t>Deliverable</w:t>
+      </w:r>
+      <w:r>
+        <w:rPr>
+          <w:b/>
+          <w:bCs/>
+          <w:color w:val="00B0F0"/>
+          <w:sz w:val="40"/>
+          <w:szCs w:val="40"/>
+          <w:u w:val="single"/>
+        </w:rPr>
+        <w:t xml:space="preserve"> 2</w:t>
+      </w:r>
+    </w:p>
+    <w:p>
+      <w:pPr>
+        <w:rPr>
+          <w:b/>
+          <w:bCs/>
+          <w:color w:val="00B050"/>
+          <w:u w:val="single"/>
+        </w:rPr>
+      </w:pPr>
+      <w:r>
+        <w:rPr>
+          <w:b/>
+          <w:bCs/>
+          <w:color w:val="00B050"/>
+          <w:u w:val="single"/>
+        </w:rPr>
+        <w:t xml:space="preserve">Section 1: </w:t>
+      </w:r>
+      <w:r>
+        <w:rPr>
+          <w:b/>
+          <w:bCs/>
+          <w:color w:val="00B050"/>
+          <w:u w:val="single"/>
+        </w:rPr>
+        <w:t>Review Your Initial Proposal</w:t>
+      </w:r>
+    </w:p>
+    <w:p>
+      <w:pPr>
+        <w:rPr>
+          <w:color w:val="FF0000"/>
+        </w:rPr>
+      </w:pPr>
+      <w:r>
+        <w:rPr>
+          <w:color w:val="FF0000"/>
+        </w:rPr>
+        <w:t>Have you clearly stated your game option and its justification?</w:t>
+      </w:r>
+    </w:p>
+    <w:p>
+      <w:pPr>
+        <w:pStyle w:val="ListParagraph"/>
+        <w:numPr>
+          <w:ilvl w:val="0"/>
+          <w:numId w:val="1"/>
+        </w:numPr>
+        <w:rPr>
+          <w:noProof/>
+        </w:rPr>
+      </w:pPr>
+      <w:r>
+        <w:rPr>
+          <w:noProof/>
+        </w:rPr>
+        <w:t>Yes I have.</w:t>
+      </w:r>
+    </w:p>
+    <w:p>
+      <w:pPr>
+        <w:rPr>
+          <w:noProof/>
+        </w:rPr>
+      </w:pPr>
+    </w:p>
+    <w:p>
+      <w:pPr>
+        <w:rPr>
+          <w:noProof/>
+          <w:color w:val="FF0000"/>
+        </w:rPr>
+      </w:pPr>
+      <w:r>
+        <w:rPr>
+          <w:noProof/>
+          <w:color w:val="FF0000"/>
+        </w:rPr>
+        <w:t>Is your initial class diagram still valid, or does it need refinement based on new ideas?</w:t>
+      </w:r>
+    </w:p>
+    <w:p>
+      <w:pPr>
+        <w:pStyle w:val="ListParagraph"/>
+        <w:numPr>
+          <w:ilvl w:val="0"/>
+          <w:numId w:val="1"/>
+        </w:numPr>
+        <w:rPr>
+          <w:noProof/>
+        </w:rPr>
+      </w:pPr>
+      <w:r>
+        <w:rPr>
+          <w:noProof/>
+        </w:rPr>
+        <w:t>Currently in terms of all the classes the class diagram is still valid, but more relationships can be shown between the classes</w:t>
+      </w:r>
+    </w:p>
+    <w:p>
+      <w:pPr>
+        <w:rPr>
+          <w:noProof/>
+        </w:rPr>
+      </w:pPr>
+    </w:p>
+    <w:p>
+      <w:pPr>
+        <w:rPr>
+          <w:noProof/>
+          <w:color w:val="FF0000"/>
+        </w:rPr>
+      </w:pPr>
+      <w:r>
+        <w:rPr>
+          <w:noProof/>
+          <w:color w:val="FF0000"/>
+        </w:rPr>
+        <w:t>What aspects of your initial design work well?</w:t>
+      </w:r>
+    </w:p>
+    <w:p>
+      <w:pPr>
+        <w:pStyle w:val="ListParagraph"/>
+        <w:numPr>
+          <w:ilvl w:val="0"/>
+          <w:numId w:val="1"/>
+        </w:numPr>
+        <w:rPr>
+          <w:noProof/>
+        </w:rPr>
+      </w:pPr>
+      <w:r>
+        <w:rPr>
+          <w:noProof/>
+        </w:rPr>
+        <w:t>Is properly thought out, where all the foundational mechanics of the game have been thought out well, making it easier to implement the features</w:t>
+      </w:r>
+    </w:p>
+    <w:p>
+      <w:pPr>
+        <w:rPr>
+          <w:noProof/>
+        </w:rPr>
+      </w:pPr>
+    </w:p>
+    <w:p>
+      <w:pPr>
+        <w:pStyle w:val="ListParagraph"/>
+        <w:numPr>
+          <w:ilvl w:val="0"/>
+          <w:numId w:val="1"/>
+        </w:numPr>
+        <w:rPr>
+          <w:noProof/>
+        </w:rPr>
+      </w:pPr>
+      <w:r>
+        <w:rPr>
+          <w:noProof/>
+        </w:rPr>
+        <w:t>Helps me to understand my target audience and what I’m actually making, providing motivation and purpose when making the game</w:t>
+      </w:r>
+    </w:p>
+    <w:p>
+      <w:pPr>
+        <w:pStyle w:val="ListParagraph"/>
+        <w:rPr>
+          <w:noProof/>
+        </w:rPr>
+      </w:pPr>
+    </w:p>
+    <w:p>
+      <w:pPr>
+        <w:rPr>
+          <w:noProof/>
+        </w:rPr>
+      </w:pPr>
+    </w:p>
+    <w:p>
+      <w:pPr>
+        <w:rPr>
+          <w:noProof/>
+          <w:color w:val="FF0000"/>
+        </w:rPr>
+      </w:pPr>
+      <w:r>
+        <w:rPr>
+          <w:noProof/>
+          <w:color w:val="FF0000"/>
+        </w:rPr>
+        <w:t>Which areas need more detail or clarification?</w:t>
+      </w:r>
+    </w:p>
+    <w:p>
+      <w:pPr>
+        <w:pStyle w:val="ListParagraph"/>
+        <w:numPr>
+          <w:ilvl w:val="0"/>
+          <w:numId w:val="1"/>
+        </w:numPr>
+        <w:rPr>
+          <w:noProof/>
+        </w:rPr>
+      </w:pPr>
+      <w:r>
+        <w:rPr>
+          <w:noProof/>
+        </w:rPr>
+        <w:t>Need to make pseudocode to get an idea of how the algorithms will look like</w:t>
+      </w:r>
+    </w:p>
+    <w:p>
+      <w:pPr>
+        <w:rPr>
+          <w:noProof/>
+        </w:rPr>
+      </w:pPr>
+    </w:p>
+    <w:p>
+      <w:pPr>
+        <w:pStyle w:val="ListParagraph"/>
+        <w:numPr>
+          <w:ilvl w:val="0"/>
+          <w:numId w:val="1"/>
+        </w:numPr>
+        <w:rPr>
+          <w:noProof/>
+        </w:rPr>
+      </w:pPr>
+      <w:r>
+        <w:rPr>
+          <w:noProof/>
+        </w:rPr>
+        <w:t>Also need to think about further then just the foundations, such as how each level will look like</w:t>
+      </w:r>
+      <w:r>
+        <w:rPr>
+          <w:noProof/>
+        </w:rPr>
+        <w:t>, and if I will have a final boss level, if so, how would it look like.</w:t>
       </w:r>
     </w:p>
     <w:sectPr>

</xml_diff>

<commit_message>
Finished Deliverable 2 (May need to re-check over it)
</commit_message>
<xml_diff>
--- a/Brick Blitz Documentation - Berkay Topal.docx
+++ b/Brick Blitz Documentation - Berkay Topal.docx
@@ -57,8 +57,21 @@
           <w:szCs w:val="40"/>
           <w:u w:val="single"/>
         </w:rPr>
-        <w:t>Deliverable 1</w:t>
-      </w:r>
+        <w:t xml:space="preserve">Deliverable </w:t>
+      </w:r>
+      <w:proofErr w:type="gramStart"/>
+      <w:r>
+        <w:rPr>
+          <w:b/>
+          <w:bCs/>
+          <w:color w:val="00B0F0"/>
+          <w:sz w:val="40"/>
+          <w:szCs w:val="40"/>
+          <w:u w:val="single"/>
+        </w:rPr>
+        <w:t>1</w:t>
+      </w:r>
+      <w:proofErr w:type="gramEnd"/>
     </w:p>
     <w:p>
       <w:pPr>
@@ -169,8 +182,13 @@
         <w:t xml:space="preserve">Brick breaker is </w:t>
       </w:r>
       <w:r>
-        <w:t>a game that everyone overlooks on how easy it is, but the mechanics behind it, I believe, is very complex</w:t>
-      </w:r>
+        <w:t xml:space="preserve">a game that everyone overlooks on how easy it is, but the mechanics behind it, I believe, is </w:t>
+      </w:r>
+      <w:proofErr w:type="gramStart"/>
+      <w:r>
+        <w:t>very complex</w:t>
+      </w:r>
+      <w:proofErr w:type="gramEnd"/>
       <w:r>
         <w:t>, and has a lot of room for scalability.</w:t>
       </w:r>
@@ -272,9 +290,11 @@
       <w:r>
         <w:t xml:space="preserve">It </w:t>
       </w:r>
+      <w:proofErr w:type="gramStart"/>
       <w:r>
         <w:t>is not limited</w:t>
       </w:r>
+      <w:proofErr w:type="gramEnd"/>
       <w:r>
         <w:t xml:space="preserve"> to a certain point</w:t>
       </w:r>
@@ -355,8 +375,13 @@
         </w:rPr>
         <w:t xml:space="preserve">Problem: </w:t>
       </w:r>
-      <w:r>
-        <w:t xml:space="preserve">Many arcade-style </w:t>
+      <w:proofErr w:type="gramStart"/>
+      <w:r>
+        <w:t>Many</w:t>
+      </w:r>
+      <w:proofErr w:type="gramEnd"/>
+      <w:r>
+        <w:t xml:space="preserve"> arcade-style </w:t>
       </w:r>
       <w:r>
         <w:t>games provide quick, engaging gameplay, but lack the modern implementations that improve the user experience</w:t>
@@ -464,7 +489,15 @@
         </w:numPr>
       </w:pPr>
       <w:r>
-        <w:t>Game controls are simple and easy, so users of all ages allowed to play, but mainly targeting younger generation who more commonly play games</w:t>
+        <w:t xml:space="preserve">Game controls are simple and easy, so users of all ages allowed to play, but </w:t>
+      </w:r>
+      <w:proofErr w:type="gramStart"/>
+      <w:r>
+        <w:t>mainly targeting</w:t>
+      </w:r>
+      <w:proofErr w:type="gramEnd"/>
+      <w:r>
+        <w:t xml:space="preserve"> younger generation who more commonly play games</w:t>
       </w:r>
     </w:p>
     <w:p>
@@ -547,8 +580,13 @@
         <w:t xml:space="preserve"> Ball movement, paddle control, brick-breaking</w:t>
       </w:r>
       <w:r>
-        <w:t>, etc.</w:t>
-      </w:r>
+        <w:t xml:space="preserve">, </w:t>
+      </w:r>
+      <w:proofErr w:type="gramStart"/>
+      <w:r>
+        <w:t>etc.</w:t>
+      </w:r>
+      <w:proofErr w:type="gramEnd"/>
       <w:r>
         <w:t xml:space="preserve">), </w:t>
       </w:r>
@@ -1258,7 +1296,15 @@
         </w:rPr>
       </w:pPr>
       <w:r>
-        <w:t>Currently, I have a ‘GameObject’ base class, which encapsulates common properties such as ‘x’, ‘y’ and methods such as ‘draw’, ‘move’</w:t>
+        <w:t>Currently, I have a ‘GameObject’ base class, which encapsulates common properties such as ‘x</w:t>
+      </w:r>
+      <w:proofErr w:type="gramStart"/>
+      <w:r>
+        <w:t>’,</w:t>
+      </w:r>
+      <w:proofErr w:type="gramEnd"/>
+      <w:r>
+        <w:t xml:space="preserve"> ‘y’ and methods such as ‘draw’, ‘move’</w:t>
       </w:r>
     </w:p>
     <w:p>
@@ -1283,7 +1329,15 @@
         </w:rPr>
       </w:pPr>
       <w:r>
-        <w:t>Then the child classes ‘Ball’, ‘Paddle’, ‘Brick’, ‘PowerUp’ all inherit from the parent class ‘GameObject’</w:t>
+        <w:t>Then the child classes ‘Ball</w:t>
+      </w:r>
+      <w:proofErr w:type="gramStart"/>
+      <w:r>
+        <w:t>’,</w:t>
+      </w:r>
+      <w:proofErr w:type="gramEnd"/>
+      <w:r>
+        <w:t xml:space="preserve"> ‘Paddle’, ‘Brick’, ‘PowerUp’ all inherit from the parent class ‘GameObject’</w:t>
       </w:r>
     </w:p>
     <w:p>
@@ -1349,7 +1403,15 @@
         </w:rPr>
       </w:pPr>
       <w:r>
-        <w:t>Allows objects of different classes to be treated as objects of a common superclass. Methods behave differently based on the object that calls them</w:t>
+        <w:t xml:space="preserve">Allows objects of different classes to </w:t>
+      </w:r>
+      <w:proofErr w:type="gramStart"/>
+      <w:r>
+        <w:t>be treated</w:t>
+      </w:r>
+      <w:proofErr w:type="gramEnd"/>
+      <w:r>
+        <w:t xml:space="preserve"> as objects of a common superclass. Methods behave differently based on the object that calls them</w:t>
       </w:r>
     </w:p>
     <w:p>
@@ -1401,7 +1463,15 @@
         </w:rPr>
       </w:pPr>
       <w:r>
-        <w:t>Despite different implementations, all child classes can be treated as ‘GameObject’ instances, so you can call ‘draw’ or ‘move’ on any ‘GameObject’ without knowing the specific type</w:t>
+        <w:t xml:space="preserve">Despite different implementations, all child classes can </w:t>
+      </w:r>
+      <w:proofErr w:type="gramStart"/>
+      <w:r>
+        <w:t>be treated</w:t>
+      </w:r>
+      <w:proofErr w:type="gramEnd"/>
+      <w:r>
+        <w:t xml:space="preserve"> as ‘GameObject’ instances, so you can call ‘draw’ or ‘move’ on any ‘GameObject’ without knowing the specific type</w:t>
       </w:r>
     </w:p>
     <w:p>
@@ -1719,8 +1789,21 @@
           <w:szCs w:val="40"/>
           <w:u w:val="single"/>
         </w:rPr>
-        <w:t xml:space="preserve"> 2</w:t>
-      </w:r>
+        <w:t xml:space="preserve"> </w:t>
+      </w:r>
+      <w:proofErr w:type="gramStart"/>
+      <w:r>
+        <w:rPr>
+          <w:b/>
+          <w:bCs/>
+          <w:color w:val="00B0F0"/>
+          <w:sz w:val="40"/>
+          <w:szCs w:val="40"/>
+          <w:u w:val="single"/>
+        </w:rPr>
+        <w:t>2</w:t>
+      </w:r>
+      <w:proofErr w:type="gramEnd"/>
     </w:p>
     <w:p>
       <w:pPr>
@@ -1963,6 +2046,2403 @@
           <w:noProof/>
         </w:rPr>
         <w:t>, and if I will have a final boss level, if so, how would it look like.</w:t>
+      </w:r>
+    </w:p>
+    <w:p>
+      <w:pPr>
+        <w:rPr>
+          <w:noProof/>
+        </w:rPr>
+      </w:pPr>
+    </w:p>
+    <w:p>
+      <w:pPr>
+        <w:rPr>
+          <w:noProof/>
+        </w:rPr>
+      </w:pPr>
+    </w:p>
+    <w:p>
+      <w:pPr>
+        <w:rPr>
+          <w:noProof/>
+        </w:rPr>
+      </w:pPr>
+    </w:p>
+    <w:p>
+      <w:pPr>
+        <w:rPr>
+          <w:noProof/>
+        </w:rPr>
+      </w:pPr>
+    </w:p>
+    <w:p>
+      <w:pPr>
+        <w:rPr>
+          <w:b/>
+          <w:bCs/>
+          <w:color w:val="00B050"/>
+          <w:u w:val="single"/>
+        </w:rPr>
+      </w:pPr>
+    </w:p>
+    <w:p>
+      <w:pPr>
+        <w:rPr>
+          <w:b/>
+          <w:bCs/>
+          <w:color w:val="00B050"/>
+          <w:u w:val="single"/>
+        </w:rPr>
+      </w:pPr>
+    </w:p>
+    <w:p>
+      <w:pPr>
+        <w:rPr>
+          <w:b/>
+          <w:bCs/>
+          <w:color w:val="00B050"/>
+          <w:u w:val="single"/>
+        </w:rPr>
+      </w:pPr>
+    </w:p>
+    <w:p>
+      <w:pPr>
+        <w:rPr>
+          <w:b/>
+          <w:bCs/>
+          <w:color w:val="00B050"/>
+          <w:u w:val="single"/>
+        </w:rPr>
+      </w:pPr>
+    </w:p>
+    <w:p>
+      <w:pPr>
+        <w:rPr>
+          <w:b/>
+          <w:bCs/>
+          <w:color w:val="00B050"/>
+          <w:u w:val="single"/>
+        </w:rPr>
+      </w:pPr>
+    </w:p>
+    <w:p>
+      <w:pPr>
+        <w:rPr>
+          <w:b/>
+          <w:bCs/>
+          <w:color w:val="00B050"/>
+          <w:u w:val="single"/>
+        </w:rPr>
+      </w:pPr>
+    </w:p>
+    <w:p>
+      <w:pPr>
+        <w:rPr>
+          <w:b/>
+          <w:bCs/>
+          <w:color w:val="00B050"/>
+          <w:u w:val="single"/>
+        </w:rPr>
+      </w:pPr>
+    </w:p>
+    <w:p>
+      <w:pPr>
+        <w:rPr>
+          <w:b/>
+          <w:bCs/>
+          <w:color w:val="00B050"/>
+          <w:u w:val="single"/>
+        </w:rPr>
+      </w:pPr>
+    </w:p>
+    <w:p>
+      <w:pPr>
+        <w:rPr>
+          <w:b/>
+          <w:bCs/>
+          <w:color w:val="00B050"/>
+          <w:u w:val="single"/>
+        </w:rPr>
+      </w:pPr>
+    </w:p>
+    <w:p>
+      <w:pPr>
+        <w:rPr>
+          <w:b/>
+          <w:bCs/>
+          <w:color w:val="00B050"/>
+          <w:u w:val="single"/>
+        </w:rPr>
+      </w:pPr>
+      <w:r>
+        <w:rPr>
+          <w:b/>
+          <w:bCs/>
+          <w:color w:val="00B050"/>
+          <w:u w:val="single"/>
+        </w:rPr>
+        <w:lastRenderedPageBreak/>
+        <w:t>Section</w:t>
+      </w:r>
+      <w:r>
+        <w:rPr>
+          <w:b/>
+          <w:bCs/>
+          <w:color w:val="00B050"/>
+          <w:u w:val="single"/>
+        </w:rPr>
+        <w:t xml:space="preserve"> 2: Detailed Pseudocode</w:t>
+      </w:r>
+    </w:p>
+    <w:p>
+      <w:pPr>
+        <w:rPr>
+          <w:b/>
+          <w:bCs/>
+          <w:color w:val="00B050"/>
+          <w:u w:val="single"/>
+        </w:rPr>
+      </w:pPr>
+    </w:p>
+    <w:p>
+      <w:pPr>
+        <w:rPr>
+          <w:b/>
+          <w:bCs/>
+        </w:rPr>
+      </w:pPr>
+      <w:r>
+        <w:rPr>
+          <w:b/>
+          <w:bCs/>
+          <w:color w:val="7030A0"/>
+        </w:rPr>
+        <w:t>First Pseudocode:</w:t>
+      </w:r>
+      <w:r>
+        <w:rPr>
+          <w:b/>
+          <w:bCs/>
+        </w:rPr>
+        <w:t xml:space="preserve"> </w:t>
+      </w:r>
+    </w:p>
+    <w:p>
+      <w:pPr>
+        <w:rPr>
+          <w:noProof/>
+        </w:rPr>
+      </w:pPr>
+      <w:r>
+        <w:rPr>
+          <w:noProof/>
+        </w:rPr>
+        <w:drawing>
+          <wp:inline distT="0" distB="0" distL="0" distR="0" wp14:anchorId="31BCA5C9" wp14:editId="32375B1C">
+            <wp:extent cx="3895725" cy="4500454"/>
+            <wp:effectExtent l="0" t="0" r="0" b="0"/>
+            <wp:docPr id="1122038270" name="Picture 1" descr="A black screen with white text&#10;&#10;AI-generated content may be incorrect."/>
+            <wp:cNvGraphicFramePr>
+              <a:graphicFrameLocks xmlns:a="http://schemas.openxmlformats.org/drawingml/2006/main" noChangeAspect="1"/>
+            </wp:cNvGraphicFramePr>
+            <a:graphic xmlns:a="http://schemas.openxmlformats.org/drawingml/2006/main">
+              <a:graphicData uri="http://schemas.openxmlformats.org/drawingml/2006/picture">
+                <pic:pic xmlns:pic="http://schemas.openxmlformats.org/drawingml/2006/picture">
+                  <pic:nvPicPr>
+                    <pic:cNvPr id="1122038270" name="Picture 1" descr="A black screen with white text&#10;&#10;AI-generated content may be incorrect."/>
+                    <pic:cNvPicPr/>
+                  </pic:nvPicPr>
+                  <pic:blipFill>
+                    <a:blip r:embed="rId9"/>
+                    <a:stretch>
+                      <a:fillRect/>
+                    </a:stretch>
+                  </pic:blipFill>
+                  <pic:spPr>
+                    <a:xfrm>
+                      <a:off x="0" y="0"/>
+                      <a:ext cx="3906792" cy="4513239"/>
+                    </a:xfrm>
+                    <a:prstGeom prst="rect">
+                      <a:avLst/>
+                    </a:prstGeom>
+                  </pic:spPr>
+                </pic:pic>
+              </a:graphicData>
+            </a:graphic>
+          </wp:inline>
+        </w:drawing>
+      </w:r>
+      <w:r>
+        <w:rPr>
+          <w:noProof/>
+        </w:rPr>
+        <w:t xml:space="preserve"> </w:t>
+      </w:r>
+    </w:p>
+    <w:p>
+      <w:pPr>
+        <w:rPr>
+          <w:noProof/>
+        </w:rPr>
+      </w:pPr>
+    </w:p>
+    <w:p>
+      <w:pPr>
+        <w:rPr>
+          <w:b/>
+          <w:bCs/>
+          <w:noProof/>
+        </w:rPr>
+      </w:pPr>
+      <w:r>
+        <w:rPr>
+          <w:noProof/>
+        </w:rPr>
+        <w:tab/>
+      </w:r>
+      <w:r>
+        <w:rPr>
+          <w:b/>
+          <w:bCs/>
+          <w:noProof/>
+        </w:rPr>
+        <w:t>Key Functions:</w:t>
+      </w:r>
+    </w:p>
+    <w:p>
+      <w:pPr>
+        <w:pStyle w:val="ListParagraph"/>
+        <w:numPr>
+          <w:ilvl w:val="1"/>
+          <w:numId w:val="1"/>
+        </w:numPr>
+        <w:rPr>
+          <w:b/>
+          <w:bCs/>
+          <w:noProof/>
+        </w:rPr>
+      </w:pPr>
+      <w:r>
+        <w:rPr>
+          <w:noProof/>
+        </w:rPr>
+        <w:t>Is used to check the collisions between the ball objects with paddle and brick objects, as well as checking the collision of the powerup object with the paddle object.</w:t>
+      </w:r>
+    </w:p>
+    <w:p>
+      <w:pPr>
+        <w:rPr>
+          <w:b/>
+          <w:bCs/>
+          <w:noProof/>
+        </w:rPr>
+      </w:pPr>
+    </w:p>
+    <w:p>
+      <w:pPr>
+        <w:ind w:left="720"/>
+        <w:rPr>
+          <w:b/>
+          <w:bCs/>
+          <w:noProof/>
+        </w:rPr>
+      </w:pPr>
+      <w:r>
+        <w:rPr>
+          <w:b/>
+          <w:bCs/>
+          <w:noProof/>
+        </w:rPr>
+        <w:t>Error Handling:</w:t>
+      </w:r>
+    </w:p>
+    <w:p>
+      <w:pPr>
+        <w:pStyle w:val="ListParagraph"/>
+        <w:numPr>
+          <w:ilvl w:val="1"/>
+          <w:numId w:val="1"/>
+        </w:numPr>
+        <w:rPr>
+          <w:b/>
+          <w:bCs/>
+          <w:noProof/>
+        </w:rPr>
+      </w:pPr>
+      <w:r>
+        <w:rPr>
+          <w:noProof/>
+        </w:rPr>
+        <w:t>Entire collision detection logic wrapped in ‘try’ block</w:t>
+      </w:r>
+    </w:p>
+    <w:p>
+      <w:pPr>
+        <w:pStyle w:val="ListParagraph"/>
+        <w:numPr>
+          <w:ilvl w:val="1"/>
+          <w:numId w:val="1"/>
+        </w:numPr>
+        <w:rPr>
+          <w:b/>
+          <w:bCs/>
+          <w:noProof/>
+        </w:rPr>
+      </w:pPr>
+      <w:r>
+        <w:rPr>
+          <w:noProof/>
+        </w:rPr>
+        <w:t>If any error occurs, it is caught in ‘except’ block, preventing game from crashing due to unexpected issues</w:t>
+      </w:r>
+    </w:p>
+    <w:p>
+      <w:pPr>
+        <w:pStyle w:val="ListParagraph"/>
+        <w:numPr>
+          <w:ilvl w:val="1"/>
+          <w:numId w:val="1"/>
+        </w:numPr>
+        <w:rPr>
+          <w:noProof/>
+        </w:rPr>
+      </w:pPr>
+      <w:r>
+        <w:rPr>
+          <w:noProof/>
+        </w:rPr>
+        <w:t>Where the error message is printed to console</w:t>
+      </w:r>
+    </w:p>
+    <w:p>
+      <w:pPr>
+        <w:rPr>
+          <w:noProof/>
+        </w:rPr>
+      </w:pPr>
+    </w:p>
+    <w:p>
+      <w:pPr>
+        <w:ind w:firstLine="720"/>
+        <w:rPr>
+          <w:b/>
+          <w:bCs/>
+          <w:noProof/>
+        </w:rPr>
+      </w:pPr>
+      <w:r>
+        <w:rPr>
+          <w:b/>
+          <w:bCs/>
+          <w:noProof/>
+        </w:rPr>
+        <w:t>Testing Strategies:</w:t>
+      </w:r>
+    </w:p>
+    <w:p>
+      <w:pPr>
+        <w:pStyle w:val="ListParagraph"/>
+        <w:numPr>
+          <w:ilvl w:val="0"/>
+          <w:numId w:val="1"/>
+        </w:numPr>
+        <w:ind w:left="1440"/>
+        <w:rPr>
+          <w:b/>
+          <w:bCs/>
+          <w:noProof/>
+        </w:rPr>
+      </w:pPr>
+      <w:r>
+        <w:rPr>
+          <w:noProof/>
+        </w:rPr>
+        <w:t>Write unit tests for each individual collision to test them each separately</w:t>
+      </w:r>
+    </w:p>
+    <w:p>
+      <w:pPr>
+        <w:pStyle w:val="ListParagraph"/>
+        <w:ind w:left="1440"/>
+        <w:rPr>
+          <w:b/>
+          <w:bCs/>
+          <w:noProof/>
+        </w:rPr>
+      </w:pPr>
+    </w:p>
+    <w:p>
+      <w:pPr>
+        <w:pStyle w:val="ListParagraph"/>
+        <w:numPr>
+          <w:ilvl w:val="0"/>
+          <w:numId w:val="1"/>
+        </w:numPr>
+        <w:ind w:left="1440"/>
+        <w:rPr>
+          <w:b/>
+          <w:bCs/>
+          <w:noProof/>
+        </w:rPr>
+      </w:pPr>
+      <w:r>
+        <w:rPr>
+          <w:noProof/>
+        </w:rPr>
+        <w:t>Allows to catch the bugs early before gameplay affected, and verify that the function works as expected</w:t>
+      </w:r>
+    </w:p>
+    <w:p>
+      <w:pPr>
+        <w:pStyle w:val="ListParagraph"/>
+        <w:rPr>
+          <w:b/>
+          <w:bCs/>
+          <w:noProof/>
+        </w:rPr>
+      </w:pPr>
+    </w:p>
+    <w:p>
+      <w:pPr>
+        <w:pStyle w:val="ListParagraph"/>
+        <w:ind w:left="1440"/>
+        <w:rPr>
+          <w:b/>
+          <w:bCs/>
+          <w:noProof/>
+        </w:rPr>
+      </w:pPr>
+    </w:p>
+    <w:p>
+      <w:pPr>
+        <w:pStyle w:val="ListParagraph"/>
+        <w:ind w:left="1440"/>
+        <w:rPr>
+          <w:b/>
+          <w:bCs/>
+          <w:noProof/>
+        </w:rPr>
+      </w:pPr>
+    </w:p>
+    <w:p>
+      <w:pPr>
+        <w:pStyle w:val="ListParagraph"/>
+        <w:ind w:left="1440"/>
+        <w:rPr>
+          <w:b/>
+          <w:bCs/>
+          <w:noProof/>
+        </w:rPr>
+      </w:pPr>
+    </w:p>
+    <w:p>
+      <w:pPr>
+        <w:rPr>
+          <w:b/>
+          <w:bCs/>
+          <w:color w:val="7030A0"/>
+        </w:rPr>
+      </w:pPr>
+      <w:r>
+        <w:rPr>
+          <w:b/>
+          <w:bCs/>
+          <w:color w:val="7030A0"/>
+        </w:rPr>
+        <w:t xml:space="preserve">Second </w:t>
+      </w:r>
+      <w:r>
+        <w:rPr>
+          <w:b/>
+          <w:bCs/>
+          <w:color w:val="7030A0"/>
+        </w:rPr>
+        <w:t>P</w:t>
+      </w:r>
+      <w:r>
+        <w:rPr>
+          <w:b/>
+          <w:bCs/>
+          <w:color w:val="7030A0"/>
+        </w:rPr>
+        <w:t>seudocode</w:t>
+      </w:r>
+      <w:r>
+        <w:rPr>
+          <w:b/>
+          <w:bCs/>
+          <w:color w:val="7030A0"/>
+        </w:rPr>
+        <w:t xml:space="preserve">: </w:t>
+      </w:r>
+    </w:p>
+    <w:p>
+      <w:pPr>
+        <w:rPr>
+          <w:noProof/>
+        </w:rPr>
+      </w:pPr>
+      <w:r>
+        <w:rPr>
+          <w:noProof/>
+        </w:rPr>
+        <w:drawing>
+          <wp:inline distT="0" distB="0" distL="0" distR="0" wp14:anchorId="297B2205" wp14:editId="4E539AF2">
+            <wp:extent cx="3215825" cy="4086225"/>
+            <wp:effectExtent l="0" t="0" r="3810" b="0"/>
+            <wp:docPr id="1559502439" name="Picture 1" descr="A black screen with white text&#10;&#10;AI-generated content may be incorrect."/>
+            <wp:cNvGraphicFramePr>
+              <a:graphicFrameLocks xmlns:a="http://schemas.openxmlformats.org/drawingml/2006/main" noChangeAspect="1"/>
+            </wp:cNvGraphicFramePr>
+            <a:graphic xmlns:a="http://schemas.openxmlformats.org/drawingml/2006/main">
+              <a:graphicData uri="http://schemas.openxmlformats.org/drawingml/2006/picture">
+                <pic:pic xmlns:pic="http://schemas.openxmlformats.org/drawingml/2006/picture">
+                  <pic:nvPicPr>
+                    <pic:cNvPr id="1559502439" name="Picture 1" descr="A black screen with white text&#10;&#10;AI-generated content may be incorrect."/>
+                    <pic:cNvPicPr/>
+                  </pic:nvPicPr>
+                  <pic:blipFill>
+                    <a:blip r:embed="rId10"/>
+                    <a:stretch>
+                      <a:fillRect/>
+                    </a:stretch>
+                  </pic:blipFill>
+                  <pic:spPr>
+                    <a:xfrm>
+                      <a:off x="0" y="0"/>
+                      <a:ext cx="3218761" cy="4089956"/>
+                    </a:xfrm>
+                    <a:prstGeom prst="rect">
+                      <a:avLst/>
+                    </a:prstGeom>
+                  </pic:spPr>
+                </pic:pic>
+              </a:graphicData>
+            </a:graphic>
+          </wp:inline>
+        </w:drawing>
+      </w:r>
+    </w:p>
+    <w:p>
+      <w:pPr>
+        <w:rPr>
+          <w:noProof/>
+        </w:rPr>
+      </w:pPr>
+    </w:p>
+    <w:p>
+      <w:pPr>
+        <w:rPr>
+          <w:b/>
+          <w:bCs/>
+          <w:noProof/>
+        </w:rPr>
+      </w:pPr>
+      <w:r>
+        <w:rPr>
+          <w:b/>
+          <w:bCs/>
+          <w:noProof/>
+        </w:rPr>
+        <w:tab/>
+        <w:t>Key Functions:</w:t>
+      </w:r>
+    </w:p>
+    <w:p>
+      <w:pPr>
+        <w:pStyle w:val="ListParagraph"/>
+        <w:numPr>
+          <w:ilvl w:val="1"/>
+          <w:numId w:val="1"/>
+        </w:numPr>
+        <w:rPr>
+          <w:b/>
+          <w:bCs/>
+          <w:noProof/>
+        </w:rPr>
+      </w:pPr>
+      <w:r>
+        <w:rPr>
+          <w:noProof/>
+        </w:rPr>
+        <w:t>Define the movement of the ball, and how the ball moves when colliding with roof or walls</w:t>
+      </w:r>
+    </w:p>
+    <w:p>
+      <w:pPr>
+        <w:rPr>
+          <w:b/>
+          <w:bCs/>
+          <w:noProof/>
+        </w:rPr>
+      </w:pPr>
+    </w:p>
+    <w:p>
+      <w:pPr>
+        <w:ind w:left="720"/>
+        <w:rPr>
+          <w:b/>
+          <w:bCs/>
+          <w:noProof/>
+        </w:rPr>
+      </w:pPr>
+      <w:r>
+        <w:rPr>
+          <w:b/>
+          <w:bCs/>
+          <w:noProof/>
+        </w:rPr>
+        <w:t>Error Handling:</w:t>
+      </w:r>
+    </w:p>
+    <w:p>
+      <w:pPr>
+        <w:pStyle w:val="ListParagraph"/>
+        <w:numPr>
+          <w:ilvl w:val="1"/>
+          <w:numId w:val="1"/>
+        </w:numPr>
+        <w:rPr>
+          <w:b/>
+          <w:bCs/>
+          <w:noProof/>
+        </w:rPr>
+      </w:pPr>
+      <w:r>
+        <w:rPr>
+          <w:noProof/>
+        </w:rPr>
+        <w:t>Entire collision detection logic wrapped in ‘try’ block</w:t>
+      </w:r>
+    </w:p>
+    <w:p>
+      <w:pPr>
+        <w:pStyle w:val="ListParagraph"/>
+        <w:numPr>
+          <w:ilvl w:val="1"/>
+          <w:numId w:val="1"/>
+        </w:numPr>
+        <w:rPr>
+          <w:b/>
+          <w:bCs/>
+          <w:noProof/>
+        </w:rPr>
+      </w:pPr>
+      <w:r>
+        <w:rPr>
+          <w:noProof/>
+        </w:rPr>
+        <w:t>If any error occurs, it is caught in ‘except’ block, preventing game from crashing due to unexpected issues</w:t>
+      </w:r>
+    </w:p>
+    <w:p>
+      <w:pPr>
+        <w:pStyle w:val="ListParagraph"/>
+        <w:numPr>
+          <w:ilvl w:val="1"/>
+          <w:numId w:val="1"/>
+        </w:numPr>
+        <w:rPr>
+          <w:noProof/>
+        </w:rPr>
+      </w:pPr>
+      <w:r>
+        <w:rPr>
+          <w:noProof/>
+        </w:rPr>
+        <w:t>Two errors that could occur are AttributeError and TypeError, so caught separately, any other error caught as an exception, where error message printed to console</w:t>
+      </w:r>
+    </w:p>
+    <w:p>
+      <w:pPr>
+        <w:rPr>
+          <w:noProof/>
+        </w:rPr>
+      </w:pPr>
+    </w:p>
+    <w:p>
+      <w:pPr>
+        <w:ind w:left="720"/>
+        <w:rPr>
+          <w:b/>
+          <w:bCs/>
+          <w:noProof/>
+        </w:rPr>
+      </w:pPr>
+      <w:r>
+        <w:rPr>
+          <w:b/>
+          <w:bCs/>
+          <w:noProof/>
+        </w:rPr>
+        <w:t>Testing Strategies:</w:t>
+      </w:r>
+    </w:p>
+    <w:p>
+      <w:pPr>
+        <w:pStyle w:val="ListParagraph"/>
+        <w:numPr>
+          <w:ilvl w:val="1"/>
+          <w:numId w:val="1"/>
+        </w:numPr>
+        <w:rPr>
+          <w:b/>
+          <w:bCs/>
+          <w:noProof/>
+        </w:rPr>
+      </w:pPr>
+      <w:r>
+        <w:rPr>
+          <w:noProof/>
+        </w:rPr>
+        <w:t>Write unit tests for each individual collision, testing them separately</w:t>
+      </w:r>
+    </w:p>
+    <w:p>
+      <w:pPr>
+        <w:pStyle w:val="ListParagraph"/>
+        <w:numPr>
+          <w:ilvl w:val="1"/>
+          <w:numId w:val="1"/>
+        </w:numPr>
+        <w:rPr>
+          <w:b/>
+          <w:bCs/>
+          <w:noProof/>
+        </w:rPr>
+      </w:pPr>
+      <w:r>
+        <w:rPr>
+          <w:noProof/>
+        </w:rPr>
+        <w:t>Unit testing allows to catch the bugs early in development process before gameplay is affected, verifying function works as expected</w:t>
+      </w:r>
+    </w:p>
+    <w:p>
+      <w:pPr>
+        <w:rPr>
+          <w:noProof/>
+        </w:rPr>
+      </w:pPr>
+    </w:p>
+    <w:p>
+      <w:pPr>
+        <w:ind w:left="720"/>
+        <w:rPr>
+          <w:b/>
+          <w:bCs/>
+          <w:noProof/>
+        </w:rPr>
+      </w:pPr>
+    </w:p>
+    <w:p>
+      <w:pPr>
+        <w:ind w:left="720"/>
+        <w:rPr>
+          <w:b/>
+          <w:bCs/>
+          <w:noProof/>
+        </w:rPr>
+      </w:pPr>
+    </w:p>
+    <w:p>
+      <w:pPr>
+        <w:ind w:left="720"/>
+        <w:rPr>
+          <w:b/>
+          <w:bCs/>
+          <w:noProof/>
+        </w:rPr>
+      </w:pPr>
+    </w:p>
+    <w:p>
+      <w:pPr>
+        <w:ind w:left="720"/>
+        <w:rPr>
+          <w:b/>
+          <w:bCs/>
+          <w:noProof/>
+        </w:rPr>
+      </w:pPr>
+    </w:p>
+    <w:p>
+      <w:pPr>
+        <w:ind w:left="720"/>
+        <w:rPr>
+          <w:b/>
+          <w:bCs/>
+          <w:noProof/>
+        </w:rPr>
+      </w:pPr>
+      <w:r>
+        <w:rPr>
+          <w:b/>
+          <w:bCs/>
+          <w:noProof/>
+        </w:rPr>
+        <w:lastRenderedPageBreak/>
+        <w:t>OOP Principles Used:</w:t>
+      </w:r>
+    </w:p>
+    <w:p>
+      <w:pPr>
+        <w:ind w:left="720"/>
+        <w:rPr>
+          <w:b/>
+          <w:bCs/>
+          <w:noProof/>
+          <w:color w:val="00B050"/>
+        </w:rPr>
+      </w:pPr>
+      <w:r>
+        <w:rPr>
+          <w:b/>
+          <w:bCs/>
+          <w:noProof/>
+          <w:color w:val="00B050"/>
+        </w:rPr>
+        <w:tab/>
+        <w:t>Encapsulation:</w:t>
+      </w:r>
+    </w:p>
+    <w:p>
+      <w:pPr>
+        <w:pStyle w:val="ListParagraph"/>
+        <w:numPr>
+          <w:ilvl w:val="2"/>
+          <w:numId w:val="1"/>
+        </w:numPr>
+        <w:rPr>
+          <w:b/>
+          <w:bCs/>
+          <w:noProof/>
+        </w:rPr>
+      </w:pPr>
+      <w:r>
+        <w:rPr>
+          <w:noProof/>
+        </w:rPr>
+        <w:t>The ‘move’ methodf is part of the ‘Ball’ class, encapsulating behaviour of ball</w:t>
+      </w:r>
+    </w:p>
+    <w:p>
+      <w:pPr>
+        <w:pStyle w:val="ListParagraph"/>
+        <w:numPr>
+          <w:ilvl w:val="2"/>
+          <w:numId w:val="1"/>
+        </w:numPr>
+        <w:rPr>
+          <w:b/>
+          <w:bCs/>
+          <w:noProof/>
+        </w:rPr>
+      </w:pPr>
+      <w:r>
+        <w:rPr>
+          <w:noProof/>
+        </w:rPr>
+        <w:t>Ball’s position (rect.x, rect.y) and the speed variables (speed_x, speed_y), are attributes of Ball class</w:t>
+      </w:r>
+    </w:p>
+    <w:p>
+      <w:pPr>
+        <w:pStyle w:val="ListParagraph"/>
+        <w:numPr>
+          <w:ilvl w:val="2"/>
+          <w:numId w:val="1"/>
+        </w:numPr>
+        <w:rPr>
+          <w:b/>
+          <w:bCs/>
+          <w:noProof/>
+        </w:rPr>
+      </w:pPr>
+      <w:r>
+        <w:rPr>
+          <w:noProof/>
+        </w:rPr>
+        <w:t>‘move’ method operates on attributes, updating ball’s position and handling collisions</w:t>
+      </w:r>
+    </w:p>
+    <w:p>
+      <w:pPr>
+        <w:ind w:left="1440"/>
+        <w:rPr>
+          <w:b/>
+          <w:bCs/>
+          <w:noProof/>
+          <w:color w:val="FF0000"/>
+        </w:rPr>
+      </w:pPr>
+      <w:r>
+        <w:rPr>
+          <w:b/>
+          <w:bCs/>
+          <w:noProof/>
+          <w:color w:val="FF0000"/>
+        </w:rPr>
+        <w:t>Inheritance:</w:t>
+      </w:r>
+    </w:p>
+    <w:p>
+      <w:pPr>
+        <w:pStyle w:val="ListParagraph"/>
+        <w:numPr>
+          <w:ilvl w:val="2"/>
+          <w:numId w:val="1"/>
+        </w:numPr>
+        <w:rPr>
+          <w:noProof/>
+        </w:rPr>
+      </w:pPr>
+      <w:r>
+        <w:rPr>
+          <w:noProof/>
+        </w:rPr>
+        <w:t>The class this method originates from inherits from ‘GameObject’ class, where the ‘rect’ object used in method is inherited from ‘GameObject’ class</w:t>
+      </w:r>
+    </w:p>
+    <w:p>
+      <w:pPr>
+        <w:pStyle w:val="ListParagraph"/>
+        <w:rPr>
+          <w:noProof/>
+        </w:rPr>
+      </w:pPr>
+    </w:p>
+    <w:p>
+      <w:pPr>
+        <w:pStyle w:val="ListParagraph"/>
+        <w:numPr>
+          <w:ilvl w:val="2"/>
+          <w:numId w:val="1"/>
+        </w:numPr>
+        <w:rPr>
+          <w:noProof/>
+        </w:rPr>
+      </w:pPr>
+      <w:r>
+        <w:rPr>
+          <w:noProof/>
+        </w:rPr>
+        <w:t>‘move’ method extends behaviour of ‘GameObject’ class by adding movement and collision logic</w:t>
+      </w:r>
+    </w:p>
+    <w:p>
+      <w:pPr>
+        <w:pStyle w:val="ListParagraph"/>
+        <w:rPr>
+          <w:noProof/>
+        </w:rPr>
+      </w:pPr>
+    </w:p>
+    <w:p>
+      <w:pPr>
+        <w:rPr>
+          <w:noProof/>
+        </w:rPr>
+      </w:pPr>
+    </w:p>
+    <w:p>
+      <w:pPr>
+        <w:ind w:left="1440"/>
+        <w:rPr>
+          <w:b/>
+          <w:bCs/>
+          <w:noProof/>
+          <w:color w:val="E59EDC" w:themeColor="accent5" w:themeTint="66"/>
+        </w:rPr>
+      </w:pPr>
+      <w:r>
+        <w:rPr>
+          <w:b/>
+          <w:bCs/>
+          <w:noProof/>
+          <w:color w:val="E59EDC" w:themeColor="accent5" w:themeTint="66"/>
+        </w:rPr>
+        <w:t>Abstraction:</w:t>
+      </w:r>
+    </w:p>
+    <w:p>
+      <w:pPr>
+        <w:pStyle w:val="ListParagraph"/>
+        <w:numPr>
+          <w:ilvl w:val="2"/>
+          <w:numId w:val="1"/>
+        </w:numPr>
+        <w:rPr>
+          <w:noProof/>
+        </w:rPr>
+      </w:pPr>
+      <w:r>
+        <w:rPr>
+          <w:noProof/>
+        </w:rPr>
+        <w:t>‘move’ method abstracts logic for moving the ball and handling wall collisions</w:t>
+      </w:r>
+    </w:p>
+    <w:p>
+      <w:pPr>
+        <w:pStyle w:val="ListParagraph"/>
+        <w:rPr>
+          <w:noProof/>
+        </w:rPr>
+      </w:pPr>
+    </w:p>
+    <w:p>
+      <w:pPr>
+        <w:pStyle w:val="ListParagraph"/>
+        <w:numPr>
+          <w:ilvl w:val="2"/>
+          <w:numId w:val="1"/>
+        </w:numPr>
+        <w:rPr>
+          <w:noProof/>
+        </w:rPr>
+      </w:pPr>
+      <w:r>
+        <w:rPr>
+          <w:noProof/>
+        </w:rPr>
+        <w:t>When ‘ball.move()’ called, don’t need to know how ball position updated or how collisions are handled, just that the ball moves and bounces off walls</w:t>
+      </w:r>
+    </w:p>
+    <w:p>
+      <w:pPr>
+        <w:pStyle w:val="ListParagraph"/>
+        <w:rPr>
+          <w:noProof/>
+        </w:rPr>
+      </w:pPr>
+    </w:p>
+    <w:p>
+      <w:pPr>
+        <w:rPr>
+          <w:noProof/>
+        </w:rPr>
+      </w:pPr>
+    </w:p>
+    <w:p>
+      <w:pPr>
+        <w:ind w:left="1440"/>
+        <w:rPr>
+          <w:b/>
+          <w:bCs/>
+          <w:noProof/>
+          <w:color w:val="156082" w:themeColor="accent1"/>
+        </w:rPr>
+      </w:pPr>
+      <w:r>
+        <w:rPr>
+          <w:b/>
+          <w:bCs/>
+          <w:noProof/>
+          <w:color w:val="156082" w:themeColor="accent1"/>
+        </w:rPr>
+        <w:t>Polymorphism:</w:t>
+      </w:r>
+    </w:p>
+    <w:p>
+      <w:pPr>
+        <w:pStyle w:val="ListParagraph"/>
+        <w:numPr>
+          <w:ilvl w:val="2"/>
+          <w:numId w:val="1"/>
+        </w:numPr>
+        <w:rPr>
+          <w:b/>
+          <w:bCs/>
+          <w:noProof/>
+        </w:rPr>
+      </w:pPr>
+      <w:r>
+        <w:rPr>
+          <w:noProof/>
+        </w:rPr>
+        <w:t xml:space="preserve">Other game objects (Eg. PowerUp, Enemy) have ‘move’ methods, where </w:t>
+      </w:r>
+      <w:r>
+        <w:rPr>
+          <w:noProof/>
+        </w:rPr>
+        <w:t>they all have different implementations of method</w:t>
+      </w:r>
+    </w:p>
+    <w:p>
+      <w:pPr>
+        <w:pStyle w:val="ListParagraph"/>
+        <w:rPr>
+          <w:b/>
+          <w:bCs/>
+          <w:noProof/>
+        </w:rPr>
+      </w:pPr>
+    </w:p>
+    <w:p>
+      <w:pPr>
+        <w:pStyle w:val="ListParagraph"/>
+        <w:numPr>
+          <w:ilvl w:val="2"/>
+          <w:numId w:val="1"/>
+        </w:numPr>
+        <w:rPr>
+          <w:b/>
+          <w:bCs/>
+          <w:noProof/>
+        </w:rPr>
+      </w:pPr>
+      <w:r>
+        <w:rPr>
+          <w:noProof/>
+        </w:rPr>
+        <w:t>I put each object into list, and call the ‘move’ method on each one without knowing their specific implementations</w:t>
+      </w:r>
+    </w:p>
+    <w:p>
+      <w:pPr>
+        <w:rPr>
+          <w:noProof/>
+        </w:rPr>
+      </w:pPr>
+    </w:p>
+    <w:p>
+      <w:pPr>
+        <w:rPr>
+          <w:noProof/>
+        </w:rPr>
+      </w:pPr>
+    </w:p>
+    <w:p>
+      <w:pPr>
+        <w:rPr>
+          <w:noProof/>
+        </w:rPr>
+      </w:pPr>
+    </w:p>
+    <w:p>
+      <w:pPr>
+        <w:rPr>
+          <w:noProof/>
+        </w:rPr>
+      </w:pPr>
+    </w:p>
+    <w:p>
+      <w:pPr>
+        <w:rPr>
+          <w:noProof/>
+        </w:rPr>
+      </w:pPr>
+    </w:p>
+    <w:p>
+      <w:pPr>
+        <w:rPr>
+          <w:noProof/>
+        </w:rPr>
+      </w:pPr>
+    </w:p>
+    <w:p>
+      <w:pPr>
+        <w:rPr>
+          <w:noProof/>
+        </w:rPr>
+      </w:pPr>
+    </w:p>
+    <w:p>
+      <w:pPr>
+        <w:rPr>
+          <w:noProof/>
+        </w:rPr>
+      </w:pPr>
+    </w:p>
+    <w:p>
+      <w:pPr>
+        <w:rPr>
+          <w:noProof/>
+        </w:rPr>
+      </w:pPr>
+    </w:p>
+    <w:p>
+      <w:pPr>
+        <w:rPr>
+          <w:noProof/>
+        </w:rPr>
+      </w:pPr>
+    </w:p>
+    <w:p>
+      <w:pPr>
+        <w:rPr>
+          <w:noProof/>
+        </w:rPr>
+      </w:pPr>
+    </w:p>
+    <w:p>
+      <w:pPr>
+        <w:rPr>
+          <w:noProof/>
+        </w:rPr>
+      </w:pPr>
+    </w:p>
+    <w:p>
+      <w:pPr>
+        <w:rPr>
+          <w:noProof/>
+        </w:rPr>
+      </w:pPr>
+    </w:p>
+    <w:p>
+      <w:pPr>
+        <w:rPr>
+          <w:noProof/>
+        </w:rPr>
+      </w:pPr>
+    </w:p>
+    <w:p>
+      <w:pPr>
+        <w:rPr>
+          <w:noProof/>
+        </w:rPr>
+      </w:pPr>
+    </w:p>
+    <w:p>
+      <w:pPr>
+        <w:rPr>
+          <w:b/>
+          <w:bCs/>
+          <w:color w:val="00B050"/>
+          <w:u w:val="single"/>
+        </w:rPr>
+      </w:pPr>
+      <w:r>
+        <w:rPr>
+          <w:b/>
+          <w:bCs/>
+          <w:color w:val="00B050"/>
+          <w:u w:val="single"/>
+        </w:rPr>
+        <w:t>Section</w:t>
+      </w:r>
+      <w:r>
+        <w:rPr>
+          <w:b/>
+          <w:bCs/>
+          <w:color w:val="00B050"/>
+          <w:u w:val="single"/>
+        </w:rPr>
+        <w:t xml:space="preserve"> 3: Flow Chart </w:t>
+      </w:r>
+      <w:proofErr w:type="gramStart"/>
+      <w:r>
+        <w:rPr>
+          <w:b/>
+          <w:bCs/>
+          <w:color w:val="00B050"/>
+          <w:u w:val="single"/>
+        </w:rPr>
+        <w:t>For</w:t>
+      </w:r>
+      <w:proofErr w:type="gramEnd"/>
+      <w:r>
+        <w:rPr>
+          <w:b/>
+          <w:bCs/>
+          <w:color w:val="00B050"/>
+          <w:u w:val="single"/>
+        </w:rPr>
+        <w:t xml:space="preserve"> An Algorithm</w:t>
+      </w:r>
+    </w:p>
+    <w:p>
+      <w:pPr>
+        <w:pStyle w:val="ListParagraph"/>
+        <w:numPr>
+          <w:ilvl w:val="0"/>
+          <w:numId w:val="1"/>
+        </w:numPr>
+        <w:rPr>
+          <w:noProof/>
+        </w:rPr>
+      </w:pPr>
+      <w:r>
+        <w:rPr>
+          <w:noProof/>
+        </w:rPr>
+        <w:t xml:space="preserve">Will be making flowchart for </w:t>
+      </w:r>
+      <w:r>
+        <w:rPr>
+          <w:noProof/>
+        </w:rPr>
+        <w:t>a sub-algorithm, specifically the one that deals with ball collision with bricks</w:t>
+      </w:r>
+    </w:p>
+    <w:p>
+      <w:pPr>
+        <w:pStyle w:val="ListParagraph"/>
+        <w:rPr>
+          <w:noProof/>
+        </w:rPr>
+      </w:pPr>
+    </w:p>
+    <w:p>
+      <w:pPr>
+        <w:pStyle w:val="ListParagraph"/>
+        <w:rPr>
+          <w:noProof/>
+        </w:rPr>
+      </w:pPr>
+      <w:r>
+        <w:rPr>
+          <w:noProof/>
+        </w:rPr>
+        <w:drawing>
+          <wp:inline distT="0" distB="0" distL="0" distR="0" wp14:anchorId="4555CBDD" wp14:editId="6F4657C3">
+            <wp:extent cx="6028205" cy="4114800"/>
+            <wp:effectExtent l="0" t="0" r="0" b="0"/>
+            <wp:docPr id="723947092" name="Picture 1" descr="A diagram of a flowchart&#10;&#10;AI-generated content may be incorrect."/>
+            <wp:cNvGraphicFramePr>
+              <a:graphicFrameLocks xmlns:a="http://schemas.openxmlformats.org/drawingml/2006/main" noChangeAspect="1"/>
+            </wp:cNvGraphicFramePr>
+            <a:graphic xmlns:a="http://schemas.openxmlformats.org/drawingml/2006/main">
+              <a:graphicData uri="http://schemas.openxmlformats.org/drawingml/2006/picture">
+                <pic:pic xmlns:pic="http://schemas.openxmlformats.org/drawingml/2006/picture">
+                  <pic:nvPicPr>
+                    <pic:cNvPr id="723947092" name="Picture 1" descr="A diagram of a flowchart&#10;&#10;AI-generated content may be incorrect."/>
+                    <pic:cNvPicPr/>
+                  </pic:nvPicPr>
+                  <pic:blipFill>
+                    <a:blip r:embed="rId11"/>
+                    <a:stretch>
+                      <a:fillRect/>
+                    </a:stretch>
+                  </pic:blipFill>
+                  <pic:spPr>
+                    <a:xfrm>
+                      <a:off x="0" y="0"/>
+                      <a:ext cx="6031487" cy="4117040"/>
+                    </a:xfrm>
+                    <a:prstGeom prst="rect">
+                      <a:avLst/>
+                    </a:prstGeom>
+                  </pic:spPr>
+                </pic:pic>
+              </a:graphicData>
+            </a:graphic>
+          </wp:inline>
+        </w:drawing>
+      </w:r>
+    </w:p>
+    <w:p>
+      <w:pPr>
+        <w:pStyle w:val="ListParagraph"/>
+        <w:rPr>
+          <w:noProof/>
+        </w:rPr>
+      </w:pPr>
+    </w:p>
+    <w:p>
+      <w:pPr>
+        <w:rPr>
+          <w:noProof/>
+        </w:rPr>
+      </w:pPr>
+    </w:p>
+    <w:p>
+      <w:pPr>
+        <w:rPr>
+          <w:noProof/>
+        </w:rPr>
+      </w:pPr>
+    </w:p>
+    <w:p>
+      <w:pPr>
+        <w:rPr>
+          <w:b/>
+          <w:bCs/>
+          <w:color w:val="00B050"/>
+          <w:u w:val="single"/>
+        </w:rPr>
+      </w:pPr>
+    </w:p>
+    <w:p>
+      <w:pPr>
+        <w:rPr>
+          <w:b/>
+          <w:bCs/>
+          <w:color w:val="00B050"/>
+          <w:u w:val="single"/>
+        </w:rPr>
+      </w:pPr>
+    </w:p>
+    <w:p>
+      <w:pPr>
+        <w:rPr>
+          <w:b/>
+          <w:bCs/>
+          <w:color w:val="00B050"/>
+          <w:u w:val="single"/>
+        </w:rPr>
+      </w:pPr>
+    </w:p>
+    <w:p>
+      <w:pPr>
+        <w:rPr>
+          <w:b/>
+          <w:bCs/>
+          <w:color w:val="00B050"/>
+          <w:u w:val="single"/>
+        </w:rPr>
+      </w:pPr>
+    </w:p>
+    <w:p>
+      <w:pPr>
+        <w:rPr>
+          <w:b/>
+          <w:bCs/>
+          <w:color w:val="00B050"/>
+          <w:u w:val="single"/>
+        </w:rPr>
+      </w:pPr>
+    </w:p>
+    <w:p>
+      <w:pPr>
+        <w:rPr>
+          <w:b/>
+          <w:bCs/>
+          <w:color w:val="00B050"/>
+          <w:u w:val="single"/>
+        </w:rPr>
+      </w:pPr>
+    </w:p>
+    <w:p>
+      <w:pPr>
+        <w:rPr>
+          <w:b/>
+          <w:bCs/>
+          <w:color w:val="00B050"/>
+          <w:u w:val="single"/>
+        </w:rPr>
+      </w:pPr>
+    </w:p>
+    <w:p>
+      <w:pPr>
+        <w:rPr>
+          <w:b/>
+          <w:bCs/>
+          <w:color w:val="00B050"/>
+          <w:u w:val="single"/>
+        </w:rPr>
+      </w:pPr>
+    </w:p>
+    <w:p>
+      <w:pPr>
+        <w:rPr>
+          <w:b/>
+          <w:bCs/>
+          <w:color w:val="00B050"/>
+          <w:u w:val="single"/>
+        </w:rPr>
+      </w:pPr>
+    </w:p>
+    <w:p>
+      <w:pPr>
+        <w:rPr>
+          <w:b/>
+          <w:bCs/>
+          <w:color w:val="00B050"/>
+          <w:u w:val="single"/>
+        </w:rPr>
+      </w:pPr>
+    </w:p>
+    <w:p>
+      <w:pPr>
+        <w:rPr>
+          <w:b/>
+          <w:bCs/>
+          <w:color w:val="00B050"/>
+          <w:u w:val="single"/>
+        </w:rPr>
+      </w:pPr>
+    </w:p>
+    <w:p>
+      <w:pPr>
+        <w:rPr>
+          <w:b/>
+          <w:bCs/>
+          <w:color w:val="00B050"/>
+          <w:u w:val="single"/>
+        </w:rPr>
+      </w:pPr>
+    </w:p>
+    <w:p>
+      <w:pPr>
+        <w:rPr>
+          <w:b/>
+          <w:bCs/>
+          <w:color w:val="00B050"/>
+          <w:u w:val="single"/>
+        </w:rPr>
+      </w:pPr>
+    </w:p>
+    <w:p>
+      <w:pPr>
+        <w:rPr>
+          <w:b/>
+          <w:bCs/>
+          <w:color w:val="00B050"/>
+          <w:u w:val="single"/>
+        </w:rPr>
+      </w:pPr>
+    </w:p>
+    <w:p>
+      <w:pPr>
+        <w:rPr>
+          <w:noProof/>
+        </w:rPr>
+      </w:pPr>
+      <w:r>
+        <w:rPr>
+          <w:b/>
+          <w:bCs/>
+          <w:color w:val="00B050"/>
+          <w:u w:val="single"/>
+        </w:rPr>
+        <w:t>Section</w:t>
+      </w:r>
+      <w:r>
+        <w:rPr>
+          <w:b/>
+          <w:bCs/>
+          <w:color w:val="00B050"/>
+          <w:u w:val="single"/>
+        </w:rPr>
+        <w:t xml:space="preserve"> 4: Refined Class Diagram</w:t>
+      </w:r>
+    </w:p>
+    <w:p>
+      <w:pPr>
+        <w:rPr>
+          <w:noProof/>
+        </w:rPr>
+      </w:pPr>
+      <w:r>
+        <w:rPr>
+          <w:noProof/>
+        </w:rPr>
+        <w:drawing>
+          <wp:inline distT="0" distB="0" distL="0" distR="0" wp14:anchorId="48F260B4" wp14:editId="7273C16B">
+            <wp:extent cx="4038600" cy="5347464"/>
+            <wp:effectExtent l="0" t="0" r="0" b="5715"/>
+            <wp:docPr id="1366139178" name="Picture 1"/>
+            <wp:cNvGraphicFramePr>
+              <a:graphicFrameLocks xmlns:a="http://schemas.openxmlformats.org/drawingml/2006/main" noChangeAspect="1"/>
+            </wp:cNvGraphicFramePr>
+            <a:graphic xmlns:a="http://schemas.openxmlformats.org/drawingml/2006/main">
+              <a:graphicData uri="http://schemas.openxmlformats.org/drawingml/2006/picture">
+                <pic:pic xmlns:pic="http://schemas.openxmlformats.org/drawingml/2006/picture">
+                  <pic:nvPicPr>
+                    <pic:cNvPr id="1366139178" name=""/>
+                    <pic:cNvPicPr/>
+                  </pic:nvPicPr>
+                  <pic:blipFill rotWithShape="1">
+                    <a:blip r:embed="rId12"/>
+                    <a:srcRect l="6119" t="2306" r="4363"/>
+                    <a:stretch/>
+                  </pic:blipFill>
+                  <pic:spPr bwMode="auto">
+                    <a:xfrm>
+                      <a:off x="0" y="0"/>
+                      <a:ext cx="4046943" cy="5358511"/>
+                    </a:xfrm>
+                    <a:prstGeom prst="rect">
+                      <a:avLst/>
+                    </a:prstGeom>
+                    <a:ln>
+                      <a:noFill/>
+                    </a:ln>
+                    <a:extLst>
+                      <a:ext uri="{53640926-AAD7-44D8-BBD7-CCE9431645EC}">
+                        <a14:shadowObscured xmlns:a14="http://schemas.microsoft.com/office/drawing/2010/main"/>
+                      </a:ext>
+                    </a:extLst>
+                  </pic:spPr>
+                </pic:pic>
+              </a:graphicData>
+            </a:graphic>
+          </wp:inline>
+        </w:drawing>
+      </w:r>
+    </w:p>
+    <w:p>
+      <w:pPr>
+        <w:rPr>
+          <w:noProof/>
+        </w:rPr>
+      </w:pPr>
+    </w:p>
+    <w:p>
+      <w:pPr>
+        <w:rPr>
+          <w:noProof/>
+        </w:rPr>
+      </w:pPr>
+    </w:p>
+    <w:p>
+      <w:pPr>
+        <w:rPr>
+          <w:noProof/>
+        </w:rPr>
+      </w:pPr>
+    </w:p>
+    <w:p>
+      <w:pPr>
+        <w:rPr>
+          <w:noProof/>
+        </w:rPr>
+      </w:pPr>
+    </w:p>
+    <w:p>
+      <w:pPr>
+        <w:rPr>
+          <w:noProof/>
+        </w:rPr>
+      </w:pPr>
+    </w:p>
+    <w:p>
+      <w:pPr>
+        <w:rPr>
+          <w:noProof/>
+        </w:rPr>
+      </w:pPr>
+    </w:p>
+    <w:p>
+      <w:pPr>
+        <w:rPr>
+          <w:noProof/>
+        </w:rPr>
+      </w:pPr>
+    </w:p>
+    <w:p>
+      <w:pPr>
+        <w:rPr>
+          <w:noProof/>
+        </w:rPr>
+      </w:pPr>
+    </w:p>
+    <w:p>
+      <w:pPr>
+        <w:rPr>
+          <w:noProof/>
+        </w:rPr>
+      </w:pPr>
+    </w:p>
+    <w:p>
+      <w:pPr>
+        <w:rPr>
+          <w:noProof/>
+        </w:rPr>
+      </w:pPr>
+    </w:p>
+    <w:p>
+      <w:pPr>
+        <w:rPr>
+          <w:noProof/>
+        </w:rPr>
+      </w:pPr>
+    </w:p>
+    <w:p>
+      <w:pPr>
+        <w:rPr>
+          <w:noProof/>
+        </w:rPr>
+      </w:pPr>
+    </w:p>
+    <w:p>
+      <w:pPr>
+        <w:rPr>
+          <w:noProof/>
+        </w:rPr>
+      </w:pPr>
+    </w:p>
+    <w:p>
+      <w:pPr>
+        <w:rPr>
+          <w:noProof/>
+        </w:rPr>
+      </w:pPr>
+    </w:p>
+    <w:p>
+      <w:pPr>
+        <w:rPr>
+          <w:b/>
+          <w:bCs/>
+          <w:color w:val="00B050"/>
+          <w:u w:val="single"/>
+        </w:rPr>
+      </w:pPr>
+      <w:r>
+        <w:rPr>
+          <w:b/>
+          <w:bCs/>
+          <w:color w:val="00B050"/>
+          <w:u w:val="single"/>
+        </w:rPr>
+        <w:t>Sectio</w:t>
+      </w:r>
+      <w:r>
+        <w:rPr>
+          <w:b/>
+          <w:bCs/>
+          <w:color w:val="00B050"/>
+          <w:u w:val="single"/>
+        </w:rPr>
+        <w:t>n 5: System Architecture and Module Interactions</w:t>
+      </w:r>
+    </w:p>
+    <w:p>
+      <w:pPr>
+        <w:pStyle w:val="ListParagraph"/>
+        <w:numPr>
+          <w:ilvl w:val="0"/>
+          <w:numId w:val="1"/>
+        </w:numPr>
+        <w:rPr>
+          <w:noProof/>
+        </w:rPr>
+      </w:pPr>
+      <w:r>
+        <w:rPr>
+          <w:noProof/>
+        </w:rPr>
+        <w:t>System architecture is the folder structure of my game</w:t>
+      </w:r>
+    </w:p>
+    <w:p>
+      <w:pPr>
+        <w:pStyle w:val="ListParagraph"/>
+        <w:rPr>
+          <w:noProof/>
+        </w:rPr>
+      </w:pPr>
+    </w:p>
+    <w:p>
+      <w:pPr>
+        <w:pStyle w:val="ListParagraph"/>
+        <w:rPr>
+          <w:noProof/>
+        </w:rPr>
+      </w:pPr>
+      <w:r>
+        <w:rPr>
+          <w:noProof/>
+        </w:rPr>
+        <w:t>brick_blitz</w:t>
+      </w:r>
+      <w:r>
+        <w:rPr>
+          <w:noProof/>
+        </w:rPr>
+        <w:t>/</w:t>
+      </w:r>
+    </w:p>
+    <w:p>
+      <w:pPr>
+        <w:pStyle w:val="ListParagraph"/>
+        <w:rPr>
+          <w:noProof/>
+        </w:rPr>
+      </w:pPr>
+      <w:r>
+        <w:rPr>
+          <w:noProof/>
+        </w:rPr>
+        <w:t>│</w:t>
+      </w:r>
+    </w:p>
+    <w:p>
+      <w:pPr>
+        <w:pStyle w:val="ListParagraph"/>
+        <w:rPr>
+          <w:noProof/>
+        </w:rPr>
+      </w:pPr>
+      <w:r>
+        <w:rPr>
+          <w:rFonts w:ascii="MS Gothic" w:eastAsia="MS Gothic" w:hAnsi="MS Gothic" w:cs="MS Gothic" w:hint="eastAsia"/>
+          <w:noProof/>
+        </w:rPr>
+        <w:t>├</w:t>
+      </w:r>
+      <w:r>
+        <w:rPr>
+          <w:rFonts w:ascii="Aptos" w:hAnsi="Aptos" w:cs="Aptos"/>
+          <w:noProof/>
+        </w:rPr>
+        <w:t>──</w:t>
+      </w:r>
+      <w:r>
+        <w:rPr>
+          <w:noProof/>
+        </w:rPr>
+        <w:t xml:space="preserve"> main.py                     # Entry point of the game</w:t>
+      </w:r>
+    </w:p>
+    <w:p>
+      <w:pPr>
+        <w:pStyle w:val="ListParagraph"/>
+        <w:rPr>
+          <w:noProof/>
+        </w:rPr>
+      </w:pPr>
+      <w:r>
+        <w:rPr>
+          <w:rFonts w:ascii="MS Gothic" w:eastAsia="MS Gothic" w:hAnsi="MS Gothic" w:cs="MS Gothic" w:hint="eastAsia"/>
+          <w:noProof/>
+        </w:rPr>
+        <w:t>├</w:t>
+      </w:r>
+      <w:r>
+        <w:rPr>
+          <w:rFonts w:ascii="Aptos" w:hAnsi="Aptos" w:cs="Aptos"/>
+          <w:noProof/>
+        </w:rPr>
+        <w:t>──</w:t>
+      </w:r>
+      <w:r>
+        <w:rPr>
+          <w:noProof/>
+        </w:rPr>
+        <w:t xml:space="preserve"> constants.py                # Constants like SCREEN_WIDTH, SCREEN_HEIGHT, colors, etc.</w:t>
+      </w:r>
+    </w:p>
+    <w:p>
+      <w:pPr>
+        <w:pStyle w:val="ListParagraph"/>
+        <w:rPr>
+          <w:noProof/>
+        </w:rPr>
+      </w:pPr>
+      <w:r>
+        <w:rPr>
+          <w:noProof/>
+        </w:rPr>
+        <w:t>│</w:t>
+      </w:r>
+    </w:p>
+    <w:p>
+      <w:pPr>
+        <w:pStyle w:val="ListParagraph"/>
+        <w:rPr>
+          <w:noProof/>
+        </w:rPr>
+      </w:pPr>
+      <w:r>
+        <w:rPr>
+          <w:rFonts w:ascii="MS Gothic" w:eastAsia="MS Gothic" w:hAnsi="MS Gothic" w:cs="MS Gothic" w:hint="eastAsia"/>
+          <w:noProof/>
+        </w:rPr>
+        <w:t>├</w:t>
+      </w:r>
+      <w:r>
+        <w:rPr>
+          <w:rFonts w:ascii="Aptos" w:hAnsi="Aptos" w:cs="Aptos"/>
+          <w:noProof/>
+        </w:rPr>
+        <w:t>──</w:t>
+      </w:r>
+      <w:r>
+        <w:rPr>
+          <w:noProof/>
+        </w:rPr>
+        <w:t xml:space="preserve"> models/                     # Contains all game object classes</w:t>
+      </w:r>
+    </w:p>
+    <w:p>
+      <w:pPr>
+        <w:pStyle w:val="ListParagraph"/>
+        <w:rPr>
+          <w:noProof/>
+        </w:rPr>
+      </w:pPr>
+      <w:r>
+        <w:rPr>
+          <w:noProof/>
+        </w:rPr>
+        <w:t xml:space="preserve">│   </w:t>
+      </w:r>
+      <w:r>
+        <w:rPr>
+          <w:rFonts w:ascii="MS Gothic" w:eastAsia="MS Gothic" w:hAnsi="MS Gothic" w:cs="MS Gothic" w:hint="eastAsia"/>
+          <w:noProof/>
+        </w:rPr>
+        <w:t>├</w:t>
+      </w:r>
+      <w:r>
+        <w:rPr>
+          <w:rFonts w:ascii="Aptos" w:hAnsi="Aptos" w:cs="Aptos"/>
+          <w:noProof/>
+        </w:rPr>
+        <w:t>──</w:t>
+      </w:r>
+      <w:r>
+        <w:rPr>
+          <w:noProof/>
+        </w:rPr>
+        <w:t xml:space="preserve"> game_object.py          # Base GameObject class</w:t>
+      </w:r>
+    </w:p>
+    <w:p>
+      <w:pPr>
+        <w:pStyle w:val="ListParagraph"/>
+        <w:rPr>
+          <w:noProof/>
+        </w:rPr>
+      </w:pPr>
+      <w:r>
+        <w:rPr>
+          <w:noProof/>
+        </w:rPr>
+        <w:t xml:space="preserve">│   </w:t>
+      </w:r>
+      <w:r>
+        <w:rPr>
+          <w:rFonts w:ascii="MS Gothic" w:eastAsia="MS Gothic" w:hAnsi="MS Gothic" w:cs="MS Gothic" w:hint="eastAsia"/>
+          <w:noProof/>
+        </w:rPr>
+        <w:t>├</w:t>
+      </w:r>
+      <w:r>
+        <w:rPr>
+          <w:rFonts w:ascii="Aptos" w:hAnsi="Aptos" w:cs="Aptos"/>
+          <w:noProof/>
+        </w:rPr>
+        <w:t>──</w:t>
+      </w:r>
+      <w:r>
+        <w:rPr>
+          <w:noProof/>
+        </w:rPr>
+        <w:t xml:space="preserve"> ball.py                 # Ball class</w:t>
+      </w:r>
+    </w:p>
+    <w:p>
+      <w:pPr>
+        <w:pStyle w:val="ListParagraph"/>
+        <w:rPr>
+          <w:noProof/>
+        </w:rPr>
+      </w:pPr>
+      <w:r>
+        <w:rPr>
+          <w:noProof/>
+        </w:rPr>
+        <w:t xml:space="preserve">│   </w:t>
+      </w:r>
+      <w:r>
+        <w:rPr>
+          <w:rFonts w:ascii="MS Gothic" w:eastAsia="MS Gothic" w:hAnsi="MS Gothic" w:cs="MS Gothic" w:hint="eastAsia"/>
+          <w:noProof/>
+        </w:rPr>
+        <w:t>├</w:t>
+      </w:r>
+      <w:r>
+        <w:rPr>
+          <w:rFonts w:ascii="Aptos" w:hAnsi="Aptos" w:cs="Aptos"/>
+          <w:noProof/>
+        </w:rPr>
+        <w:t>──</w:t>
+      </w:r>
+      <w:r>
+        <w:rPr>
+          <w:noProof/>
+        </w:rPr>
+        <w:t xml:space="preserve"> paddle.py               # Paddle class</w:t>
+      </w:r>
+    </w:p>
+    <w:p>
+      <w:pPr>
+        <w:pStyle w:val="ListParagraph"/>
+        <w:rPr>
+          <w:noProof/>
+        </w:rPr>
+      </w:pPr>
+      <w:r>
+        <w:rPr>
+          <w:noProof/>
+        </w:rPr>
+        <w:t xml:space="preserve">│   </w:t>
+      </w:r>
+      <w:r>
+        <w:rPr>
+          <w:rFonts w:ascii="MS Gothic" w:eastAsia="MS Gothic" w:hAnsi="MS Gothic" w:cs="MS Gothic" w:hint="eastAsia"/>
+          <w:noProof/>
+        </w:rPr>
+        <w:t>├</w:t>
+      </w:r>
+      <w:r>
+        <w:rPr>
+          <w:rFonts w:ascii="Aptos" w:hAnsi="Aptos" w:cs="Aptos"/>
+          <w:noProof/>
+        </w:rPr>
+        <w:t>──</w:t>
+      </w:r>
+      <w:r>
+        <w:rPr>
+          <w:noProof/>
+        </w:rPr>
+        <w:t xml:space="preserve"> brick.py                # Brick class</w:t>
+      </w:r>
+    </w:p>
+    <w:p>
+      <w:pPr>
+        <w:pStyle w:val="ListParagraph"/>
+        <w:rPr>
+          <w:noProof/>
+        </w:rPr>
+      </w:pPr>
+      <w:r>
+        <w:rPr>
+          <w:noProof/>
+        </w:rPr>
+        <w:t>│   └── powerup.py              # PowerUp class</w:t>
+      </w:r>
+    </w:p>
+    <w:p>
+      <w:pPr>
+        <w:pStyle w:val="ListParagraph"/>
+        <w:rPr>
+          <w:noProof/>
+        </w:rPr>
+      </w:pPr>
+      <w:r>
+        <w:rPr>
+          <w:noProof/>
+        </w:rPr>
+        <w:t>│</w:t>
+      </w:r>
+    </w:p>
+    <w:p>
+      <w:pPr>
+        <w:pStyle w:val="ListParagraph"/>
+        <w:rPr>
+          <w:noProof/>
+        </w:rPr>
+      </w:pPr>
+      <w:r>
+        <w:rPr>
+          <w:rFonts w:ascii="MS Gothic" w:eastAsia="MS Gothic" w:hAnsi="MS Gothic" w:cs="MS Gothic" w:hint="eastAsia"/>
+          <w:noProof/>
+        </w:rPr>
+        <w:t>├</w:t>
+      </w:r>
+      <w:r>
+        <w:rPr>
+          <w:rFonts w:ascii="Aptos" w:hAnsi="Aptos" w:cs="Aptos"/>
+          <w:noProof/>
+        </w:rPr>
+        <w:t>──</w:t>
+      </w:r>
+      <w:r>
+        <w:rPr>
+          <w:noProof/>
+        </w:rPr>
+        <w:t xml:space="preserve"> utils/                      # Utility functions and helpers</w:t>
+      </w:r>
+    </w:p>
+    <w:p>
+      <w:pPr>
+        <w:pStyle w:val="ListParagraph"/>
+        <w:rPr>
+          <w:noProof/>
+        </w:rPr>
+      </w:pPr>
+      <w:r>
+        <w:rPr>
+          <w:noProof/>
+        </w:rPr>
+        <w:t xml:space="preserve">│   </w:t>
+      </w:r>
+      <w:r>
+        <w:rPr>
+          <w:rFonts w:ascii="MS Gothic" w:eastAsia="MS Gothic" w:hAnsi="MS Gothic" w:cs="MS Gothic" w:hint="eastAsia"/>
+          <w:noProof/>
+        </w:rPr>
+        <w:t>├</w:t>
+      </w:r>
+      <w:r>
+        <w:rPr>
+          <w:rFonts w:ascii="Aptos" w:hAnsi="Aptos" w:cs="Aptos"/>
+          <w:noProof/>
+        </w:rPr>
+        <w:t>──</w:t>
+      </w:r>
+      <w:r>
+        <w:rPr>
+          <w:noProof/>
+        </w:rPr>
+        <w:t xml:space="preserve"> collision_handler.py    # Functions for handling collisions</w:t>
+      </w:r>
+    </w:p>
+    <w:p>
+      <w:pPr>
+        <w:pStyle w:val="ListParagraph"/>
+        <w:rPr>
+          <w:noProof/>
+        </w:rPr>
+      </w:pPr>
+      <w:r>
+        <w:rPr>
+          <w:noProof/>
+        </w:rPr>
+        <w:t xml:space="preserve">│   </w:t>
+      </w:r>
+      <w:r>
+        <w:rPr>
+          <w:rFonts w:ascii="MS Gothic" w:eastAsia="MS Gothic" w:hAnsi="MS Gothic" w:cs="MS Gothic" w:hint="eastAsia"/>
+          <w:noProof/>
+        </w:rPr>
+        <w:t>├</w:t>
+      </w:r>
+      <w:r>
+        <w:rPr>
+          <w:rFonts w:ascii="Aptos" w:hAnsi="Aptos" w:cs="Aptos"/>
+          <w:noProof/>
+        </w:rPr>
+        <w:t>──</w:t>
+      </w:r>
+      <w:r>
+        <w:rPr>
+          <w:noProof/>
+        </w:rPr>
+        <w:t xml:space="preserve"> game_logic.py           # Functions for game logic (e.g., level generation)</w:t>
+      </w:r>
+    </w:p>
+    <w:p>
+      <w:pPr>
+        <w:pStyle w:val="ListParagraph"/>
+        <w:rPr>
+          <w:noProof/>
+        </w:rPr>
+      </w:pPr>
+      <w:r>
+        <w:rPr>
+          <w:noProof/>
+        </w:rPr>
+        <w:t>│   └── renderer.py             # Functions for rendering game objects</w:t>
+      </w:r>
+    </w:p>
+    <w:p>
+      <w:pPr>
+        <w:pStyle w:val="ListParagraph"/>
+        <w:rPr>
+          <w:noProof/>
+        </w:rPr>
+      </w:pPr>
+      <w:r>
+        <w:rPr>
+          <w:noProof/>
+        </w:rPr>
+        <w:t>│</w:t>
+      </w:r>
+    </w:p>
+    <w:p>
+      <w:pPr>
+        <w:pStyle w:val="ListParagraph"/>
+        <w:rPr>
+          <w:noProof/>
+        </w:rPr>
+      </w:pPr>
+      <w:r>
+        <w:rPr>
+          <w:noProof/>
+        </w:rPr>
+        <w:t>└── tests/                      # Unit tests for the game</w:t>
+      </w:r>
+    </w:p>
+    <w:p>
+      <w:pPr>
+        <w:pStyle w:val="ListParagraph"/>
+        <w:rPr>
+          <w:noProof/>
+        </w:rPr>
+      </w:pPr>
+      <w:r>
+        <w:rPr>
+          <w:noProof/>
+        </w:rPr>
+        <w:t xml:space="preserve">    </w:t>
+      </w:r>
+      <w:r>
+        <w:rPr>
+          <w:rFonts w:ascii="MS Gothic" w:eastAsia="MS Gothic" w:hAnsi="MS Gothic" w:cs="MS Gothic" w:hint="eastAsia"/>
+          <w:noProof/>
+        </w:rPr>
+        <w:t>├</w:t>
+      </w:r>
+      <w:r>
+        <w:rPr>
+          <w:rFonts w:ascii="Aptos" w:hAnsi="Aptos" w:cs="Aptos"/>
+          <w:noProof/>
+        </w:rPr>
+        <w:t>──</w:t>
+      </w:r>
+      <w:r>
+        <w:rPr>
+          <w:noProof/>
+        </w:rPr>
+        <w:t xml:space="preserve"> test_</w:t>
+      </w:r>
+      <w:r>
+        <w:rPr>
+          <w:noProof/>
+        </w:rPr>
+        <w:t>ball</w:t>
+      </w:r>
+      <w:r>
+        <w:rPr>
+          <w:noProof/>
+        </w:rPr>
+        <w:t>.py            # Tests for the Ball class</w:t>
+      </w:r>
+    </w:p>
+    <w:p>
+      <w:pPr>
+        <w:pStyle w:val="ListParagraph"/>
+        <w:rPr>
+          <w:noProof/>
+        </w:rPr>
+      </w:pPr>
+      <w:r>
+        <w:rPr>
+          <w:noProof/>
+        </w:rPr>
+        <w:t xml:space="preserve">    </w:t>
+      </w:r>
+      <w:r>
+        <w:rPr>
+          <w:rFonts w:ascii="MS Gothic" w:eastAsia="MS Gothic" w:hAnsi="MS Gothic" w:cs="MS Gothic" w:hint="eastAsia"/>
+          <w:noProof/>
+        </w:rPr>
+        <w:t>├</w:t>
+      </w:r>
+      <w:r>
+        <w:rPr>
+          <w:rFonts w:ascii="Aptos" w:hAnsi="Aptos" w:cs="Aptos"/>
+          <w:noProof/>
+        </w:rPr>
+        <w:t>──</w:t>
+      </w:r>
+      <w:r>
+        <w:rPr>
+          <w:noProof/>
+        </w:rPr>
+        <w:t xml:space="preserve"> test_paddle.py          # Tests for the Paddle class</w:t>
+      </w:r>
+    </w:p>
+    <w:p>
+      <w:pPr>
+        <w:pStyle w:val="ListParagraph"/>
+        <w:rPr>
+          <w:noProof/>
+        </w:rPr>
+      </w:pPr>
+      <w:r>
+        <w:rPr>
+          <w:noProof/>
+        </w:rPr>
+        <w:t xml:space="preserve">    </w:t>
+      </w:r>
+      <w:r>
+        <w:rPr>
+          <w:rFonts w:ascii="MS Gothic" w:eastAsia="MS Gothic" w:hAnsi="MS Gothic" w:cs="MS Gothic" w:hint="eastAsia"/>
+          <w:noProof/>
+        </w:rPr>
+        <w:t>├</w:t>
+      </w:r>
+      <w:r>
+        <w:rPr>
+          <w:rFonts w:ascii="Aptos" w:hAnsi="Aptos" w:cs="Aptos"/>
+          <w:noProof/>
+        </w:rPr>
+        <w:t>──</w:t>
+      </w:r>
+      <w:r>
+        <w:rPr>
+          <w:noProof/>
+        </w:rPr>
+        <w:t xml:space="preserve"> test_brick.py           # Tests for the Brick class</w:t>
+      </w:r>
+    </w:p>
+    <w:p>
+      <w:pPr>
+        <w:pStyle w:val="ListParagraph"/>
+        <w:rPr>
+          <w:noProof/>
+        </w:rPr>
+      </w:pPr>
+      <w:r>
+        <w:rPr>
+          <w:noProof/>
+        </w:rPr>
+        <w:t xml:space="preserve">    └── test_powerup.py         # Tests for the PowerUp class</w:t>
+      </w:r>
+    </w:p>
+    <w:p>
+      <w:pPr>
+        <w:rPr>
+          <w:noProof/>
+        </w:rPr>
+      </w:pPr>
+    </w:p>
+    <w:p>
+      <w:pPr>
+        <w:pStyle w:val="ListParagraph"/>
+        <w:numPr>
+          <w:ilvl w:val="0"/>
+          <w:numId w:val="1"/>
+        </w:numPr>
+        <w:rPr>
+          <w:noProof/>
+        </w:rPr>
+      </w:pPr>
+      <w:r>
+        <w:rPr>
+          <w:noProof/>
+        </w:rPr>
+        <w:t xml:space="preserve">Actual system architecture may have some of the separate files joined together, though for the sake of presentation of the different modules, the files </w:t>
+      </w:r>
+      <w:r>
+        <w:rPr>
+          <w:noProof/>
+        </w:rPr>
+        <w:t>of different modules (Eg. The utility functions) have been split separately.</w:t>
+      </w:r>
+    </w:p>
+    <w:p>
+      <w:pPr>
+        <w:rPr>
+          <w:noProof/>
+        </w:rPr>
+      </w:pPr>
+    </w:p>
+    <w:p>
+      <w:pPr>
+        <w:pStyle w:val="ListParagraph"/>
+        <w:numPr>
+          <w:ilvl w:val="0"/>
+          <w:numId w:val="1"/>
+        </w:numPr>
+        <w:rPr>
+          <w:noProof/>
+        </w:rPr>
+      </w:pPr>
+      <w:r>
+        <w:rPr>
+          <w:noProof/>
+        </w:rPr>
+        <w:t>(Some credit to ChatGPT for helping me with actual organisation of the lines and aesthetics of system architecture)</w:t>
       </w:r>
     </w:p>
     <w:sectPr>
@@ -2004,7 +4484,7 @@
         <w:rFonts w:ascii="Courier New" w:hAnsi="Courier New" w:cs="Courier New" w:hint="default"/>
       </w:rPr>
     </w:lvl>
-    <w:lvl w:ilvl="2" w:tplc="0C090005" w:tentative="1">
+    <w:lvl w:ilvl="2" w:tplc="0C090005">
       <w:start w:val="1"/>
       <w:numFmt w:val="bullet"/>
       <w:lvlText w:val=""/>

</xml_diff>

<commit_message>
Missed a couple dot-points, finalised Deliverable 2 and submitted.
</commit_message>
<xml_diff>
--- a/Brick Blitz Documentation - Berkay Topal.docx
+++ b/Brick Blitz Documentation - Berkay Topal.docx
@@ -447,8 +447,13 @@
         </w:numPr>
       </w:pPr>
       <w:r>
-        <w:t>Students and developers interested in learning about game development, particularly collision detection, physics-based movement, and event handling in Pygame</w:t>
-      </w:r>
+        <w:t xml:space="preserve">Students and developers interested in learning about game development, particularly collision detection, physics-based movement, and event handling in </w:t>
+      </w:r>
+      <w:proofErr w:type="spellStart"/>
+      <w:r>
+        <w:t>Pygame</w:t>
+      </w:r>
+      <w:proofErr w:type="spellEnd"/>
     </w:p>
     <w:p>
       <w:pPr>
@@ -565,8 +570,13 @@
         <w:t xml:space="preserve">Directional Control, Levels, etc.) </w:t>
       </w:r>
       <w:r>
-        <w:t>that is better than Arkanoid</w:t>
-      </w:r>
+        <w:t xml:space="preserve">that is better than </w:t>
+      </w:r>
+      <w:proofErr w:type="spellStart"/>
+      <w:r>
+        <w:t>Arkanoid</w:t>
+      </w:r>
+      <w:proofErr w:type="spellEnd"/>
       <w:r>
         <w:t>.</w:t>
       </w:r>
@@ -1171,13 +1181,45 @@
         </w:rPr>
       </w:pPr>
       <w:r>
-        <w:t>My classes: Ball, Paddle, Brick, PowerUp, GameObject, all encapsulate their own data (</w:t>
+        <w:t xml:space="preserve">My classes: Ball, Paddle, Brick, </w:t>
+      </w:r>
+      <w:proofErr w:type="spellStart"/>
+      <w:r>
+        <w:t>PowerUp</w:t>
+      </w:r>
+      <w:proofErr w:type="spellEnd"/>
+      <w:r>
+        <w:t xml:space="preserve">, </w:t>
+      </w:r>
+      <w:proofErr w:type="spellStart"/>
+      <w:r>
+        <w:t>GameObject</w:t>
+      </w:r>
+      <w:proofErr w:type="spellEnd"/>
+      <w:r>
+        <w:t>, all encapsulate their own data (</w:t>
       </w:r>
       <w:r>
         <w:t>E.g.</w:t>
       </w:r>
       <w:r>
-        <w:t xml:space="preserve"> speed_x, speed_y, x, y), and methods (</w:t>
+        <w:t xml:space="preserve"> </w:t>
+      </w:r>
+      <w:proofErr w:type="spellStart"/>
+      <w:r>
+        <w:t>speed_x</w:t>
+      </w:r>
+      <w:proofErr w:type="spellEnd"/>
+      <w:r>
+        <w:t xml:space="preserve">, </w:t>
+      </w:r>
+      <w:proofErr w:type="spellStart"/>
+      <w:r>
+        <w:t>speed_y</w:t>
+      </w:r>
+      <w:proofErr w:type="spellEnd"/>
+      <w:r>
+        <w:t>, x, y), and methods (</w:t>
       </w:r>
       <w:r>
         <w:t>E.g.</w:t>
@@ -1258,7 +1300,15 @@
         </w:rPr>
       </w:pPr>
       <w:r>
-        <w:t>Currently, I have a ‘GameObject’ base class, which encapsulates common properties such as ‘x’, ‘y’ and methods such as ‘draw’, ‘move’</w:t>
+        <w:t>Currently, I have a ‘</w:t>
+      </w:r>
+      <w:proofErr w:type="spellStart"/>
+      <w:r>
+        <w:t>GameObject</w:t>
+      </w:r>
+      <w:proofErr w:type="spellEnd"/>
+      <w:r>
+        <w:t>’ base class, which encapsulates common properties such as ‘x’, ‘y’ and methods such as ‘draw’, ‘move’</w:t>
       </w:r>
     </w:p>
     <w:p>
@@ -1283,7 +1333,23 @@
         </w:rPr>
       </w:pPr>
       <w:r>
-        <w:t>Then the child classes ‘Ball’, ‘Paddle’, ‘Brick’, ‘PowerUp’ all inherit from the parent class ‘GameObject’</w:t>
+        <w:t>Then the child classes ‘Ball’, ‘Paddle’, ‘Brick’, ‘</w:t>
+      </w:r>
+      <w:proofErr w:type="spellStart"/>
+      <w:r>
+        <w:t>PowerUp</w:t>
+      </w:r>
+      <w:proofErr w:type="spellEnd"/>
+      <w:r>
+        <w:t>’ all inherit from the parent class ‘</w:t>
+      </w:r>
+      <w:proofErr w:type="spellStart"/>
+      <w:r>
+        <w:t>GameObject</w:t>
+      </w:r>
+      <w:proofErr w:type="spellEnd"/>
+      <w:r>
+        <w:t>’</w:t>
       </w:r>
     </w:p>
     <w:p>
@@ -1308,7 +1374,15 @@
         </w:rPr>
       </w:pPr>
       <w:r>
-        <w:t>Allows them to reuse the methods and attributes that GameObject holds, while still adding their own specific behaviour</w:t>
+        <w:t xml:space="preserve">Allows them to reuse the methods and attributes that </w:t>
+      </w:r>
+      <w:proofErr w:type="spellStart"/>
+      <w:r>
+        <w:t>GameObject</w:t>
+      </w:r>
+      <w:proofErr w:type="spellEnd"/>
+      <w:r>
+        <w:t xml:space="preserve"> holds, while still adding their own specific behaviour</w:t>
       </w:r>
     </w:p>
     <w:p>
@@ -1376,7 +1450,15 @@
         <w:t>Game uses method overridin</w:t>
       </w:r>
       <w:r>
-        <w:t>g, where the child classes override the ‘draw’ and ‘move’ methods from the ‘GameObject’ parent class, to provide its own implementation</w:t>
+        <w:t>g, where the child classes override the ‘draw’ and ‘move’ methods from the ‘</w:t>
+      </w:r>
+      <w:proofErr w:type="spellStart"/>
+      <w:r>
+        <w:t>GameObject</w:t>
+      </w:r>
+      <w:proofErr w:type="spellEnd"/>
+      <w:r>
+        <w:t>’ parent class, to provide its own implementation</w:t>
       </w:r>
     </w:p>
     <w:p>
@@ -1401,7 +1483,23 @@
         </w:rPr>
       </w:pPr>
       <w:r>
-        <w:t>Despite different implementations, all child classes can be treated as ‘GameObject’ instances, so you can call ‘draw’ or ‘move’ on any ‘GameObject’ without knowing the specific type</w:t>
+        <w:t>Despite different implementations, all child classes can be treated as ‘</w:t>
+      </w:r>
+      <w:proofErr w:type="spellStart"/>
+      <w:r>
+        <w:t>GameObject</w:t>
+      </w:r>
+      <w:proofErr w:type="spellEnd"/>
+      <w:r>
+        <w:t>’ instances, so you can call ‘draw’ or ‘move’ on any ‘</w:t>
+      </w:r>
+      <w:proofErr w:type="spellStart"/>
+      <w:r>
+        <w:t>GameObject</w:t>
+      </w:r>
+      <w:proofErr w:type="spellEnd"/>
+      <w:r>
+        <w:t>’ without knowing the specific type</w:t>
       </w:r>
     </w:p>
     <w:p>
@@ -1474,7 +1572,15 @@
         </w:rPr>
       </w:pPr>
       <w:r>
-        <w:t>Currently, the plan is to have the ‘GameObject’ class define abstract methods like ‘draw’ and ‘move’ without providing an implementation, forcing the child classes to implement the methods</w:t>
+        <w:t>Currently, the plan is to have the ‘</w:t>
+      </w:r>
+      <w:proofErr w:type="spellStart"/>
+      <w:r>
+        <w:t>GameObject</w:t>
+      </w:r>
+      <w:proofErr w:type="spellEnd"/>
+      <w:r>
+        <w:t>’ class define abstract methods like ‘draw’ and ‘move’ without providing an implementation, forcing the child classes to implement the methods</w:t>
       </w:r>
     </w:p>
     <w:p>
@@ -1832,6 +1938,19 @@
         </w:rPr>
         <w:t>be shown between the classes</w:t>
       </w:r>
+      <w:r>
+        <w:rPr>
+          <w:noProof/>
+        </w:rPr>
+        <w:t>, and the ‘Brick’ class has to be added</w:t>
+      </w:r>
+    </w:p>
+    <w:p>
+      <w:pPr>
+        <w:rPr>
+          <w:noProof/>
+        </w:rPr>
+      </w:pPr>
     </w:p>
     <w:p>
       <w:pPr>
@@ -2111,7 +2230,6 @@
           <w:color w:val="00B050"/>
           <w:u w:val="single"/>
         </w:rPr>
-        <w:lastRenderedPageBreak/>
         <w:t>Section 2: Detailed Pseudocode</w:t>
       </w:r>
     </w:p>
@@ -3445,71 +3563,118 @@
           <w:u w:val="single"/>
         </w:rPr>
       </w:pPr>
-    </w:p>
-    <w:p>
-      <w:pPr>
+      <w:r>
         <w:rPr>
           <w:b/>
           <w:bCs/>
           <w:color w:val="00B050"/>
           <w:u w:val="single"/>
         </w:rPr>
-      </w:pPr>
-    </w:p>
-    <w:p>
-      <w:pPr>
+        <w:lastRenderedPageBreak/>
+        <w:t>Section</w:t>
+      </w:r>
+      <w:r>
         <w:rPr>
           <w:b/>
           <w:bCs/>
           <w:color w:val="00B050"/>
           <w:u w:val="single"/>
         </w:rPr>
-      </w:pPr>
-    </w:p>
-    <w:p>
-      <w:pPr>
-        <w:rPr>
-          <w:b/>
-          <w:bCs/>
+        <w:t xml:space="preserve"> 4: Refined Class Diagram</w:t>
+      </w:r>
+    </w:p>
+    <w:p>
+      <w:pPr>
+        <w:rPr>
+          <w:b/>
+          <w:bCs/>
+          <w:color w:val="7030A0"/>
+        </w:rPr>
+      </w:pPr>
+      <w:r>
+        <w:rPr>
           <w:color w:val="00B050"/>
-          <w:u w:val="single"/>
-        </w:rPr>
-      </w:pPr>
-    </w:p>
-    <w:p>
-      <w:pPr>
-        <w:rPr>
-          <w:b/>
-          <w:bCs/>
-          <w:color w:val="00B050"/>
-          <w:u w:val="single"/>
-        </w:rPr>
-      </w:pPr>
-    </w:p>
-    <w:p>
-      <w:pPr>
-        <w:rPr>
-          <w:noProof/>
-        </w:rPr>
-      </w:pPr>
-      <w:r>
-        <w:rPr>
-          <w:b/>
-          <w:bCs/>
-          <w:color w:val="00B050"/>
-          <w:u w:val="single"/>
-        </w:rPr>
-        <w:t>Section</w:t>
-      </w:r>
-      <w:r>
-        <w:rPr>
-          <w:b/>
-          <w:bCs/>
-          <w:color w:val="00B050"/>
-          <w:u w:val="single"/>
-        </w:rPr>
-        <w:t xml:space="preserve"> 4: Refined Class Diagram</w:t>
-      </w:r>
+        </w:rPr>
+        <w:tab/>
+      </w:r>
+      <w:r>
+        <w:rPr>
+          <w:b/>
+          <w:bCs/>
+          <w:color w:val="7030A0"/>
+        </w:rPr>
+        <w:t>Changes From Last Class Diagram:</w:t>
+      </w:r>
+    </w:p>
+    <w:p>
+      <w:pPr>
+        <w:pStyle w:val="ListParagraph"/>
+        <w:numPr>
+          <w:ilvl w:val="1"/>
+          <w:numId w:val="1"/>
+        </w:numPr>
+        <w:rPr>
+          <w:b/>
+          <w:bCs/>
+          <w:noProof/>
+        </w:rPr>
+      </w:pPr>
+      <w:r>
+        <w:rPr>
+          <w:noProof/>
+        </w:rPr>
+        <w:t>Showing association relationships between classes (Brick &amp; Ball, Paddle &amp; Powerup)</w:t>
+      </w:r>
+    </w:p>
+    <w:p>
+      <w:pPr>
+        <w:rPr>
+          <w:b/>
+          <w:bCs/>
+          <w:noProof/>
+        </w:rPr>
+      </w:pPr>
+    </w:p>
+    <w:p>
+      <w:pPr>
+        <w:pStyle w:val="ListParagraph"/>
+        <w:numPr>
+          <w:ilvl w:val="1"/>
+          <w:numId w:val="1"/>
+        </w:numPr>
+        <w:rPr>
+          <w:b/>
+          <w:bCs/>
+          <w:noProof/>
+        </w:rPr>
+      </w:pPr>
+      <w:r>
+        <w:rPr>
+          <w:noProof/>
+        </w:rPr>
+        <w:t>Brick class has been added</w:t>
+      </w:r>
+    </w:p>
+    <w:p>
+      <w:pPr>
+        <w:pStyle w:val="ListParagraph"/>
+        <w:rPr>
+          <w:b/>
+          <w:bCs/>
+          <w:noProof/>
+        </w:rPr>
+      </w:pPr>
+    </w:p>
+    <w:p>
+      <w:pPr>
+        <w:pStyle w:val="ListParagraph"/>
+        <w:ind w:left="1440"/>
+        <w:rPr>
+          <w:b/>
+          <w:bCs/>
+          <w:noProof/>
+        </w:rPr>
+      </w:pPr>
     </w:p>
     <w:p>
       <w:pPr>
@@ -4380,6 +4545,1769 @@
         <w:t>(Some credit to ChatGPT for helping me with actual organisation of the lines and aesthetics of system architecture)</w:t>
       </w:r>
     </w:p>
+    <w:p>
+      <w:pPr>
+        <w:pStyle w:val="ListParagraph"/>
+        <w:rPr>
+          <w:noProof/>
+        </w:rPr>
+      </w:pPr>
+    </w:p>
+    <w:p>
+      <w:pPr>
+        <w:pStyle w:val="ListParagraph"/>
+        <w:rPr>
+          <w:noProof/>
+        </w:rPr>
+      </w:pPr>
+    </w:p>
+    <w:p>
+      <w:pPr>
+        <w:pStyle w:val="ListParagraph"/>
+        <w:rPr>
+          <w:noProof/>
+        </w:rPr>
+      </w:pPr>
+    </w:p>
+    <w:p>
+      <w:pPr>
+        <w:pStyle w:val="ListParagraph"/>
+        <w:rPr>
+          <w:noProof/>
+        </w:rPr>
+      </w:pPr>
+    </w:p>
+    <w:p>
+      <w:pPr>
+        <w:pStyle w:val="ListParagraph"/>
+        <w:rPr>
+          <w:noProof/>
+        </w:rPr>
+      </w:pPr>
+    </w:p>
+    <w:p>
+      <w:pPr>
+        <w:pStyle w:val="ListParagraph"/>
+        <w:rPr>
+          <w:noProof/>
+        </w:rPr>
+      </w:pPr>
+    </w:p>
+    <w:p>
+      <w:pPr>
+        <w:pStyle w:val="ListParagraph"/>
+        <w:rPr>
+          <w:noProof/>
+        </w:rPr>
+      </w:pPr>
+    </w:p>
+    <w:p>
+      <w:pPr>
+        <w:pStyle w:val="ListParagraph"/>
+        <w:rPr>
+          <w:noProof/>
+        </w:rPr>
+      </w:pPr>
+    </w:p>
+    <w:p>
+      <w:pPr>
+        <w:rPr>
+          <w:b/>
+          <w:bCs/>
+          <w:color w:val="00B050"/>
+          <w:u w:val="single"/>
+        </w:rPr>
+      </w:pPr>
+    </w:p>
+    <w:p>
+      <w:pPr>
+        <w:rPr>
+          <w:b/>
+          <w:bCs/>
+          <w:color w:val="00B050"/>
+          <w:u w:val="single"/>
+        </w:rPr>
+      </w:pPr>
+      <w:r>
+        <w:rPr>
+          <w:b/>
+          <w:bCs/>
+          <w:color w:val="00B050"/>
+          <w:u w:val="single"/>
+        </w:rPr>
+        <w:lastRenderedPageBreak/>
+        <w:t>Section</w:t>
+      </w:r>
+      <w:r>
+        <w:rPr>
+          <w:b/>
+          <w:bCs/>
+          <w:color w:val="00B050"/>
+          <w:u w:val="single"/>
+        </w:rPr>
+        <w:t xml:space="preserve"> 6: Design Decisions – Error Handling and Testing Strategies</w:t>
+      </w:r>
+    </w:p>
+    <w:p>
+      <w:pPr>
+        <w:pStyle w:val="ListParagraph"/>
+        <w:rPr>
+          <w:b/>
+          <w:bCs/>
+          <w:color w:val="00B050"/>
+          <w:u w:val="single"/>
+        </w:rPr>
+      </w:pPr>
+    </w:p>
+    <w:p>
+      <w:pPr>
+        <w:rPr>
+          <w:noProof/>
+          <w:color w:val="FF0000"/>
+        </w:rPr>
+      </w:pPr>
+      <w:r>
+        <w:rPr>
+          <w:noProof/>
+          <w:color w:val="FF0000"/>
+        </w:rPr>
+        <w:t>Explain your approach to error handling (e.g., managing invalid user inputs, file I/O errors, runtime exceptions).</w:t>
+      </w:r>
+    </w:p>
+    <w:p>
+      <w:pPr>
+        <w:ind w:firstLine="720"/>
+        <w:rPr>
+          <w:b/>
+          <w:bCs/>
+          <w:color w:val="7030A0"/>
+        </w:rPr>
+      </w:pPr>
+      <w:r>
+        <w:rPr>
+          <w:b/>
+          <w:bCs/>
+          <w:color w:val="7030A0"/>
+        </w:rPr>
+        <w:t>Invalid User Inputs:</w:t>
+      </w:r>
+    </w:p>
+    <w:p>
+      <w:pPr>
+        <w:pStyle w:val="ListParagraph"/>
+        <w:numPr>
+          <w:ilvl w:val="1"/>
+          <w:numId w:val="1"/>
+        </w:numPr>
+        <w:rPr>
+          <w:b/>
+          <w:bCs/>
+          <w:noProof/>
+        </w:rPr>
+      </w:pPr>
+      <w:r>
+        <w:rPr>
+          <w:noProof/>
+        </w:rPr>
+        <w:t>Player might press keys not mapped to any action, hence will use ‘try-except’ blocks when handling inputs to handle the unexpected inputs gracefully</w:t>
+      </w:r>
+    </w:p>
+    <w:p>
+      <w:pPr>
+        <w:rPr>
+          <w:b/>
+          <w:bCs/>
+          <w:noProof/>
+        </w:rPr>
+      </w:pPr>
+    </w:p>
+    <w:p>
+      <w:pPr>
+        <w:pStyle w:val="ListParagraph"/>
+        <w:numPr>
+          <w:ilvl w:val="1"/>
+          <w:numId w:val="1"/>
+        </w:numPr>
+        <w:rPr>
+          <w:b/>
+          <w:bCs/>
+          <w:noProof/>
+        </w:rPr>
+      </w:pPr>
+      <w:r>
+        <w:rPr>
+          <w:noProof/>
+        </w:rPr>
+        <w:t>Though Pygame itself handles the invalid user inputs when clicking keys gracefully, so the ‘try-except’ is more of a backup</w:t>
+      </w:r>
+    </w:p>
+    <w:p>
+      <w:pPr>
+        <w:pStyle w:val="ListParagraph"/>
+        <w:rPr>
+          <w:b/>
+          <w:bCs/>
+          <w:noProof/>
+        </w:rPr>
+      </w:pPr>
+    </w:p>
+    <w:p>
+      <w:pPr>
+        <w:pStyle w:val="ListParagraph"/>
+        <w:rPr>
+          <w:b/>
+          <w:bCs/>
+          <w:noProof/>
+        </w:rPr>
+      </w:pPr>
+    </w:p>
+    <w:p>
+      <w:pPr>
+        <w:ind w:firstLine="720"/>
+        <w:rPr>
+          <w:b/>
+          <w:bCs/>
+          <w:color w:val="7030A0"/>
+        </w:rPr>
+      </w:pPr>
+      <w:r>
+        <w:rPr>
+          <w:b/>
+          <w:bCs/>
+          <w:color w:val="7030A0"/>
+        </w:rPr>
+        <w:t>Runtime Exceptions:</w:t>
+      </w:r>
+    </w:p>
+    <w:p>
+      <w:pPr>
+        <w:pStyle w:val="ListParagraph"/>
+        <w:numPr>
+          <w:ilvl w:val="1"/>
+          <w:numId w:val="1"/>
+        </w:numPr>
+        <w:rPr>
+          <w:b/>
+          <w:bCs/>
+          <w:noProof/>
+        </w:rPr>
+      </w:pPr>
+      <w:r>
+        <w:rPr>
+          <w:noProof/>
+        </w:rPr>
+        <w:t>Errors like division by zero, ‘NoneType’ errors, or invalid attribute access, all which crash the game</w:t>
+      </w:r>
+    </w:p>
+    <w:p>
+      <w:pPr>
+        <w:rPr>
+          <w:b/>
+          <w:bCs/>
+          <w:noProof/>
+        </w:rPr>
+      </w:pPr>
+    </w:p>
+    <w:p>
+      <w:pPr>
+        <w:pStyle w:val="ListParagraph"/>
+        <w:numPr>
+          <w:ilvl w:val="1"/>
+          <w:numId w:val="1"/>
+        </w:numPr>
+        <w:rPr>
+          <w:b/>
+          <w:bCs/>
+          <w:noProof/>
+        </w:rPr>
+      </w:pPr>
+      <w:r>
+        <w:rPr>
+          <w:noProof/>
+        </w:rPr>
+        <w:t xml:space="preserve">Will use ‘try-except’ blocks to catch and handle exceptions, will log the errors for debugging </w:t>
+      </w:r>
+      <w:r>
+        <w:rPr>
+          <w:noProof/>
+        </w:rPr>
+        <w:t xml:space="preserve">using Python’s ‘logging’ module </w:t>
+      </w:r>
+      <w:r>
+        <w:rPr>
+          <w:noProof/>
+        </w:rPr>
+        <w:t>and provide a</w:t>
+      </w:r>
+      <w:r>
+        <w:rPr>
+          <w:noProof/>
+        </w:rPr>
+        <w:t xml:space="preserve"> fallback </w:t>
+      </w:r>
+      <w:r>
+        <w:rPr>
+          <w:noProof/>
+        </w:rPr>
+        <w:t>behaviour (Eg. Resetting the ball)</w:t>
+      </w:r>
+    </w:p>
+    <w:p>
+      <w:pPr>
+        <w:pStyle w:val="ListParagraph"/>
+        <w:rPr>
+          <w:b/>
+          <w:bCs/>
+          <w:noProof/>
+        </w:rPr>
+      </w:pPr>
+    </w:p>
+    <w:p>
+      <w:pPr>
+        <w:pStyle w:val="ListParagraph"/>
+        <w:ind w:left="1440"/>
+        <w:rPr>
+          <w:b/>
+          <w:bCs/>
+          <w:noProof/>
+        </w:rPr>
+      </w:pPr>
+    </w:p>
+    <w:p>
+      <w:pPr>
+        <w:ind w:firstLine="720"/>
+        <w:rPr>
+          <w:b/>
+          <w:bCs/>
+          <w:color w:val="7030A0"/>
+        </w:rPr>
+      </w:pPr>
+      <w:r>
+        <w:rPr>
+          <w:b/>
+          <w:bCs/>
+          <w:color w:val="7030A0"/>
+        </w:rPr>
+        <w:t>File I/O Errors:</w:t>
+      </w:r>
+    </w:p>
+    <w:p>
+      <w:pPr>
+        <w:pStyle w:val="ListParagraph"/>
+        <w:numPr>
+          <w:ilvl w:val="1"/>
+          <w:numId w:val="1"/>
+        </w:numPr>
+        <w:rPr>
+          <w:b/>
+          <w:bCs/>
+          <w:noProof/>
+        </w:rPr>
+      </w:pPr>
+      <w:r>
+        <w:rPr>
+          <w:noProof/>
+        </w:rPr>
+        <w:t>Right now my game doesn’t save or load data into separate files, though in the future it will save &amp; load high scores, so this is important</w:t>
+      </w:r>
+    </w:p>
+    <w:p>
+      <w:pPr>
+        <w:rPr>
+          <w:b/>
+          <w:bCs/>
+          <w:noProof/>
+        </w:rPr>
+      </w:pPr>
+    </w:p>
+    <w:p>
+      <w:pPr>
+        <w:pStyle w:val="ListParagraph"/>
+        <w:numPr>
+          <w:ilvl w:val="1"/>
+          <w:numId w:val="1"/>
+        </w:numPr>
+        <w:rPr>
+          <w:b/>
+          <w:bCs/>
+          <w:noProof/>
+        </w:rPr>
+      </w:pPr>
+      <w:r>
+        <w:rPr>
+          <w:noProof/>
+        </w:rPr>
+        <w:t>Will use ‘try-except’ blocks to handle all file-related errors, and provide a</w:t>
+      </w:r>
+      <w:r>
+        <w:rPr>
+          <w:noProof/>
+        </w:rPr>
+        <w:t xml:space="preserve"> fallback </w:t>
+      </w:r>
+      <w:r>
+        <w:rPr>
+          <w:noProof/>
+        </w:rPr>
+        <w:t>behaviour, which in this case, would be creating a new file if that happens to not exist, or using default values for user data</w:t>
+      </w:r>
+    </w:p>
+    <w:p>
+      <w:pPr>
+        <w:pStyle w:val="ListParagraph"/>
+        <w:rPr>
+          <w:b/>
+          <w:bCs/>
+          <w:noProof/>
+        </w:rPr>
+      </w:pPr>
+    </w:p>
+    <w:p>
+      <w:pPr>
+        <w:pStyle w:val="ListParagraph"/>
+        <w:rPr>
+          <w:b/>
+          <w:bCs/>
+          <w:noProof/>
+        </w:rPr>
+      </w:pPr>
+    </w:p>
+    <w:p>
+      <w:pPr>
+        <w:pStyle w:val="ListParagraph"/>
+        <w:rPr>
+          <w:b/>
+          <w:bCs/>
+          <w:noProof/>
+        </w:rPr>
+      </w:pPr>
+    </w:p>
+    <w:p>
+      <w:pPr>
+        <w:pStyle w:val="ListParagraph"/>
+        <w:rPr>
+          <w:b/>
+          <w:bCs/>
+          <w:noProof/>
+        </w:rPr>
+      </w:pPr>
+    </w:p>
+    <w:p>
+      <w:pPr>
+        <w:pStyle w:val="ListParagraph"/>
+        <w:rPr>
+          <w:b/>
+          <w:bCs/>
+          <w:noProof/>
+        </w:rPr>
+      </w:pPr>
+    </w:p>
+    <w:p>
+      <w:pPr>
+        <w:pStyle w:val="ListParagraph"/>
+        <w:rPr>
+          <w:b/>
+          <w:bCs/>
+          <w:noProof/>
+        </w:rPr>
+      </w:pPr>
+    </w:p>
+    <w:p>
+      <w:pPr>
+        <w:pStyle w:val="ListParagraph"/>
+        <w:rPr>
+          <w:b/>
+          <w:bCs/>
+          <w:noProof/>
+        </w:rPr>
+      </w:pPr>
+    </w:p>
+    <w:p>
+      <w:pPr>
+        <w:pStyle w:val="ListParagraph"/>
+        <w:rPr>
+          <w:b/>
+          <w:bCs/>
+          <w:noProof/>
+        </w:rPr>
+      </w:pPr>
+    </w:p>
+    <w:p>
+      <w:pPr>
+        <w:pStyle w:val="ListParagraph"/>
+        <w:rPr>
+          <w:b/>
+          <w:bCs/>
+          <w:noProof/>
+        </w:rPr>
+      </w:pPr>
+    </w:p>
+    <w:p>
+      <w:pPr>
+        <w:pStyle w:val="ListParagraph"/>
+        <w:rPr>
+          <w:b/>
+          <w:bCs/>
+          <w:noProof/>
+        </w:rPr>
+      </w:pPr>
+    </w:p>
+    <w:p>
+      <w:pPr>
+        <w:pStyle w:val="ListParagraph"/>
+        <w:rPr>
+          <w:b/>
+          <w:bCs/>
+          <w:noProof/>
+        </w:rPr>
+      </w:pPr>
+    </w:p>
+    <w:p>
+      <w:pPr>
+        <w:pStyle w:val="ListParagraph"/>
+        <w:rPr>
+          <w:b/>
+          <w:bCs/>
+          <w:noProof/>
+        </w:rPr>
+      </w:pPr>
+    </w:p>
+    <w:p>
+      <w:pPr>
+        <w:pStyle w:val="ListParagraph"/>
+        <w:rPr>
+          <w:b/>
+          <w:bCs/>
+          <w:noProof/>
+        </w:rPr>
+      </w:pPr>
+    </w:p>
+    <w:p>
+      <w:pPr>
+        <w:pStyle w:val="ListParagraph"/>
+        <w:rPr>
+          <w:b/>
+          <w:bCs/>
+          <w:noProof/>
+        </w:rPr>
+      </w:pPr>
+    </w:p>
+    <w:p>
+      <w:pPr>
+        <w:pStyle w:val="ListParagraph"/>
+        <w:rPr>
+          <w:b/>
+          <w:bCs/>
+          <w:noProof/>
+        </w:rPr>
+      </w:pPr>
+    </w:p>
+    <w:p>
+      <w:pPr>
+        <w:pStyle w:val="ListParagraph"/>
+        <w:rPr>
+          <w:b/>
+          <w:bCs/>
+          <w:noProof/>
+        </w:rPr>
+      </w:pPr>
+    </w:p>
+    <w:p>
+      <w:pPr>
+        <w:pStyle w:val="ListParagraph"/>
+        <w:rPr>
+          <w:b/>
+          <w:bCs/>
+          <w:noProof/>
+        </w:rPr>
+      </w:pPr>
+    </w:p>
+    <w:p>
+      <w:pPr>
+        <w:pStyle w:val="ListParagraph"/>
+        <w:rPr>
+          <w:b/>
+          <w:bCs/>
+          <w:noProof/>
+        </w:rPr>
+      </w:pPr>
+    </w:p>
+    <w:p>
+      <w:pPr>
+        <w:pStyle w:val="ListParagraph"/>
+        <w:rPr>
+          <w:b/>
+          <w:bCs/>
+          <w:noProof/>
+        </w:rPr>
+      </w:pPr>
+    </w:p>
+    <w:p>
+      <w:pPr>
+        <w:pStyle w:val="ListParagraph"/>
+        <w:rPr>
+          <w:b/>
+          <w:bCs/>
+          <w:noProof/>
+        </w:rPr>
+      </w:pPr>
+    </w:p>
+    <w:p>
+      <w:pPr>
+        <w:rPr>
+          <w:noProof/>
+          <w:color w:val="FF0000"/>
+        </w:rPr>
+      </w:pPr>
+      <w:r>
+        <w:rPr>
+          <w:noProof/>
+          <w:color w:val="FF0000"/>
+        </w:rPr>
+        <w:t>Outline your approach for testing the game (Unit tests, integration tests, system tests)</w:t>
+      </w:r>
+      <w:r>
+        <w:rPr>
+          <w:noProof/>
+          <w:color w:val="FF0000"/>
+        </w:rPr>
+        <w:t>, along with any tools or frameworks you plan to use.</w:t>
+      </w:r>
+    </w:p>
+    <w:p>
+      <w:pPr>
+        <w:rPr>
+          <w:noProof/>
+          <w:color w:val="FF0000"/>
+        </w:rPr>
+      </w:pPr>
+    </w:p>
+    <w:p>
+      <w:pPr>
+        <w:ind w:firstLine="720"/>
+        <w:rPr>
+          <w:b/>
+          <w:bCs/>
+          <w:color w:val="7030A0"/>
+        </w:rPr>
+      </w:pPr>
+      <w:r>
+        <w:rPr>
+          <w:b/>
+          <w:bCs/>
+          <w:color w:val="7030A0"/>
+        </w:rPr>
+        <w:t>Unit Tests:</w:t>
+      </w:r>
+    </w:p>
+    <w:p>
+      <w:pPr>
+        <w:pStyle w:val="ListParagraph"/>
+        <w:numPr>
+          <w:ilvl w:val="1"/>
+          <w:numId w:val="1"/>
+        </w:numPr>
+        <w:rPr>
+          <w:b/>
+          <w:bCs/>
+          <w:noProof/>
+        </w:rPr>
+      </w:pPr>
+      <w:r>
+        <w:rPr>
+          <w:noProof/>
+        </w:rPr>
+        <w:t>Tests that test each individual component in isolation to ensure they work as expected</w:t>
+      </w:r>
+    </w:p>
+    <w:p>
+      <w:pPr>
+        <w:pStyle w:val="ListParagraph"/>
+        <w:rPr>
+          <w:noProof/>
+        </w:rPr>
+      </w:pPr>
+    </w:p>
+    <w:p>
+      <w:pPr>
+        <w:pStyle w:val="ListParagraph"/>
+        <w:numPr>
+          <w:ilvl w:val="1"/>
+          <w:numId w:val="1"/>
+        </w:numPr>
+        <w:rPr>
+          <w:b/>
+          <w:bCs/>
+          <w:noProof/>
+        </w:rPr>
+      </w:pPr>
+      <w:r>
+        <w:rPr>
+          <w:noProof/>
+        </w:rPr>
+        <w:t>Some examples of where I would use this test:</w:t>
+      </w:r>
+    </w:p>
+    <w:p>
+      <w:pPr>
+        <w:pStyle w:val="ListParagraph"/>
+        <w:numPr>
+          <w:ilvl w:val="2"/>
+          <w:numId w:val="1"/>
+        </w:numPr>
+        <w:rPr>
+          <w:b/>
+          <w:bCs/>
+          <w:noProof/>
+        </w:rPr>
+      </w:pPr>
+      <w:r>
+        <w:rPr>
+          <w:noProof/>
+        </w:rPr>
+        <w:t>Test ‘Paddle’ class to ensure it moves correctly based on keyboard input</w:t>
+      </w:r>
+    </w:p>
+    <w:p>
+      <w:pPr>
+        <w:pStyle w:val="ListParagraph"/>
+        <w:numPr>
+          <w:ilvl w:val="2"/>
+          <w:numId w:val="1"/>
+        </w:numPr>
+        <w:rPr>
+          <w:b/>
+          <w:bCs/>
+          <w:noProof/>
+        </w:rPr>
+      </w:pPr>
+      <w:r>
+        <w:rPr>
+          <w:noProof/>
+        </w:rPr>
+        <w:t>Test ‘Ball’ class to ensure it bounces off walls and paddle correctly</w:t>
+      </w:r>
+    </w:p>
+    <w:p>
+      <w:pPr>
+        <w:pStyle w:val="ListParagraph"/>
+        <w:numPr>
+          <w:ilvl w:val="2"/>
+          <w:numId w:val="1"/>
+        </w:numPr>
+        <w:rPr>
+          <w:b/>
+          <w:bCs/>
+          <w:noProof/>
+        </w:rPr>
+      </w:pPr>
+      <w:r>
+        <w:rPr>
+          <w:noProof/>
+        </w:rPr>
+        <w:t>Test ‘Brick’ class to ensure it is removed when hit by ball</w:t>
+      </w:r>
+    </w:p>
+    <w:p>
+      <w:pPr>
+        <w:pStyle w:val="ListParagraph"/>
+        <w:ind w:left="2160"/>
+        <w:rPr>
+          <w:b/>
+          <w:bCs/>
+          <w:noProof/>
+        </w:rPr>
+      </w:pPr>
+    </w:p>
+    <w:p>
+      <w:pPr>
+        <w:pStyle w:val="ListParagraph"/>
+        <w:numPr>
+          <w:ilvl w:val="1"/>
+          <w:numId w:val="1"/>
+        </w:numPr>
+        <w:rPr>
+          <w:noProof/>
+          <w:u w:val="single"/>
+        </w:rPr>
+      </w:pPr>
+      <w:r>
+        <w:rPr>
+          <w:noProof/>
+          <w:u w:val="single"/>
+        </w:rPr>
+        <w:t>For this, will be using Pytest</w:t>
+      </w:r>
+      <w:r>
+        <w:rPr>
+          <w:noProof/>
+          <w:u w:val="single"/>
+        </w:rPr>
+        <w:t xml:space="preserve"> testing framework / library</w:t>
+      </w:r>
+    </w:p>
+    <w:p>
+      <w:pPr>
+        <w:ind w:left="720"/>
+        <w:rPr>
+          <w:noProof/>
+          <w:u w:val="single"/>
+        </w:rPr>
+      </w:pPr>
+    </w:p>
+    <w:p>
+      <w:pPr>
+        <w:ind w:left="1080"/>
+        <w:rPr>
+          <w:b/>
+          <w:bCs/>
+          <w:noProof/>
+        </w:rPr>
+      </w:pPr>
+      <w:r>
+        <w:rPr>
+          <w:b/>
+          <w:bCs/>
+          <w:noProof/>
+        </w:rPr>
+        <w:t>Unit Testing of the Paddle Class:</w:t>
+      </w:r>
+    </w:p>
+    <w:p>
+      <w:pPr>
+        <w:ind w:left="1080"/>
+        <w:rPr>
+          <w:b/>
+          <w:bCs/>
+          <w:noProof/>
+        </w:rPr>
+      </w:pPr>
+      <w:r>
+        <w:rPr>
+          <w:b/>
+          <w:bCs/>
+          <w:noProof/>
+        </w:rPr>
+        <w:tab/>
+      </w:r>
+      <w:r>
+        <w:rPr>
+          <w:b/>
+          <w:bCs/>
+          <w:noProof/>
+        </w:rPr>
+        <w:drawing>
+          <wp:inline distT="0" distB="0" distL="0" distR="0" wp14:anchorId="036694DA" wp14:editId="668A2150">
+            <wp:extent cx="5723890" cy="3233839"/>
+            <wp:effectExtent l="0" t="0" r="0" b="5080"/>
+            <wp:docPr id="1248313968" name="Picture 1" descr="A screen shot of a computer program&#10;&#10;AI-generated content may be incorrect."/>
+            <wp:cNvGraphicFramePr>
+              <a:graphicFrameLocks xmlns:a="http://schemas.openxmlformats.org/drawingml/2006/main" noChangeAspect="1"/>
+            </wp:cNvGraphicFramePr>
+            <a:graphic xmlns:a="http://schemas.openxmlformats.org/drawingml/2006/main">
+              <a:graphicData uri="http://schemas.openxmlformats.org/drawingml/2006/picture">
+                <pic:pic xmlns:pic="http://schemas.openxmlformats.org/drawingml/2006/picture">
+                  <pic:nvPicPr>
+                    <pic:cNvPr id="1248313968" name="Picture 1" descr="A screen shot of a computer program&#10;&#10;AI-generated content may be incorrect."/>
+                    <pic:cNvPicPr/>
+                  </pic:nvPicPr>
+                  <pic:blipFill>
+                    <a:blip r:embed="rId13"/>
+                    <a:stretch>
+                      <a:fillRect/>
+                    </a:stretch>
+                  </pic:blipFill>
+                  <pic:spPr>
+                    <a:xfrm>
+                      <a:off x="0" y="0"/>
+                      <a:ext cx="5729211" cy="3236845"/>
+                    </a:xfrm>
+                    <a:prstGeom prst="rect">
+                      <a:avLst/>
+                    </a:prstGeom>
+                  </pic:spPr>
+                </pic:pic>
+              </a:graphicData>
+            </a:graphic>
+          </wp:inline>
+        </w:drawing>
+      </w:r>
+    </w:p>
+    <w:p>
+      <w:pPr>
+        <w:ind w:left="720"/>
+        <w:rPr>
+          <w:noProof/>
+          <w:u w:val="single"/>
+        </w:rPr>
+      </w:pPr>
+    </w:p>
+    <w:p>
+      <w:pPr>
+        <w:ind w:left="720"/>
+        <w:rPr>
+          <w:b/>
+          <w:bCs/>
+          <w:noProof/>
+        </w:rPr>
+      </w:pPr>
+      <w:r>
+        <w:rPr>
+          <w:b/>
+          <w:bCs/>
+          <w:noProof/>
+        </w:rPr>
+        <w:tab/>
+        <w:t>Results:</w:t>
+      </w:r>
+    </w:p>
+    <w:p>
+      <w:pPr>
+        <w:ind w:left="720"/>
+        <w:rPr>
+          <w:noProof/>
+        </w:rPr>
+      </w:pPr>
+      <w:r>
+        <w:rPr>
+          <w:b/>
+          <w:bCs/>
+          <w:noProof/>
+        </w:rPr>
+        <w:tab/>
+      </w:r>
+      <w:r>
+        <w:rPr>
+          <w:b/>
+          <w:bCs/>
+          <w:noProof/>
+        </w:rPr>
+        <w:tab/>
+      </w:r>
+      <w:r>
+        <w:rPr>
+          <w:b/>
+          <w:bCs/>
+          <w:noProof/>
+        </w:rPr>
+        <w:drawing>
+          <wp:inline distT="0" distB="0" distL="0" distR="0" wp14:anchorId="6AA9DA20" wp14:editId="0B653905">
+            <wp:extent cx="4239217" cy="1019317"/>
+            <wp:effectExtent l="0" t="0" r="9525" b="9525"/>
+            <wp:docPr id="1388927361" name="Picture 1" descr="A screen shot of a computer&#10;&#10;AI-generated content may be incorrect."/>
+            <wp:cNvGraphicFramePr>
+              <a:graphicFrameLocks xmlns:a="http://schemas.openxmlformats.org/drawingml/2006/main" noChangeAspect="1"/>
+            </wp:cNvGraphicFramePr>
+            <a:graphic xmlns:a="http://schemas.openxmlformats.org/drawingml/2006/main">
+              <a:graphicData uri="http://schemas.openxmlformats.org/drawingml/2006/picture">
+                <pic:pic xmlns:pic="http://schemas.openxmlformats.org/drawingml/2006/picture">
+                  <pic:nvPicPr>
+                    <pic:cNvPr id="1388927361" name="Picture 1" descr="A screen shot of a computer&#10;&#10;AI-generated content may be incorrect."/>
+                    <pic:cNvPicPr/>
+                  </pic:nvPicPr>
+                  <pic:blipFill>
+                    <a:blip r:embed="rId14"/>
+                    <a:stretch>
+                      <a:fillRect/>
+                    </a:stretch>
+                  </pic:blipFill>
+                  <pic:spPr>
+                    <a:xfrm>
+                      <a:off x="0" y="0"/>
+                      <a:ext cx="4239217" cy="1019317"/>
+                    </a:xfrm>
+                    <a:prstGeom prst="rect">
+                      <a:avLst/>
+                    </a:prstGeom>
+                  </pic:spPr>
+                </pic:pic>
+              </a:graphicData>
+            </a:graphic>
+          </wp:inline>
+        </w:drawing>
+      </w:r>
+    </w:p>
+    <w:p>
+      <w:pPr>
+        <w:ind w:firstLine="720"/>
+        <w:rPr>
+          <w:b/>
+          <w:bCs/>
+          <w:color w:val="7030A0"/>
+        </w:rPr>
+      </w:pPr>
+    </w:p>
+    <w:p>
+      <w:pPr>
+        <w:ind w:firstLine="720"/>
+        <w:rPr>
+          <w:b/>
+          <w:bCs/>
+          <w:color w:val="7030A0"/>
+        </w:rPr>
+      </w:pPr>
+    </w:p>
+    <w:p>
+      <w:pPr>
+        <w:ind w:firstLine="720"/>
+        <w:rPr>
+          <w:b/>
+          <w:bCs/>
+          <w:color w:val="7030A0"/>
+        </w:rPr>
+      </w:pPr>
+    </w:p>
+    <w:p>
+      <w:pPr>
+        <w:ind w:firstLine="720"/>
+        <w:rPr>
+          <w:b/>
+          <w:bCs/>
+          <w:color w:val="7030A0"/>
+        </w:rPr>
+      </w:pPr>
+    </w:p>
+    <w:p>
+      <w:pPr>
+        <w:ind w:firstLine="720"/>
+        <w:rPr>
+          <w:b/>
+          <w:bCs/>
+          <w:color w:val="7030A0"/>
+        </w:rPr>
+      </w:pPr>
+      <w:r>
+        <w:rPr>
+          <w:b/>
+          <w:bCs/>
+          <w:color w:val="7030A0"/>
+        </w:rPr>
+        <w:lastRenderedPageBreak/>
+        <w:t>Integration Tests:</w:t>
+      </w:r>
+    </w:p>
+    <w:p>
+      <w:pPr>
+        <w:pStyle w:val="ListParagraph"/>
+        <w:numPr>
+          <w:ilvl w:val="1"/>
+          <w:numId w:val="1"/>
+        </w:numPr>
+        <w:rPr>
+          <w:b/>
+          <w:bCs/>
+          <w:noProof/>
+        </w:rPr>
+      </w:pPr>
+      <w:r>
+        <w:rPr>
+          <w:noProof/>
+        </w:rPr>
+        <w:t>Test</w:t>
+      </w:r>
+      <w:r>
+        <w:rPr>
+          <w:noProof/>
+        </w:rPr>
+        <w:t>ing how different components and objects of the game work together</w:t>
+      </w:r>
+    </w:p>
+    <w:p>
+      <w:pPr>
+        <w:pStyle w:val="ListParagraph"/>
+        <w:ind w:left="1440"/>
+        <w:rPr>
+          <w:b/>
+          <w:bCs/>
+          <w:noProof/>
+        </w:rPr>
+      </w:pPr>
+    </w:p>
+    <w:p>
+      <w:pPr>
+        <w:pStyle w:val="ListParagraph"/>
+        <w:numPr>
+          <w:ilvl w:val="1"/>
+          <w:numId w:val="1"/>
+        </w:numPr>
+        <w:rPr>
+          <w:b/>
+          <w:bCs/>
+          <w:noProof/>
+        </w:rPr>
+      </w:pPr>
+      <w:r>
+        <w:rPr>
+          <w:noProof/>
+        </w:rPr>
+        <w:t>Some examples of where I would use this test:</w:t>
+      </w:r>
+    </w:p>
+    <w:p>
+      <w:pPr>
+        <w:pStyle w:val="ListParagraph"/>
+        <w:numPr>
+          <w:ilvl w:val="2"/>
+          <w:numId w:val="1"/>
+        </w:numPr>
+        <w:rPr>
+          <w:b/>
+          <w:bCs/>
+          <w:noProof/>
+        </w:rPr>
+      </w:pPr>
+      <w:r>
+        <w:rPr>
+          <w:noProof/>
+        </w:rPr>
+        <w:t>Testing interaction between ‘Ball’ and ‘Paddle’ objects, ensuring ball bounces correctly when it hits paddle</w:t>
+      </w:r>
+    </w:p>
+    <w:p>
+      <w:pPr>
+        <w:pStyle w:val="ListParagraph"/>
+        <w:numPr>
+          <w:ilvl w:val="2"/>
+          <w:numId w:val="1"/>
+        </w:numPr>
+        <w:rPr>
+          <w:b/>
+          <w:bCs/>
+          <w:noProof/>
+        </w:rPr>
+      </w:pPr>
+      <w:r>
+        <w:rPr>
+          <w:noProof/>
+        </w:rPr>
+        <w:t>Testing interaction between ‘Ball’ and ‘Brick’ objects, ensuring bricks are removed and score updated when a brick is hit</w:t>
+      </w:r>
+    </w:p>
+    <w:p>
+      <w:pPr>
+        <w:pStyle w:val="ListParagraph"/>
+        <w:ind w:left="2160"/>
+        <w:rPr>
+          <w:b/>
+          <w:bCs/>
+          <w:noProof/>
+        </w:rPr>
+      </w:pPr>
+    </w:p>
+    <w:p>
+      <w:pPr>
+        <w:pStyle w:val="ListParagraph"/>
+        <w:numPr>
+          <w:ilvl w:val="1"/>
+          <w:numId w:val="1"/>
+        </w:numPr>
+        <w:rPr>
+          <w:b/>
+          <w:bCs/>
+          <w:noProof/>
+        </w:rPr>
+      </w:pPr>
+      <w:r>
+        <w:rPr>
+          <w:noProof/>
+          <w:u w:val="single"/>
+        </w:rPr>
+        <w:t>For this, will be using same testing frameworks as unit tests, but mainly focusing on interactions between components</w:t>
+      </w:r>
+    </w:p>
+    <w:p>
+      <w:pPr>
+        <w:ind w:left="1080"/>
+        <w:rPr>
+          <w:b/>
+          <w:bCs/>
+          <w:noProof/>
+        </w:rPr>
+      </w:pPr>
+    </w:p>
+    <w:p>
+      <w:pPr>
+        <w:ind w:left="1080"/>
+        <w:rPr>
+          <w:noProof/>
+        </w:rPr>
+      </w:pPr>
+    </w:p>
+    <w:p>
+      <w:pPr>
+        <w:ind w:firstLine="720"/>
+        <w:rPr>
+          <w:b/>
+          <w:bCs/>
+          <w:color w:val="7030A0"/>
+        </w:rPr>
+      </w:pPr>
+      <w:r>
+        <w:rPr>
+          <w:b/>
+          <w:bCs/>
+          <w:color w:val="7030A0"/>
+        </w:rPr>
+        <w:t xml:space="preserve">System </w:t>
+      </w:r>
+      <w:r>
+        <w:rPr>
+          <w:b/>
+          <w:bCs/>
+          <w:color w:val="7030A0"/>
+        </w:rPr>
+        <w:t>Tests:</w:t>
+      </w:r>
+    </w:p>
+    <w:p>
+      <w:pPr>
+        <w:pStyle w:val="ListParagraph"/>
+        <w:numPr>
+          <w:ilvl w:val="1"/>
+          <w:numId w:val="1"/>
+        </w:numPr>
+        <w:rPr>
+          <w:b/>
+          <w:bCs/>
+          <w:noProof/>
+        </w:rPr>
+      </w:pPr>
+      <w:r>
+        <w:rPr>
+          <w:noProof/>
+        </w:rPr>
+        <w:t>Tests the game as a whole, ensuring it meets requirements and behaves correctly in real-world scenarios</w:t>
+      </w:r>
+    </w:p>
+    <w:p>
+      <w:pPr>
+        <w:pStyle w:val="ListParagraph"/>
+        <w:rPr>
+          <w:noProof/>
+        </w:rPr>
+      </w:pPr>
+    </w:p>
+    <w:p>
+      <w:pPr>
+        <w:pStyle w:val="ListParagraph"/>
+        <w:numPr>
+          <w:ilvl w:val="1"/>
+          <w:numId w:val="1"/>
+        </w:numPr>
+        <w:rPr>
+          <w:b/>
+          <w:bCs/>
+          <w:noProof/>
+        </w:rPr>
+      </w:pPr>
+      <w:r>
+        <w:rPr>
+          <w:noProof/>
+        </w:rPr>
+        <w:t>Some examples of where I would use this test:</w:t>
+      </w:r>
+    </w:p>
+    <w:p>
+      <w:pPr>
+        <w:pStyle w:val="ListParagraph"/>
+        <w:rPr>
+          <w:b/>
+          <w:bCs/>
+          <w:noProof/>
+        </w:rPr>
+      </w:pPr>
+    </w:p>
+    <w:p>
+      <w:pPr>
+        <w:pStyle w:val="ListParagraph"/>
+        <w:numPr>
+          <w:ilvl w:val="2"/>
+          <w:numId w:val="1"/>
+        </w:numPr>
+        <w:rPr>
+          <w:b/>
+          <w:bCs/>
+          <w:noProof/>
+        </w:rPr>
+      </w:pPr>
+      <w:r>
+        <w:rPr>
+          <w:noProof/>
+        </w:rPr>
+        <w:t>Testing game loop to ensure it runs smoothly, handles events like quitting, pausing, restarting</w:t>
+      </w:r>
+    </w:p>
+    <w:p>
+      <w:pPr>
+        <w:pStyle w:val="ListParagraph"/>
+        <w:numPr>
+          <w:ilvl w:val="2"/>
+          <w:numId w:val="1"/>
+        </w:numPr>
+        <w:rPr>
+          <w:b/>
+          <w:bCs/>
+          <w:noProof/>
+        </w:rPr>
+      </w:pPr>
+      <w:r>
+        <w:rPr>
+          <w:noProof/>
+        </w:rPr>
+        <w:t>Test game’s response to user input (E.g. Moving paddle, Starting new level)</w:t>
+      </w:r>
+    </w:p>
+    <w:p>
+      <w:pPr>
+        <w:rPr>
+          <w:b/>
+          <w:bCs/>
+          <w:noProof/>
+        </w:rPr>
+      </w:pPr>
+    </w:p>
+    <w:p>
+      <w:pPr>
+        <w:pStyle w:val="ListParagraph"/>
+        <w:numPr>
+          <w:ilvl w:val="1"/>
+          <w:numId w:val="1"/>
+        </w:numPr>
+        <w:rPr>
+          <w:b/>
+          <w:bCs/>
+          <w:noProof/>
+        </w:rPr>
+      </w:pPr>
+      <w:r>
+        <w:rPr>
+          <w:noProof/>
+          <w:u w:val="single"/>
+        </w:rPr>
+        <w:t>For this, will probably be doing manual testing, through automated UI testing tools such as PyAuto</w:t>
+      </w:r>
+      <w:r>
+        <w:rPr>
+          <w:noProof/>
+          <w:u w:val="single"/>
+        </w:rPr>
+        <w:t>G</w:t>
+      </w:r>
+      <w:r>
+        <w:rPr>
+          <w:noProof/>
+          <w:u w:val="single"/>
+        </w:rPr>
+        <w:t>UI are also out there for use</w:t>
+      </w:r>
+    </w:p>
+    <w:p>
+      <w:pPr>
+        <w:rPr>
+          <w:b/>
+          <w:bCs/>
+          <w:noProof/>
+        </w:rPr>
+      </w:pPr>
+    </w:p>
+    <w:p>
+      <w:pPr>
+        <w:rPr>
+          <w:b/>
+          <w:bCs/>
+          <w:noProof/>
+        </w:rPr>
+      </w:pPr>
+    </w:p>
+    <w:p>
+      <w:pPr>
+        <w:ind w:left="720"/>
+        <w:rPr>
+          <w:b/>
+          <w:bCs/>
+          <w:color w:val="7030A0"/>
+        </w:rPr>
+      </w:pPr>
+      <w:r>
+        <w:rPr>
+          <w:b/>
+          <w:bCs/>
+          <w:color w:val="7030A0"/>
+        </w:rPr>
+        <w:t>Documenting Test Results</w:t>
+      </w:r>
+      <w:r>
+        <w:rPr>
+          <w:b/>
+          <w:bCs/>
+          <w:color w:val="7030A0"/>
+        </w:rPr>
+        <w:t>:</w:t>
+      </w:r>
+    </w:p>
+    <w:p>
+      <w:pPr>
+        <w:pStyle w:val="ListParagraph"/>
+        <w:numPr>
+          <w:ilvl w:val="1"/>
+          <w:numId w:val="1"/>
+        </w:numPr>
+        <w:rPr>
+          <w:b/>
+          <w:bCs/>
+          <w:noProof/>
+        </w:rPr>
+      </w:pPr>
+      <w:r>
+        <w:rPr>
+          <w:noProof/>
+        </w:rPr>
+        <w:t>To document, will be creating a Test Report that</w:t>
+      </w:r>
+      <w:r>
+        <w:rPr>
+          <w:noProof/>
+        </w:rPr>
+        <w:t xml:space="preserve"> follows</w:t>
+      </w:r>
+      <w:r>
+        <w:rPr>
+          <w:noProof/>
+        </w:rPr>
+        <w:t xml:space="preserve"> the same style as a normal report, including:</w:t>
+      </w:r>
+    </w:p>
+    <w:p>
+      <w:pPr>
+        <w:pStyle w:val="ListParagraph"/>
+        <w:numPr>
+          <w:ilvl w:val="2"/>
+          <w:numId w:val="1"/>
+        </w:numPr>
+        <w:rPr>
+          <w:b/>
+          <w:bCs/>
+          <w:noProof/>
+        </w:rPr>
+      </w:pPr>
+      <w:r>
+        <w:rPr>
+          <w:noProof/>
+        </w:rPr>
+        <w:t>Test environment used (Eg. Pytest)</w:t>
+      </w:r>
+      <w:r>
+        <w:rPr>
+          <w:noProof/>
+        </w:rPr>
+        <w:t>, and also version of Python &amp; Pygame used</w:t>
+      </w:r>
+    </w:p>
+    <w:p>
+      <w:pPr>
+        <w:pStyle w:val="ListParagraph"/>
+        <w:numPr>
+          <w:ilvl w:val="2"/>
+          <w:numId w:val="1"/>
+        </w:numPr>
+        <w:rPr>
+          <w:b/>
+          <w:bCs/>
+          <w:noProof/>
+        </w:rPr>
+      </w:pPr>
+      <w:r>
+        <w:rPr>
+          <w:noProof/>
+        </w:rPr>
+        <w:t xml:space="preserve">All test cases used </w:t>
+      </w:r>
+    </w:p>
+    <w:p>
+      <w:pPr>
+        <w:pStyle w:val="ListParagraph"/>
+        <w:numPr>
+          <w:ilvl w:val="2"/>
+          <w:numId w:val="1"/>
+        </w:numPr>
+        <w:rPr>
+          <w:b/>
+          <w:bCs/>
+          <w:noProof/>
+        </w:rPr>
+      </w:pPr>
+      <w:r>
+        <w:rPr>
+          <w:noProof/>
+        </w:rPr>
+        <w:t>Summary of results and any issues and bugs found</w:t>
+      </w:r>
+    </w:p>
+    <w:p>
+      <w:pPr>
+        <w:rPr>
+          <w:b/>
+          <w:bCs/>
+          <w:noProof/>
+        </w:rPr>
+      </w:pPr>
+    </w:p>
+    <w:p>
+      <w:pPr>
+        <w:ind w:left="720"/>
+        <w:rPr>
+          <w:b/>
+          <w:bCs/>
+          <w:color w:val="7030A0"/>
+        </w:rPr>
+      </w:pPr>
+      <w:r>
+        <w:rPr>
+          <w:b/>
+          <w:bCs/>
+          <w:color w:val="7030A0"/>
+        </w:rPr>
+        <w:t>Justifying Design Choices:</w:t>
+      </w:r>
+    </w:p>
+    <w:p>
+      <w:pPr>
+        <w:pStyle w:val="ListParagraph"/>
+        <w:numPr>
+          <w:ilvl w:val="1"/>
+          <w:numId w:val="1"/>
+        </w:numPr>
+        <w:rPr>
+          <w:b/>
+          <w:bCs/>
+          <w:noProof/>
+        </w:rPr>
+      </w:pPr>
+      <w:r>
+        <w:rPr>
+          <w:noProof/>
+        </w:rPr>
+        <w:t>Use object-oriented programming as tne encapsulation of game objects ensures each component behaves independently and predictably, and make it easy to modify and extend functionality, which contributes significantly to reliability and maintainability</w:t>
+      </w:r>
+    </w:p>
+    <w:p>
+      <w:pPr>
+        <w:rPr>
+          <w:b/>
+          <w:bCs/>
+          <w:noProof/>
+        </w:rPr>
+      </w:pPr>
+    </w:p>
+    <w:p>
+      <w:pPr>
+        <w:pStyle w:val="ListParagraph"/>
+        <w:numPr>
+          <w:ilvl w:val="1"/>
+          <w:numId w:val="1"/>
+        </w:numPr>
+        <w:rPr>
+          <w:b/>
+          <w:bCs/>
+          <w:noProof/>
+        </w:rPr>
+      </w:pPr>
+      <w:r>
+        <w:rPr>
+          <w:noProof/>
+        </w:rPr>
+        <w:t>When error handling, use edge cases to ensure smooth gameplay which improves reliability, and also clear and concise logic is used which makes it easy to identify and fix issues, improving maintainability</w:t>
+      </w:r>
+    </w:p>
+    <w:p>
+      <w:pPr>
+        <w:pStyle w:val="ListParagraph"/>
+        <w:rPr>
+          <w:b/>
+          <w:bCs/>
+          <w:noProof/>
+        </w:rPr>
+      </w:pPr>
+    </w:p>
+    <w:p>
+      <w:pPr>
+        <w:rPr>
+          <w:b/>
+          <w:bCs/>
+          <w:color w:val="00B050"/>
+          <w:u w:val="single"/>
+        </w:rPr>
+      </w:pPr>
+      <w:r>
+        <w:rPr>
+          <w:b/>
+          <w:bCs/>
+          <w:color w:val="00B050"/>
+          <w:u w:val="single"/>
+        </w:rPr>
+        <w:lastRenderedPageBreak/>
+        <w:t>Section</w:t>
+      </w:r>
+      <w:r>
+        <w:rPr>
+          <w:b/>
+          <w:bCs/>
+          <w:color w:val="00B050"/>
+          <w:u w:val="single"/>
+        </w:rPr>
+        <w:t xml:space="preserve"> 7: </w:t>
+      </w:r>
+      <w:r>
+        <w:rPr>
+          <w:b/>
+          <w:bCs/>
+          <w:color w:val="00B050"/>
+          <w:u w:val="single"/>
+        </w:rPr>
+        <w:t>Additional Design Considerations</w:t>
+      </w:r>
+    </w:p>
+    <w:p>
+      <w:pPr>
+        <w:rPr>
+          <w:color w:val="FF0000"/>
+        </w:rPr>
+      </w:pPr>
+      <w:r>
+        <w:rPr>
+          <w:color w:val="FF0000"/>
+        </w:rPr>
+        <w:t>Briefly mention</w:t>
+      </w:r>
+      <w:r>
+        <w:rPr>
+          <w:color w:val="FF0000"/>
+        </w:rPr>
+        <w:t xml:space="preserve"> any ethical or legal issues relevant to your game design (E.g. Use of copyrighted assets, fair gameplay) </w:t>
+      </w:r>
+    </w:p>
+    <w:p>
+      <w:pPr>
+        <w:pStyle w:val="ListParagraph"/>
+        <w:numPr>
+          <w:ilvl w:val="0"/>
+          <w:numId w:val="1"/>
+        </w:numPr>
+      </w:pPr>
+      <w:r>
+        <w:t xml:space="preserve">Ensure that all assets used are either original, or are properly licensed, allowing </w:t>
+      </w:r>
+      <w:r>
+        <w:t xml:space="preserve">the ability </w:t>
+      </w:r>
+      <w:r>
+        <w:t>to avoid copyright infringement</w:t>
+      </w:r>
+    </w:p>
+    <w:p/>
+    <w:p>
+      <w:pPr>
+        <w:pStyle w:val="ListParagraph"/>
+        <w:numPr>
+          <w:ilvl w:val="0"/>
+          <w:numId w:val="1"/>
+        </w:numPr>
+      </w:pPr>
+      <w:r>
+        <w:t>Game is d</w:t>
+      </w:r>
+      <w:r>
+        <w:t>esigned the game to be fair and accessible, avoiding exploitative mechanics like play-to-win, and avoid any excessive difficulty spikes with progressive levelling mechanisms, ensuring fair gameplay</w:t>
+      </w:r>
+    </w:p>
+    <w:p>
+      <w:pPr>
+        <w:rPr>
+          <w:color w:val="FF0000"/>
+        </w:rPr>
+      </w:pPr>
+    </w:p>
+    <w:p>
+      <w:pPr>
+        <w:rPr>
+          <w:color w:val="FF0000"/>
+        </w:rPr>
+      </w:pPr>
+    </w:p>
+    <w:p>
+      <w:pPr>
+        <w:rPr>
+          <w:color w:val="FF0000"/>
+        </w:rPr>
+      </w:pPr>
+      <w:r>
+        <w:rPr>
+          <w:color w:val="FF0000"/>
+        </w:rPr>
+        <w:t xml:space="preserve">Reflect on </w:t>
+      </w:r>
+      <w:r>
+        <w:rPr>
+          <w:color w:val="FF0000"/>
+        </w:rPr>
+        <w:t xml:space="preserve">why you chose your </w:t>
+      </w:r>
+      <w:r>
+        <w:rPr>
+          <w:color w:val="FF0000"/>
+        </w:rPr>
+        <w:t>design</w:t>
+      </w:r>
+      <w:r>
+        <w:rPr>
+          <w:color w:val="FF0000"/>
+        </w:rPr>
+        <w:t xml:space="preserve"> over alternative approaches and how your design facilitates future improvements or debugging.</w:t>
+      </w:r>
+    </w:p>
+    <w:p>
+      <w:pPr>
+        <w:pStyle w:val="ListParagraph"/>
+        <w:numPr>
+          <w:ilvl w:val="0"/>
+          <w:numId w:val="1"/>
+        </w:numPr>
+        <w:rPr>
+          <w:noProof/>
+        </w:rPr>
+      </w:pPr>
+      <w:r>
+        <w:rPr>
+          <w:noProof/>
+        </w:rPr>
+        <w:t>The object oriented design was chosen mainly for the modularity and clarity, which makes it easier to manage and extend compared to procedural approach</w:t>
+      </w:r>
+    </w:p>
+    <w:p>
+      <w:pPr>
+        <w:rPr>
+          <w:noProof/>
+        </w:rPr>
+      </w:pPr>
+    </w:p>
+    <w:p>
+      <w:pPr>
+        <w:pStyle w:val="ListParagraph"/>
+        <w:numPr>
+          <w:ilvl w:val="0"/>
+          <w:numId w:val="1"/>
+        </w:numPr>
+        <w:rPr>
+          <w:noProof/>
+        </w:rPr>
+      </w:pPr>
+      <w:r>
+        <w:rPr>
+          <w:noProof/>
+        </w:rPr>
+        <w:t>The separation of concerns, and the use of constants which facilitate debugging and future updates (Eg. Adding new levels, Adding new power-ups), without disrupting the existing functionality of the game</w:t>
+      </w:r>
+    </w:p>
     <w:sectPr>
       <w:pgSz w:w="11906" w:h="16838"/>
       <w:pgMar w:top="720" w:right="720" w:bottom="720" w:left="720" w:header="708" w:footer="708" w:gutter="0"/>
@@ -4594,6 +6522,155 @@
     </w:lvl>
   </w:abstractNum>
   <w:abstractNum w:abstractNumId="2" w15:restartNumberingAfterBreak="0">
+    <w:nsid w:val="2FA10181"/>
+    <w:multiLevelType w:val="multilevel"/>
+    <w:tmpl w:val="E11ED782"/>
+    <w:lvl w:ilvl="0">
+      <w:start w:val="1"/>
+      <w:numFmt w:val="bullet"/>
+      <w:lvlText w:val=""/>
+      <w:lvlJc w:val="left"/>
+      <w:pPr>
+        <w:tabs>
+          <w:tab w:val="num" w:pos="720"/>
+        </w:tabs>
+        <w:ind w:left="720" w:hanging="360"/>
+      </w:pPr>
+      <w:rPr>
+        <w:rFonts w:ascii="Symbol" w:hAnsi="Symbol" w:hint="default"/>
+        <w:sz w:val="20"/>
+      </w:rPr>
+    </w:lvl>
+    <w:lvl w:ilvl="1" w:tentative="1">
+      <w:start w:val="1"/>
+      <w:numFmt w:val="bullet"/>
+      <w:lvlText w:val="o"/>
+      <w:lvlJc w:val="left"/>
+      <w:pPr>
+        <w:tabs>
+          <w:tab w:val="num" w:pos="1440"/>
+        </w:tabs>
+        <w:ind w:left="1440" w:hanging="360"/>
+      </w:pPr>
+      <w:rPr>
+        <w:rFonts w:ascii="Courier New" w:hAnsi="Courier New" w:hint="default"/>
+        <w:sz w:val="20"/>
+      </w:rPr>
+    </w:lvl>
+    <w:lvl w:ilvl="2" w:tentative="1">
+      <w:start w:val="1"/>
+      <w:numFmt w:val="bullet"/>
+      <w:lvlText w:val=""/>
+      <w:lvlJc w:val="left"/>
+      <w:pPr>
+        <w:tabs>
+          <w:tab w:val="num" w:pos="2160"/>
+        </w:tabs>
+        <w:ind w:left="2160" w:hanging="360"/>
+      </w:pPr>
+      <w:rPr>
+        <w:rFonts w:ascii="Wingdings" w:hAnsi="Wingdings" w:hint="default"/>
+        <w:sz w:val="20"/>
+      </w:rPr>
+    </w:lvl>
+    <w:lvl w:ilvl="3" w:tentative="1">
+      <w:start w:val="1"/>
+      <w:numFmt w:val="bullet"/>
+      <w:lvlText w:val=""/>
+      <w:lvlJc w:val="left"/>
+      <w:pPr>
+        <w:tabs>
+          <w:tab w:val="num" w:pos="2880"/>
+        </w:tabs>
+        <w:ind w:left="2880" w:hanging="360"/>
+      </w:pPr>
+      <w:rPr>
+        <w:rFonts w:ascii="Wingdings" w:hAnsi="Wingdings" w:hint="default"/>
+        <w:sz w:val="20"/>
+      </w:rPr>
+    </w:lvl>
+    <w:lvl w:ilvl="4" w:tentative="1">
+      <w:start w:val="1"/>
+      <w:numFmt w:val="bullet"/>
+      <w:lvlText w:val=""/>
+      <w:lvlJc w:val="left"/>
+      <w:pPr>
+        <w:tabs>
+          <w:tab w:val="num" w:pos="3600"/>
+        </w:tabs>
+        <w:ind w:left="3600" w:hanging="360"/>
+      </w:pPr>
+      <w:rPr>
+        <w:rFonts w:ascii="Wingdings" w:hAnsi="Wingdings" w:hint="default"/>
+        <w:sz w:val="20"/>
+      </w:rPr>
+    </w:lvl>
+    <w:lvl w:ilvl="5" w:tentative="1">
+      <w:start w:val="1"/>
+      <w:numFmt w:val="bullet"/>
+      <w:lvlText w:val=""/>
+      <w:lvlJc w:val="left"/>
+      <w:pPr>
+        <w:tabs>
+          <w:tab w:val="num" w:pos="4320"/>
+        </w:tabs>
+        <w:ind w:left="4320" w:hanging="360"/>
+      </w:pPr>
+      <w:rPr>
+        <w:rFonts w:ascii="Wingdings" w:hAnsi="Wingdings" w:hint="default"/>
+        <w:sz w:val="20"/>
+      </w:rPr>
+    </w:lvl>
+    <w:lvl w:ilvl="6" w:tentative="1">
+      <w:start w:val="1"/>
+      <w:numFmt w:val="bullet"/>
+      <w:lvlText w:val=""/>
+      <w:lvlJc w:val="left"/>
+      <w:pPr>
+        <w:tabs>
+          <w:tab w:val="num" w:pos="5040"/>
+        </w:tabs>
+        <w:ind w:left="5040" w:hanging="360"/>
+      </w:pPr>
+      <w:rPr>
+        <w:rFonts w:ascii="Wingdings" w:hAnsi="Wingdings" w:hint="default"/>
+        <w:sz w:val="20"/>
+      </w:rPr>
+    </w:lvl>
+    <w:lvl w:ilvl="7" w:tentative="1">
+      <w:start w:val="1"/>
+      <w:numFmt w:val="bullet"/>
+      <w:lvlText w:val=""/>
+      <w:lvlJc w:val="left"/>
+      <w:pPr>
+        <w:tabs>
+          <w:tab w:val="num" w:pos="5760"/>
+        </w:tabs>
+        <w:ind w:left="5760" w:hanging="360"/>
+      </w:pPr>
+      <w:rPr>
+        <w:rFonts w:ascii="Wingdings" w:hAnsi="Wingdings" w:hint="default"/>
+        <w:sz w:val="20"/>
+      </w:rPr>
+    </w:lvl>
+    <w:lvl w:ilvl="8" w:tentative="1">
+      <w:start w:val="1"/>
+      <w:numFmt w:val="bullet"/>
+      <w:lvlText w:val=""/>
+      <w:lvlJc w:val="left"/>
+      <w:pPr>
+        <w:tabs>
+          <w:tab w:val="num" w:pos="6480"/>
+        </w:tabs>
+        <w:ind w:left="6480" w:hanging="360"/>
+      </w:pPr>
+      <w:rPr>
+        <w:rFonts w:ascii="Wingdings" w:hAnsi="Wingdings" w:hint="default"/>
+        <w:sz w:val="20"/>
+      </w:rPr>
+    </w:lvl>
+  </w:abstractNum>
+  <w:abstractNum w:abstractNumId="3" w15:restartNumberingAfterBreak="0">
     <w:nsid w:val="46637D20"/>
     <w:multiLevelType w:val="hybridMultilevel"/>
     <w:tmpl w:val="9B78E758"/>
@@ -4682,7 +6759,7 @@
       </w:pPr>
     </w:lvl>
   </w:abstractNum>
-  <w:abstractNum w:abstractNumId="3" w15:restartNumberingAfterBreak="0">
+  <w:abstractNum w:abstractNumId="4" w15:restartNumberingAfterBreak="0">
     <w:nsid w:val="612E6F7E"/>
     <w:multiLevelType w:val="hybridMultilevel"/>
     <w:tmpl w:val="E0AA8142"/>
@@ -4771,7 +6848,7 @@
       </w:pPr>
     </w:lvl>
   </w:abstractNum>
-  <w:abstractNum w:abstractNumId="4" w15:restartNumberingAfterBreak="0">
+  <w:abstractNum w:abstractNumId="5" w15:restartNumberingAfterBreak="0">
     <w:nsid w:val="7B4A143C"/>
     <w:multiLevelType w:val="hybridMultilevel"/>
     <w:tmpl w:val="9EA487DC"/>
@@ -4864,16 +6941,19 @@
     <w:abstractNumId w:val="0"/>
   </w:num>
   <w:num w:numId="2" w16cid:durableId="1353416424">
-    <w:abstractNumId w:val="2"/>
+    <w:abstractNumId w:val="3"/>
   </w:num>
   <w:num w:numId="3" w16cid:durableId="1070155739">
     <w:abstractNumId w:val="1"/>
   </w:num>
   <w:num w:numId="4" w16cid:durableId="508519872">
+    <w:abstractNumId w:val="5"/>
+  </w:num>
+  <w:num w:numId="5" w16cid:durableId="1240289184">
     <w:abstractNumId w:val="4"/>
   </w:num>
-  <w:num w:numId="5" w16cid:durableId="1240289184">
-    <w:abstractNumId w:val="3"/>
+  <w:num w:numId="6" w16cid:durableId="288635108">
+    <w:abstractNumId w:val="2"/>
   </w:num>
 </w:numbering>
 </file>
@@ -5481,7 +7561,6 @@
   <w:style w:type="character" w:default="1" w:styleId="DefaultParagraphFont">
     <w:name w:val="Default Paragraph Font"/>
     <w:uiPriority w:val="1"/>
-    <w:semiHidden/>
     <w:unhideWhenUsed/>
   </w:style>
   <w:style w:type="table" w:default="1" w:styleId="TableNormal">

</xml_diff>

<commit_message>
Finished and submitted Deliverable 3, where it is a prototype, is saved in the prototype folder.
</commit_message>
<xml_diff>
--- a/Brick Blitz Documentation - Berkay Topal.docx
+++ b/Brick Blitz Documentation - Berkay Topal.docx
@@ -3359,7 +3359,27 @@
           <w:color w:val="00B050"/>
           <w:u w:val="single"/>
         </w:rPr>
-        <w:t>Section 3: Flow Chart For An Algorithm</w:t>
+        <w:t xml:space="preserve">Section 3: Flow Chart </w:t>
+      </w:r>
+      <w:proofErr w:type="gramStart"/>
+      <w:r>
+        <w:rPr>
+          <w:b/>
+          <w:bCs/>
+          <w:color w:val="00B050"/>
+          <w:u w:val="single"/>
+        </w:rPr>
+        <w:t>For</w:t>
+      </w:r>
+      <w:proofErr w:type="gramEnd"/>
+      <w:r>
+        <w:rPr>
+          <w:b/>
+          <w:bCs/>
+          <w:color w:val="00B050"/>
+          <w:u w:val="single"/>
+        </w:rPr>
+        <w:t xml:space="preserve"> An Algorithm</w:t>
       </w:r>
     </w:p>
     <w:p>
@@ -4636,16 +4656,7 @@
           <w:u w:val="single"/>
         </w:rPr>
         <w:lastRenderedPageBreak/>
-        <w:t>Section</w:t>
-      </w:r>
-      <w:r>
-        <w:rPr>
-          <w:b/>
-          <w:bCs/>
-          <w:color w:val="00B050"/>
-          <w:u w:val="single"/>
-        </w:rPr>
-        <w:t xml:space="preserve"> 6: Design Decisions – Error Handling and Testing Strategies</w:t>
+        <w:t>Section 6: Design Decisions – Error Handling and Testing Strategies</w:t>
       </w:r>
     </w:p>
     <w:p>
@@ -6306,6 +6317,802 @@
           <w:noProof/>
         </w:rPr>
         <w:t>The separation of concerns, and the use of constants which facilitate debugging and future updates (Eg. Adding new levels, Adding new power-ups), without disrupting the existing functionality of the game</w:t>
+      </w:r>
+    </w:p>
+    <w:p>
+      <w:pPr>
+        <w:pStyle w:val="ListParagraph"/>
+        <w:rPr>
+          <w:noProof/>
+        </w:rPr>
+      </w:pPr>
+    </w:p>
+    <w:p>
+      <w:pPr>
+        <w:rPr>
+          <w:noProof/>
+        </w:rPr>
+      </w:pPr>
+    </w:p>
+    <w:p>
+      <w:pPr>
+        <w:rPr>
+          <w:noProof/>
+        </w:rPr>
+      </w:pPr>
+    </w:p>
+    <w:p>
+      <w:pPr>
+        <w:rPr>
+          <w:noProof/>
+        </w:rPr>
+      </w:pPr>
+    </w:p>
+    <w:p>
+      <w:pPr>
+        <w:rPr>
+          <w:noProof/>
+        </w:rPr>
+      </w:pPr>
+    </w:p>
+    <w:p>
+      <w:pPr>
+        <w:rPr>
+          <w:noProof/>
+        </w:rPr>
+      </w:pPr>
+    </w:p>
+    <w:p>
+      <w:pPr>
+        <w:rPr>
+          <w:noProof/>
+        </w:rPr>
+      </w:pPr>
+    </w:p>
+    <w:p>
+      <w:pPr>
+        <w:rPr>
+          <w:noProof/>
+        </w:rPr>
+      </w:pPr>
+    </w:p>
+    <w:p>
+      <w:pPr>
+        <w:rPr>
+          <w:noProof/>
+        </w:rPr>
+      </w:pPr>
+    </w:p>
+    <w:p>
+      <w:pPr>
+        <w:rPr>
+          <w:noProof/>
+        </w:rPr>
+      </w:pPr>
+    </w:p>
+    <w:p>
+      <w:pPr>
+        <w:rPr>
+          <w:noProof/>
+        </w:rPr>
+      </w:pPr>
+    </w:p>
+    <w:p>
+      <w:pPr>
+        <w:rPr>
+          <w:noProof/>
+        </w:rPr>
+      </w:pPr>
+    </w:p>
+    <w:p>
+      <w:pPr>
+        <w:rPr>
+          <w:noProof/>
+        </w:rPr>
+      </w:pPr>
+    </w:p>
+    <w:p>
+      <w:pPr>
+        <w:rPr>
+          <w:noProof/>
+        </w:rPr>
+      </w:pPr>
+    </w:p>
+    <w:p>
+      <w:pPr>
+        <w:rPr>
+          <w:noProof/>
+        </w:rPr>
+      </w:pPr>
+    </w:p>
+    <w:p>
+      <w:pPr>
+        <w:rPr>
+          <w:noProof/>
+        </w:rPr>
+      </w:pPr>
+    </w:p>
+    <w:p>
+      <w:pPr>
+        <w:rPr>
+          <w:noProof/>
+        </w:rPr>
+      </w:pPr>
+    </w:p>
+    <w:p>
+      <w:pPr>
+        <w:rPr>
+          <w:noProof/>
+        </w:rPr>
+      </w:pPr>
+    </w:p>
+    <w:p>
+      <w:pPr>
+        <w:rPr>
+          <w:noProof/>
+        </w:rPr>
+      </w:pPr>
+    </w:p>
+    <w:p>
+      <w:pPr>
+        <w:rPr>
+          <w:noProof/>
+        </w:rPr>
+      </w:pPr>
+    </w:p>
+    <w:p>
+      <w:pPr>
+        <w:rPr>
+          <w:b/>
+          <w:bCs/>
+          <w:color w:val="00B0F0"/>
+          <w:sz w:val="40"/>
+          <w:szCs w:val="40"/>
+          <w:u w:val="single"/>
+        </w:rPr>
+      </w:pPr>
+      <w:r>
+        <w:rPr>
+          <w:b/>
+          <w:bCs/>
+          <w:color w:val="00B0F0"/>
+          <w:sz w:val="40"/>
+          <w:szCs w:val="40"/>
+          <w:u w:val="single"/>
+        </w:rPr>
+        <w:lastRenderedPageBreak/>
+        <w:t>Deliverable</w:t>
+      </w:r>
+      <w:r>
+        <w:rPr>
+          <w:b/>
+          <w:bCs/>
+          <w:color w:val="00B0F0"/>
+          <w:sz w:val="40"/>
+          <w:szCs w:val="40"/>
+          <w:u w:val="single"/>
+        </w:rPr>
+        <w:t xml:space="preserve"> 3</w:t>
+      </w:r>
+    </w:p>
+    <w:p>
+      <w:pPr>
+        <w:rPr>
+          <w:b/>
+          <w:bCs/>
+          <w:color w:val="00B050"/>
+          <w:u w:val="single"/>
+        </w:rPr>
+      </w:pPr>
+      <w:r>
+        <w:rPr>
+          <w:b/>
+          <w:bCs/>
+          <w:color w:val="00B050"/>
+          <w:u w:val="single"/>
+        </w:rPr>
+        <w:t>Section 1: Review Your Game Option and Design Documents</w:t>
+      </w:r>
+    </w:p>
+    <w:p>
+      <w:pPr>
+        <w:rPr>
+          <w:color w:val="FF0000"/>
+        </w:rPr>
+      </w:pPr>
+      <w:r>
+        <w:rPr>
+          <w:color w:val="FF0000"/>
+        </w:rPr>
+        <w:t>Identify which core functions are essential for a playable prototype?</w:t>
+      </w:r>
+    </w:p>
+    <w:p>
+      <w:pPr>
+        <w:pStyle w:val="ListParagraph"/>
+        <w:numPr>
+          <w:ilvl w:val="0"/>
+          <w:numId w:val="1"/>
+        </w:numPr>
+      </w:pPr>
+      <w:r>
+        <w:t>A basic game loop, continuously updating the game state (E.g. Ball movement, paddle control, collision detection)</w:t>
+      </w:r>
+    </w:p>
+    <w:p>
+      <w:pPr>
+        <w:pStyle w:val="ListParagraph"/>
+        <w:numPr>
+          <w:ilvl w:val="1"/>
+          <w:numId w:val="1"/>
+        </w:numPr>
+      </w:pPr>
+      <w:r>
+        <w:t>This loop should also render the graphics on screen</w:t>
+      </w:r>
+    </w:p>
+    <w:p/>
+    <w:p>
+      <w:pPr>
+        <w:pStyle w:val="ListParagraph"/>
+        <w:numPr>
+          <w:ilvl w:val="0"/>
+          <w:numId w:val="1"/>
+        </w:numPr>
+      </w:pPr>
+      <w:r>
+        <w:t>Player being able to move the paddle left and right using keyboard input, also ensuring the paddle stays within screen boundaries</w:t>
+      </w:r>
+    </w:p>
+    <w:p/>
+    <w:p>
+      <w:pPr>
+        <w:pStyle w:val="ListParagraph"/>
+        <w:numPr>
+          <w:ilvl w:val="0"/>
+          <w:numId w:val="1"/>
+        </w:numPr>
+      </w:pPr>
+      <w:r>
+        <w:t>The ball should move in given direction a fixed speed, the ball should bounce off walls, the paddle, the brick</w:t>
+      </w:r>
+    </w:p>
+    <w:p>
+      <w:pPr>
+        <w:pStyle w:val="ListParagraph"/>
+        <w:numPr>
+          <w:ilvl w:val="1"/>
+          <w:numId w:val="1"/>
+        </w:numPr>
+      </w:pPr>
+      <w:r>
+        <w:t>If the ball falls below the paddle, the player should lose a life or the game should end</w:t>
+      </w:r>
+    </w:p>
+    <w:p>
+      <w:pPr>
+        <w:pStyle w:val="ListParagraph"/>
+      </w:pPr>
+    </w:p>
+    <w:p>
+      <w:pPr>
+        <w:pStyle w:val="ListParagraph"/>
+      </w:pPr>
+    </w:p>
+    <w:p>
+      <w:pPr>
+        <w:pStyle w:val="ListParagraph"/>
+        <w:numPr>
+          <w:ilvl w:val="0"/>
+          <w:numId w:val="1"/>
+        </w:numPr>
+      </w:pPr>
+      <w:r>
+        <w:t>The ball should destroy bricks when it collides with them</w:t>
+      </w:r>
+    </w:p>
+    <w:p>
+      <w:pPr>
+        <w:pStyle w:val="ListParagraph"/>
+      </w:pPr>
+    </w:p>
+    <w:p>
+      <w:pPr>
+        <w:pStyle w:val="ListParagraph"/>
+        <w:numPr>
+          <w:ilvl w:val="0"/>
+          <w:numId w:val="1"/>
+        </w:numPr>
+      </w:pPr>
+      <w:r>
+        <w:t xml:space="preserve"> If all bricks are destroyed, a win condition is met, and if the ball falls below the paddle, a loss condition is met</w:t>
+      </w:r>
+    </w:p>
+    <w:p>
+      <w:pPr>
+        <w:pStyle w:val="ListParagraph"/>
+      </w:pPr>
+    </w:p>
+    <w:p>
+      <w:pPr>
+        <w:rPr>
+          <w:b/>
+          <w:bCs/>
+          <w:color w:val="00B050"/>
+          <w:u w:val="single"/>
+        </w:rPr>
+      </w:pPr>
+      <w:r>
+        <w:rPr>
+          <w:b/>
+          <w:bCs/>
+          <w:color w:val="00B050"/>
+          <w:u w:val="single"/>
+        </w:rPr>
+        <w:t>Section 2: Plan Your Prototype</w:t>
+      </w:r>
+    </w:p>
+    <w:p>
+      <w:pPr>
+        <w:rPr>
+          <w:color w:val="FF0000"/>
+        </w:rPr>
+      </w:pPr>
+      <w:r>
+        <w:rPr>
+          <w:color w:val="FF0000"/>
+        </w:rPr>
+        <w:t>Outline the minimal features you want to include</w:t>
+      </w:r>
+    </w:p>
+    <w:p>
+      <w:pPr>
+        <w:pStyle w:val="ListParagraph"/>
+        <w:numPr>
+          <w:ilvl w:val="0"/>
+          <w:numId w:val="1"/>
+        </w:numPr>
+      </w:pPr>
+      <w:r>
+        <w:t>All the core functions</w:t>
+      </w:r>
+    </w:p>
+    <w:p>
+      <w:pPr>
+        <w:pStyle w:val="ListParagraph"/>
+      </w:pPr>
+    </w:p>
+    <w:p>
+      <w:pPr>
+        <w:rPr>
+          <w:b/>
+          <w:bCs/>
+          <w:color w:val="00B050"/>
+          <w:u w:val="single"/>
+        </w:rPr>
+      </w:pPr>
+      <w:r>
+        <w:rPr>
+          <w:b/>
+          <w:bCs/>
+          <w:color w:val="00B050"/>
+          <w:u w:val="single"/>
+        </w:rPr>
+        <w:t xml:space="preserve">Section </w:t>
+      </w:r>
+      <w:r>
+        <w:rPr>
+          <w:b/>
+          <w:bCs/>
+          <w:color w:val="00B050"/>
+          <w:u w:val="single"/>
+        </w:rPr>
+        <w:t>3</w:t>
+      </w:r>
+      <w:r>
+        <w:rPr>
+          <w:b/>
+          <w:bCs/>
+          <w:color w:val="00B050"/>
+          <w:u w:val="single"/>
+        </w:rPr>
+        <w:t>: Prepare Documentation</w:t>
+      </w:r>
+    </w:p>
+    <w:p>
+      <w:pPr>
+        <w:rPr>
+          <w:color w:val="FF0000"/>
+        </w:rPr>
+      </w:pPr>
+      <w:r>
+        <w:rPr>
+          <w:color w:val="FF0000"/>
+        </w:rPr>
+        <w:t>Write a short explanation of your design decision</w:t>
+      </w:r>
+      <w:r>
+        <w:rPr>
+          <w:color w:val="FF0000"/>
+        </w:rPr>
+        <w:t>s</w:t>
+      </w:r>
+      <w:r>
+        <w:rPr>
+          <w:color w:val="FF0000"/>
+        </w:rPr>
+        <w:t xml:space="preserve"> (Why you structured your classes as you did, etc.)</w:t>
+      </w:r>
+    </w:p>
+    <w:p>
+      <w:pPr>
+        <w:pStyle w:val="ListParagraph"/>
+        <w:numPr>
+          <w:ilvl w:val="0"/>
+          <w:numId w:val="1"/>
+        </w:numPr>
+      </w:pPr>
+      <w:r>
+        <w:t>I created a base ‘</w:t>
+      </w:r>
+      <w:proofErr w:type="spellStart"/>
+      <w:r>
+        <w:t>GameObject</w:t>
+      </w:r>
+      <w:proofErr w:type="spellEnd"/>
+      <w:r>
+        <w:t>’ class to provide common functionality (E.g. Position, collision detection) that all the game objects share</w:t>
+      </w:r>
+    </w:p>
+    <w:p>
+      <w:pPr>
+        <w:pStyle w:val="ListParagraph"/>
+        <w:numPr>
+          <w:ilvl w:val="1"/>
+          <w:numId w:val="1"/>
+        </w:numPr>
+      </w:pPr>
+      <w:r>
+        <w:t>Reduces code redundancy, and ensures consistency across all game objects</w:t>
+      </w:r>
+    </w:p>
+    <w:p/>
+    <w:p>
+      <w:pPr>
+        <w:pStyle w:val="ListParagraph"/>
+        <w:numPr>
+          <w:ilvl w:val="0"/>
+          <w:numId w:val="1"/>
+        </w:numPr>
+      </w:pPr>
+      <w:r>
+        <w:t>For my child classes, used an object-oriented approach to allow to model real-world entities (E.g. Ball, Paddle, Bricks) as objects with their own properties and behaviours</w:t>
+      </w:r>
+    </w:p>
+    <w:p>
+      <w:pPr>
+        <w:pStyle w:val="ListParagraph"/>
+        <w:numPr>
+          <w:ilvl w:val="1"/>
+          <w:numId w:val="1"/>
+        </w:numPr>
+      </w:pPr>
+      <w:r>
+        <w:t>Allows to make the code more modular, reusable, and easier to maintain</w:t>
+      </w:r>
+    </w:p>
+    <w:p>
+      <w:pPr>
+        <w:pStyle w:val="ListParagraph"/>
+        <w:ind w:left="1440"/>
+      </w:pPr>
+    </w:p>
+    <w:p>
+      <w:pPr>
+        <w:pStyle w:val="ListParagraph"/>
+        <w:numPr>
+          <w:ilvl w:val="0"/>
+          <w:numId w:val="1"/>
+        </w:numPr>
+      </w:pPr>
+      <w:r>
+        <w:t>I separated the game logic into different modules (E.g. Utils, Models) to keep the code organised, which makes the code easier to understand, test, and debug</w:t>
+      </w:r>
+    </w:p>
+    <w:p/>
+    <w:p>
+      <w:pPr>
+        <w:pStyle w:val="ListParagraph"/>
+        <w:numPr>
+          <w:ilvl w:val="0"/>
+          <w:numId w:val="1"/>
+        </w:numPr>
+      </w:pPr>
+      <w:r>
+        <w:t>I used constants and put them into a separate file, to make it easier to change values in one place without having to modify the entire code</w:t>
+      </w:r>
+    </w:p>
+    <w:p>
+      <w:pPr>
+        <w:pStyle w:val="ListParagraph"/>
+      </w:pPr>
+    </w:p>
+    <w:p>
+      <w:pPr>
+        <w:pStyle w:val="ListParagraph"/>
+        <w:numPr>
+          <w:ilvl w:val="1"/>
+          <w:numId w:val="1"/>
+        </w:numPr>
+      </w:pPr>
+      <w:r>
+        <w:t xml:space="preserve">It also  improves readability by giving meaningful names to </w:t>
+      </w:r>
+      <w:r>
+        <w:t>commonly used</w:t>
+      </w:r>
+      <w:r>
+        <w:t xml:space="preserve"> numbers</w:t>
+      </w:r>
+    </w:p>
+    <w:p/>
+    <w:p>
+      <w:pPr>
+        <w:rPr>
+          <w:b/>
+          <w:bCs/>
+          <w:color w:val="00B050"/>
+          <w:u w:val="single"/>
+        </w:rPr>
+      </w:pPr>
+      <w:r>
+        <w:rPr>
+          <w:b/>
+          <w:bCs/>
+          <w:color w:val="00B050"/>
+          <w:u w:val="single"/>
+        </w:rPr>
+        <w:lastRenderedPageBreak/>
+        <w:t>Section 4: Showing Unit Testing</w:t>
+      </w:r>
+    </w:p>
+    <w:p>
+      <w:pPr>
+        <w:pStyle w:val="ListParagraph"/>
+        <w:numPr>
+          <w:ilvl w:val="0"/>
+          <w:numId w:val="1"/>
+        </w:numPr>
+      </w:pPr>
+      <w:r>
+        <w:t>Performed unit testing on core game functionalities to ensure they all work properly</w:t>
+      </w:r>
+    </w:p>
+    <w:p>
+      <w:pPr>
+        <w:pStyle w:val="ListParagraph"/>
+        <w:numPr>
+          <w:ilvl w:val="1"/>
+          <w:numId w:val="1"/>
+        </w:numPr>
+      </w:pPr>
+      <w:r>
+        <w:t>For example, checked if the game over condition functions as expected, by creating a scenario with all the balls being below the screen</w:t>
+      </w:r>
+    </w:p>
+    <w:p/>
+    <w:p>
+      <w:pPr>
+        <w:ind w:left="720"/>
+        <w:rPr>
+          <w:b/>
+          <w:bCs/>
+        </w:rPr>
+      </w:pPr>
+      <w:r>
+        <w:rPr>
+          <w:b/>
+          <w:bCs/>
+        </w:rPr>
+        <w:t>Results For Unit Tests:</w:t>
+      </w:r>
+    </w:p>
+    <w:p>
+      <w:pPr>
+        <w:ind w:left="720"/>
+        <w:rPr>
+          <w:b/>
+          <w:bCs/>
+        </w:rPr>
+      </w:pPr>
+      <w:r>
+        <w:rPr>
+          <w:b/>
+          <w:bCs/>
+        </w:rPr>
+        <w:tab/>
+      </w:r>
+      <w:r>
+        <w:rPr>
+          <w:b/>
+          <w:bCs/>
+        </w:rPr>
+        <w:drawing>
+          <wp:inline distT="0" distB="0" distL="0" distR="0" wp14:anchorId="59C208ED" wp14:editId="5ACDF9FD">
+            <wp:extent cx="4315427" cy="895475"/>
+            <wp:effectExtent l="0" t="0" r="9525" b="0"/>
+            <wp:docPr id="1835541852" name="Picture 1" descr="A screen shot of a computer&#10;&#10;AI-generated content may be incorrect."/>
+            <wp:cNvGraphicFramePr>
+              <a:graphicFrameLocks xmlns:a="http://schemas.openxmlformats.org/drawingml/2006/main" noChangeAspect="1"/>
+            </wp:cNvGraphicFramePr>
+            <a:graphic xmlns:a="http://schemas.openxmlformats.org/drawingml/2006/main">
+              <a:graphicData uri="http://schemas.openxmlformats.org/drawingml/2006/picture">
+                <pic:pic xmlns:pic="http://schemas.openxmlformats.org/drawingml/2006/picture">
+                  <pic:nvPicPr>
+                    <pic:cNvPr id="1835541852" name="Picture 1" descr="A screen shot of a computer&#10;&#10;AI-generated content may be incorrect."/>
+                    <pic:cNvPicPr/>
+                  </pic:nvPicPr>
+                  <pic:blipFill>
+                    <a:blip r:embed="rId15"/>
+                    <a:stretch>
+                      <a:fillRect/>
+                    </a:stretch>
+                  </pic:blipFill>
+                  <pic:spPr>
+                    <a:xfrm>
+                      <a:off x="0" y="0"/>
+                      <a:ext cx="4315427" cy="895475"/>
+                    </a:xfrm>
+                    <a:prstGeom prst="rect">
+                      <a:avLst/>
+                    </a:prstGeom>
+                  </pic:spPr>
+                </pic:pic>
+              </a:graphicData>
+            </a:graphic>
+          </wp:inline>
+        </w:drawing>
+      </w:r>
+    </w:p>
+    <w:p>
+      <w:pPr>
+        <w:rPr>
+          <w:b/>
+          <w:bCs/>
+        </w:rPr>
+      </w:pPr>
+    </w:p>
+    <w:p>
+      <w:pPr>
+        <w:rPr>
+          <w:b/>
+          <w:bCs/>
+        </w:rPr>
+      </w:pPr>
+    </w:p>
+    <w:p>
+      <w:pPr>
+        <w:rPr>
+          <w:b/>
+          <w:bCs/>
+          <w:color w:val="00B050"/>
+          <w:u w:val="single"/>
+        </w:rPr>
+      </w:pPr>
+      <w:r>
+        <w:rPr>
+          <w:b/>
+          <w:bCs/>
+          <w:color w:val="00B050"/>
+          <w:u w:val="single"/>
+        </w:rPr>
+        <w:t>S</w:t>
+      </w:r>
+      <w:r>
+        <w:rPr>
+          <w:b/>
+          <w:bCs/>
+          <w:color w:val="00B050"/>
+          <w:u w:val="single"/>
+        </w:rPr>
+        <w:t>ection 5: Challenges I Encountered</w:t>
+      </w:r>
+    </w:p>
+    <w:p>
+      <w:pPr>
+        <w:ind w:left="720"/>
+        <w:rPr>
+          <w:b/>
+          <w:bCs/>
+          <w:color w:val="7030A0"/>
+        </w:rPr>
+      </w:pPr>
+      <w:r>
+        <w:rPr>
+          <w:b/>
+          <w:bCs/>
+          <w:color w:val="7030A0"/>
+        </w:rPr>
+        <w:t>Ensuring th</w:t>
+      </w:r>
+      <w:r>
+        <w:rPr>
+          <w:b/>
+          <w:bCs/>
+          <w:color w:val="7030A0"/>
+        </w:rPr>
+        <w:t xml:space="preserve">e Ball Moves Realistically and Changes Direction Correctly When Colliding </w:t>
+      </w:r>
+      <w:proofErr w:type="gramStart"/>
+      <w:r>
+        <w:rPr>
+          <w:b/>
+          <w:bCs/>
+          <w:color w:val="7030A0"/>
+        </w:rPr>
+        <w:t>With</w:t>
+      </w:r>
+      <w:proofErr w:type="gramEnd"/>
+      <w:r>
+        <w:rPr>
+          <w:b/>
+          <w:bCs/>
+          <w:color w:val="7030A0"/>
+        </w:rPr>
+        <w:t xml:space="preserve"> Walls, Paddle, Or Bricks:</w:t>
+      </w:r>
+    </w:p>
+    <w:p>
+      <w:pPr>
+        <w:pStyle w:val="ListParagraph"/>
+        <w:numPr>
+          <w:ilvl w:val="1"/>
+          <w:numId w:val="1"/>
+        </w:numPr>
+      </w:pPr>
+      <w:r>
+        <w:t xml:space="preserve">Added logic to reverse the ball’s y-direction </w:t>
+      </w:r>
+      <w:r>
+        <w:t>when colliding with the paddle, and reverse the ball’s x-direction when colliding with walls, which was relatively simple</w:t>
+      </w:r>
+    </w:p>
+    <w:p/>
+    <w:p>
+      <w:pPr>
+        <w:pStyle w:val="ListParagraph"/>
+        <w:numPr>
+          <w:ilvl w:val="1"/>
+          <w:numId w:val="1"/>
+        </w:numPr>
+      </w:pPr>
+      <w:r>
+        <w:t>Though tried adding directional control to the paddle, where the ball bounces differently on the paddle depending on where on the paddle it hits</w:t>
+      </w:r>
+    </w:p>
+    <w:p>
+      <w:pPr>
+        <w:pStyle w:val="ListParagraph"/>
+      </w:pPr>
+    </w:p>
+    <w:p>
+      <w:pPr>
+        <w:pStyle w:val="ListParagraph"/>
+        <w:numPr>
+          <w:ilvl w:val="2"/>
+          <w:numId w:val="1"/>
+        </w:numPr>
+      </w:pPr>
+      <w:proofErr w:type="gramStart"/>
+      <w:r>
+        <w:t>Wasn’t able to</w:t>
+      </w:r>
+      <w:proofErr w:type="gramEnd"/>
+      <w:r>
+        <w:t xml:space="preserve"> complete it, </w:t>
+      </w:r>
+      <w:r>
+        <w:t>will hopefully get it working by Deliverable 4</w:t>
       </w:r>
     </w:p>
     <w:sectPr>
@@ -7561,6 +8368,7 @@
   <w:style w:type="character" w:default="1" w:styleId="DefaultParagraphFont">
     <w:name w:val="Default Paragraph Font"/>
     <w:uiPriority w:val="1"/>
+    <w:semiHidden/>
     <w:unhideWhenUsed/>
   </w:style>
   <w:style w:type="table" w:default="1" w:styleId="TableNormal">

</xml_diff>

<commit_message>
Added functional requirements summary to documentation
</commit_message>
<xml_diff>
--- a/Brick Blitz Documentation - Berkay Topal.docx
+++ b/Brick Blitz Documentation - Berkay Topal.docx
@@ -447,8 +447,13 @@
         </w:numPr>
       </w:pPr>
       <w:r>
-        <w:t>Students and developers interested in learning about game development, particularly collision detection, physics-based movement, and event handling in Pygame</w:t>
-      </w:r>
+        <w:t xml:space="preserve">Students and developers interested in learning about game development, particularly collision detection, physics-based movement, and event handling in </w:t>
+      </w:r>
+      <w:proofErr w:type="spellStart"/>
+      <w:r>
+        <w:t>Pygame</w:t>
+      </w:r>
+      <w:proofErr w:type="spellEnd"/>
     </w:p>
     <w:p>
       <w:pPr>
@@ -565,8 +570,13 @@
         <w:t xml:space="preserve">Directional Control, Levels, etc.) </w:t>
       </w:r>
       <w:r>
-        <w:t>that is better than Arkanoid</w:t>
-      </w:r>
+        <w:t xml:space="preserve">that is better than </w:t>
+      </w:r>
+      <w:proofErr w:type="spellStart"/>
+      <w:r>
+        <w:t>Arkanoid</w:t>
+      </w:r>
+      <w:proofErr w:type="spellEnd"/>
       <w:r>
         <w:t>.</w:t>
       </w:r>
@@ -1171,13 +1181,45 @@
         </w:rPr>
       </w:pPr>
       <w:r>
-        <w:t>My classes: Ball, Paddle, Brick, PowerUp, GameObject, all encapsulate their own data (</w:t>
+        <w:t xml:space="preserve">My classes: Ball, Paddle, Brick, </w:t>
+      </w:r>
+      <w:proofErr w:type="spellStart"/>
+      <w:r>
+        <w:t>PowerUp</w:t>
+      </w:r>
+      <w:proofErr w:type="spellEnd"/>
+      <w:r>
+        <w:t xml:space="preserve">, </w:t>
+      </w:r>
+      <w:proofErr w:type="spellStart"/>
+      <w:r>
+        <w:t>GameObject</w:t>
+      </w:r>
+      <w:proofErr w:type="spellEnd"/>
+      <w:r>
+        <w:t>, all encapsulate their own data (</w:t>
       </w:r>
       <w:r>
         <w:t>E.g.</w:t>
       </w:r>
       <w:r>
-        <w:t xml:space="preserve"> speed_x, speed_y, x, y), and methods (</w:t>
+        <w:t xml:space="preserve"> </w:t>
+      </w:r>
+      <w:proofErr w:type="spellStart"/>
+      <w:r>
+        <w:t>speed_x</w:t>
+      </w:r>
+      <w:proofErr w:type="spellEnd"/>
+      <w:r>
+        <w:t xml:space="preserve">, </w:t>
+      </w:r>
+      <w:proofErr w:type="spellStart"/>
+      <w:r>
+        <w:t>speed_y</w:t>
+      </w:r>
+      <w:proofErr w:type="spellEnd"/>
+      <w:r>
+        <w:t>, x, y), and methods (</w:t>
       </w:r>
       <w:r>
         <w:t>E.g.</w:t>
@@ -1258,7 +1300,15 @@
         </w:rPr>
       </w:pPr>
       <w:r>
-        <w:t>Currently, I have a ‘GameObject’ base class, which encapsulates common properties such as ‘x’, ‘y’ and methods such as ‘draw’, ‘move’</w:t>
+        <w:t>Currently, I have a ‘</w:t>
+      </w:r>
+      <w:proofErr w:type="spellStart"/>
+      <w:r>
+        <w:t>GameObject</w:t>
+      </w:r>
+      <w:proofErr w:type="spellEnd"/>
+      <w:r>
+        <w:t>’ base class, which encapsulates common properties such as ‘x’, ‘y’ and methods such as ‘draw’, ‘move’</w:t>
       </w:r>
     </w:p>
     <w:p>
@@ -1283,7 +1333,23 @@
         </w:rPr>
       </w:pPr>
       <w:r>
-        <w:t>Then the child classes ‘Ball’, ‘Paddle’, ‘Brick’, ‘PowerUp’ all inherit from the parent class ‘GameObject’</w:t>
+        <w:t>Then the child classes ‘Ball’, ‘Paddle’, ‘Brick’, ‘</w:t>
+      </w:r>
+      <w:proofErr w:type="spellStart"/>
+      <w:r>
+        <w:t>PowerUp</w:t>
+      </w:r>
+      <w:proofErr w:type="spellEnd"/>
+      <w:r>
+        <w:t>’ all inherit from the parent class ‘</w:t>
+      </w:r>
+      <w:proofErr w:type="spellStart"/>
+      <w:r>
+        <w:t>GameObject</w:t>
+      </w:r>
+      <w:proofErr w:type="spellEnd"/>
+      <w:r>
+        <w:t>’</w:t>
       </w:r>
     </w:p>
     <w:p>
@@ -1308,7 +1374,15 @@
         </w:rPr>
       </w:pPr>
       <w:r>
-        <w:t>Allows them to reuse the methods and attributes that GameObject holds, while still adding their own specific behaviour</w:t>
+        <w:t xml:space="preserve">Allows them to reuse the methods and attributes that </w:t>
+      </w:r>
+      <w:proofErr w:type="spellStart"/>
+      <w:r>
+        <w:t>GameObject</w:t>
+      </w:r>
+      <w:proofErr w:type="spellEnd"/>
+      <w:r>
+        <w:t xml:space="preserve"> holds, while still adding their own specific behaviour</w:t>
       </w:r>
     </w:p>
     <w:p>
@@ -1376,7 +1450,15 @@
         <w:t>Game uses method overridin</w:t>
       </w:r>
       <w:r>
-        <w:t>g, where the child classes override the ‘draw’ and ‘move’ methods from the ‘GameObject’ parent class, to provide its own implementation</w:t>
+        <w:t>g, where the child classes override the ‘draw’ and ‘move’ methods from the ‘</w:t>
+      </w:r>
+      <w:proofErr w:type="spellStart"/>
+      <w:r>
+        <w:t>GameObject</w:t>
+      </w:r>
+      <w:proofErr w:type="spellEnd"/>
+      <w:r>
+        <w:t>’ parent class, to provide its own implementation</w:t>
       </w:r>
     </w:p>
     <w:p>
@@ -1401,7 +1483,23 @@
         </w:rPr>
       </w:pPr>
       <w:r>
-        <w:t>Despite different implementations, all child classes can be treated as ‘GameObject’ instances, so you can call ‘draw’ or ‘move’ on any ‘GameObject’ without knowing the specific type</w:t>
+        <w:t>Despite different implementations, all child classes can be treated as ‘</w:t>
+      </w:r>
+      <w:proofErr w:type="spellStart"/>
+      <w:r>
+        <w:t>GameObject</w:t>
+      </w:r>
+      <w:proofErr w:type="spellEnd"/>
+      <w:r>
+        <w:t>’ instances, so you can call ‘draw’ or ‘move’ on any ‘</w:t>
+      </w:r>
+      <w:proofErr w:type="spellStart"/>
+      <w:r>
+        <w:t>GameObject</w:t>
+      </w:r>
+      <w:proofErr w:type="spellEnd"/>
+      <w:r>
+        <w:t>’ without knowing the specific type</w:t>
       </w:r>
     </w:p>
     <w:p>
@@ -1474,7 +1572,15 @@
         </w:rPr>
       </w:pPr>
       <w:r>
-        <w:t>Currently, the plan is to have the ‘GameObject’ class define abstract methods like ‘draw’ and ‘move’ without providing an implementation, forcing the child classes to implement the methods</w:t>
+        <w:t>Currently, the plan is to have the ‘</w:t>
+      </w:r>
+      <w:proofErr w:type="spellStart"/>
+      <w:r>
+        <w:t>GameObject</w:t>
+      </w:r>
+      <w:proofErr w:type="spellEnd"/>
+      <w:r>
+        <w:t>’ class define abstract methods like ‘draw’ and ‘move’ without providing an implementation, forcing the child classes to implement the methods</w:t>
       </w:r>
     </w:p>
     <w:p>
@@ -3253,7 +3359,47 @@
           <w:color w:val="00B050"/>
           <w:u w:val="single"/>
         </w:rPr>
-        <w:t>Section 3: Flow Chart For An Algorithm</w:t>
+        <w:t xml:space="preserve">Section 3: Flow Chart </w:t>
+      </w:r>
+      <w:proofErr w:type="gramStart"/>
+      <w:r>
+        <w:rPr>
+          <w:b/>
+          <w:bCs/>
+          <w:color w:val="00B050"/>
+          <w:u w:val="single"/>
+        </w:rPr>
+        <w:t>For</w:t>
+      </w:r>
+      <w:proofErr w:type="gramEnd"/>
+      <w:r>
+        <w:rPr>
+          <w:b/>
+          <w:bCs/>
+          <w:color w:val="00B050"/>
+          <w:u w:val="single"/>
+        </w:rPr>
+        <w:t xml:space="preserve"> </w:t>
+      </w:r>
+      <w:proofErr w:type="gramStart"/>
+      <w:r>
+        <w:rPr>
+          <w:b/>
+          <w:bCs/>
+          <w:color w:val="00B050"/>
+          <w:u w:val="single"/>
+        </w:rPr>
+        <w:t>An</w:t>
+      </w:r>
+      <w:proofErr w:type="gramEnd"/>
+      <w:r>
+        <w:rPr>
+          <w:b/>
+          <w:bCs/>
+          <w:color w:val="00B050"/>
+          <w:u w:val="single"/>
+        </w:rPr>
+        <w:t xml:space="preserve"> Algorithm</w:t>
       </w:r>
     </w:p>
     <w:p>
@@ -6627,7 +6773,15 @@
         </w:numPr>
       </w:pPr>
       <w:r>
-        <w:t>I created a base ‘GameObject’ class to provide common functionality (E.g. Position, collision detection) that all the game objects share</w:t>
+        <w:t>I created a base ‘</w:t>
+      </w:r>
+      <w:proofErr w:type="spellStart"/>
+      <w:r>
+        <w:t>GameObject</w:t>
+      </w:r>
+      <w:proofErr w:type="spellEnd"/>
+      <w:r>
+        <w:t>’ class to provide common functionality (E.g. Position, collision detection) that all the game objects share</w:t>
       </w:r>
     </w:p>
     <w:p>
@@ -6899,7 +7053,25 @@
           <w:bCs/>
           <w:color w:val="7030A0"/>
         </w:rPr>
-        <w:t>e Ball Moves Realistically and Changes Direction Correctly When Colliding With Walls, Paddle, Or Bricks:</w:t>
+        <w:t xml:space="preserve">e Ball Moves Realistically and Changes Direction Correctly When Colliding </w:t>
+      </w:r>
+      <w:proofErr w:type="gramStart"/>
+      <w:r>
+        <w:rPr>
+          <w:b/>
+          <w:bCs/>
+          <w:color w:val="7030A0"/>
+        </w:rPr>
+        <w:t>With</w:t>
+      </w:r>
+      <w:proofErr w:type="gramEnd"/>
+      <w:r>
+        <w:rPr>
+          <w:b/>
+          <w:bCs/>
+          <w:color w:val="7030A0"/>
+        </w:rPr>
+        <w:t xml:space="preserve"> Walls, Paddle, Or Bricks:</w:t>
       </w:r>
     </w:p>
     <w:p>
@@ -6943,8 +7115,13 @@
           <w:numId w:val="1"/>
         </w:numPr>
       </w:pPr>
-      <w:r>
-        <w:t xml:space="preserve">Wasn’t able to complete it, </w:t>
+      <w:proofErr w:type="gramStart"/>
+      <w:r>
+        <w:t>Wasn’t able to</w:t>
+      </w:r>
+      <w:proofErr w:type="gramEnd"/>
+      <w:r>
+        <w:t xml:space="preserve"> complete it, </w:t>
       </w:r>
       <w:r>
         <w:t>will hopefully get it working by Deliverable 4</w:t>
@@ -6970,13 +7147,19 @@
         <w:rPr>
           <w:b/>
           <w:bCs/>
-          <w:u w:val="single"/>
-        </w:rPr>
-      </w:pPr>
-      <w:r>
-        <w:rPr>
-          <w:b/>
-          <w:bCs/>
+          <w:color w:val="00B0F0"/>
+          <w:sz w:val="40"/>
+          <w:szCs w:val="40"/>
+          <w:u w:val="single"/>
+        </w:rPr>
+      </w:pPr>
+      <w:r>
+        <w:rPr>
+          <w:b/>
+          <w:bCs/>
+          <w:color w:val="00B0F0"/>
+          <w:sz w:val="40"/>
+          <w:szCs w:val="40"/>
           <w:u w:val="single"/>
         </w:rPr>
         <w:lastRenderedPageBreak/>
@@ -6996,25 +7179,23 @@
     </w:p>
     <w:p>
       <w:pPr>
-        <w:rPr>
-          <w:b/>
-          <w:bCs/>
-          <w:u w:val="single"/>
-        </w:rPr>
-      </w:pPr>
-    </w:p>
-    <w:p>
-      <w:pPr>
-        <w:rPr>
-          <w:b/>
-          <w:bCs/>
-          <w:u w:val="single"/>
-        </w:rPr>
-      </w:pPr>
-      <w:r>
-        <w:rPr>
-          <w:b/>
-          <w:bCs/>
+        <w:ind w:left="720"/>
+      </w:pPr>
+    </w:p>
+    <w:p>
+      <w:pPr>
+        <w:rPr>
+          <w:b/>
+          <w:bCs/>
+          <w:color w:val="00B050"/>
+          <w:u w:val="single"/>
+        </w:rPr>
+      </w:pPr>
+      <w:r>
+        <w:rPr>
+          <w:b/>
+          <w:bCs/>
+          <w:color w:val="00B050"/>
           <w:u w:val="single"/>
         </w:rPr>
         <w:t>Developer Retrospective Report (Brief):</w:t>
@@ -7025,6 +7206,7 @@
         <w:rPr>
           <w:b/>
           <w:bCs/>
+          <w:color w:val="FF0000"/>
         </w:rPr>
         <w:t xml:space="preserve">Project: </w:t>
       </w:r>
@@ -7037,8 +7219,16 @@
         <w:rPr>
           <w:b/>
           <w:bCs/>
-        </w:rPr>
-        <w:t xml:space="preserve">Development Dates: </w:t>
+          <w:color w:val="FF0000"/>
+        </w:rPr>
+        <w:t>Development Dates:</w:t>
+      </w:r>
+      <w:r>
+        <w:rPr>
+          <w:b/>
+          <w:bCs/>
+        </w:rPr>
+        <w:t xml:space="preserve"> </w:t>
       </w:r>
       <w:r>
         <w:t>14/02/2025 – 12/04/2025</w:t>
@@ -7049,8 +7239,16 @@
         <w:rPr>
           <w:b/>
           <w:bCs/>
-        </w:rPr>
-        <w:t xml:space="preserve">Team: </w:t>
+          <w:color w:val="FF0000"/>
+        </w:rPr>
+        <w:t>Team:</w:t>
+      </w:r>
+      <w:r>
+        <w:rPr>
+          <w:b/>
+          <w:bCs/>
+        </w:rPr>
+        <w:t xml:space="preserve"> </w:t>
       </w:r>
       <w:r>
         <w:t>Berkay Topal</w:t>
@@ -7061,8 +7259,16 @@
         <w:rPr>
           <w:b/>
           <w:bCs/>
-        </w:rPr>
-        <w:t xml:space="preserve">Date of Retrospective: </w:t>
+          <w:color w:val="FF0000"/>
+        </w:rPr>
+        <w:t>Date of Retrospective:</w:t>
+      </w:r>
+      <w:r>
+        <w:rPr>
+          <w:b/>
+          <w:bCs/>
+        </w:rPr>
+        <w:t xml:space="preserve"> </w:t>
       </w:r>
       <w:r>
         <w:t>11/04/2025</w:t>
@@ -7073,25 +7279,43 @@
         <w:rPr>
           <w:b/>
           <w:bCs/>
-        </w:rPr>
-        <w:t xml:space="preserve">Location: </w:t>
+          <w:color w:val="FF0000"/>
+        </w:rPr>
+        <w:t>Location:</w:t>
+      </w:r>
+      <w:r>
+        <w:rPr>
+          <w:b/>
+          <w:bCs/>
+        </w:rPr>
+        <w:t xml:space="preserve"> </w:t>
       </w:r>
       <w:r>
         <w:t>Perth, Western Australia, Australia</w:t>
       </w:r>
     </w:p>
-    <w:p/>
-    <w:p>
-      <w:pPr>
-        <w:rPr>
-          <w:b/>
-          <w:bCs/>
-        </w:rPr>
-      </w:pPr>
-      <w:r>
-        <w:rPr>
-          <w:b/>
-          <w:bCs/>
+    <w:p>
+      <w:pPr>
+        <w:rPr>
+          <w:b/>
+          <w:bCs/>
+          <w:color w:val="FF0000"/>
+        </w:rPr>
+      </w:pPr>
+    </w:p>
+    <w:p>
+      <w:pPr>
+        <w:rPr>
+          <w:b/>
+          <w:bCs/>
+          <w:color w:val="FF0000"/>
+        </w:rPr>
+      </w:pPr>
+      <w:r>
+        <w:rPr>
+          <w:b/>
+          <w:bCs/>
+          <w:color w:val="FF0000"/>
         </w:rPr>
         <w:t>What Went Well:</w:t>
       </w:r>
@@ -7193,20 +7417,14 @@
         <w:rPr>
           <w:b/>
           <w:bCs/>
-        </w:rPr>
-      </w:pPr>
-    </w:p>
-    <w:p>
-      <w:pPr>
-        <w:rPr>
-          <w:b/>
-          <w:bCs/>
-        </w:rPr>
-      </w:pPr>
-      <w:r>
-        <w:rPr>
-          <w:b/>
-          <w:bCs/>
+          <w:color w:val="FF0000"/>
+        </w:rPr>
+      </w:pPr>
+      <w:r>
+        <w:rPr>
+          <w:b/>
+          <w:bCs/>
+          <w:color w:val="FF0000"/>
         </w:rPr>
         <w:t>Challenges Faced:</w:t>
       </w:r>
@@ -7223,7 +7441,15 @@
         </w:rPr>
       </w:pPr>
       <w:r>
-        <w:t>Ball physics with the edges, where while the physics o the ball was implemented well, there were challenges such as the ball getting stuck in the wall, or glitching through blocks, making the game unplayable</w:t>
+        <w:t xml:space="preserve">Ball physics with the edges, where while the physics </w:t>
+      </w:r>
+      <w:proofErr w:type="spellStart"/>
+      <w:r>
+        <w:t>o</w:t>
+      </w:r>
+      <w:proofErr w:type="spellEnd"/>
+      <w:r>
+        <w:t xml:space="preserve"> the ball was implemented well, there were challenges such as the ball getting stuck in the wall, or glitching through blocks, making the game unplayable</w:t>
       </w:r>
     </w:p>
     <w:p>
@@ -7284,29 +7510,39 @@
         </w:rPr>
       </w:pPr>
       <w:r>
-        <w:lastRenderedPageBreak/>
-        <w:t>Though the game was produced in the allocated time frame, no time was left for polishing or adding extra visual effects (E.g. Sound, More engaging user interface, Visual effects, etc.)</w:t>
-      </w:r>
-    </w:p>
-    <w:p>
-      <w:pPr>
-        <w:rPr>
-          <w:b/>
-          <w:bCs/>
-        </w:rPr>
-      </w:pPr>
-    </w:p>
-    <w:p>
-      <w:pPr>
-        <w:rPr>
-          <w:b/>
-          <w:bCs/>
-        </w:rPr>
-      </w:pPr>
-      <w:r>
-        <w:rPr>
-          <w:b/>
-          <w:bCs/>
+        <w:t xml:space="preserve">Though the game was produced in the allocated time frame, no time was left for polishing or adding extra visual effects (E.g. Sound, </w:t>
+      </w:r>
+      <w:proofErr w:type="gramStart"/>
+      <w:r>
+        <w:t>More</w:t>
+      </w:r>
+      <w:proofErr w:type="gramEnd"/>
+      <w:r>
+        <w:t xml:space="preserve"> engaging user interface, Visual effects, etc.)</w:t>
+      </w:r>
+    </w:p>
+    <w:p>
+      <w:pPr>
+        <w:pStyle w:val="ListParagraph"/>
+        <w:rPr>
+          <w:b/>
+          <w:bCs/>
+          <w:color w:val="FF0000"/>
+        </w:rPr>
+      </w:pPr>
+    </w:p>
+    <w:p>
+      <w:pPr>
+        <w:rPr>
+          <w:b/>
+          <w:bCs/>
+        </w:rPr>
+      </w:pPr>
+      <w:r>
+        <w:rPr>
+          <w:b/>
+          <w:bCs/>
+          <w:color w:val="FF0000"/>
         </w:rPr>
         <w:t>Lessons Learned:</w:t>
       </w:r>
@@ -7388,6 +7624,971 @@
       </w:r>
     </w:p>
     <w:p/>
+    <w:p/>
+    <w:p/>
+    <w:p>
+      <w:pPr>
+        <w:rPr>
+          <w:b/>
+          <w:bCs/>
+          <w:color w:val="00B050"/>
+          <w:u w:val="single"/>
+        </w:rPr>
+      </w:pPr>
+    </w:p>
+    <w:p>
+      <w:pPr>
+        <w:rPr>
+          <w:b/>
+          <w:bCs/>
+          <w:color w:val="00B050"/>
+          <w:u w:val="single"/>
+        </w:rPr>
+      </w:pPr>
+    </w:p>
+    <w:p>
+      <w:pPr>
+        <w:rPr>
+          <w:b/>
+          <w:bCs/>
+          <w:color w:val="00B050"/>
+          <w:u w:val="single"/>
+        </w:rPr>
+      </w:pPr>
+    </w:p>
+    <w:p>
+      <w:pPr>
+        <w:rPr>
+          <w:b/>
+          <w:bCs/>
+          <w:color w:val="00B050"/>
+          <w:u w:val="single"/>
+        </w:rPr>
+      </w:pPr>
+    </w:p>
+    <w:p>
+      <w:pPr>
+        <w:rPr>
+          <w:b/>
+          <w:bCs/>
+          <w:color w:val="00B050"/>
+          <w:u w:val="single"/>
+        </w:rPr>
+      </w:pPr>
+    </w:p>
+    <w:p>
+      <w:pPr>
+        <w:rPr>
+          <w:b/>
+          <w:bCs/>
+          <w:color w:val="00B050"/>
+          <w:u w:val="single"/>
+        </w:rPr>
+      </w:pPr>
+    </w:p>
+    <w:p>
+      <w:pPr>
+        <w:rPr>
+          <w:b/>
+          <w:bCs/>
+          <w:color w:val="00B050"/>
+          <w:u w:val="single"/>
+        </w:rPr>
+      </w:pPr>
+    </w:p>
+    <w:p>
+      <w:pPr>
+        <w:rPr>
+          <w:b/>
+          <w:bCs/>
+          <w:color w:val="00B050"/>
+          <w:u w:val="single"/>
+        </w:rPr>
+      </w:pPr>
+    </w:p>
+    <w:p>
+      <w:pPr>
+        <w:rPr>
+          <w:b/>
+          <w:bCs/>
+          <w:color w:val="00B050"/>
+          <w:u w:val="single"/>
+        </w:rPr>
+      </w:pPr>
+    </w:p>
+    <w:p>
+      <w:pPr>
+        <w:rPr>
+          <w:b/>
+          <w:bCs/>
+          <w:color w:val="00B050"/>
+          <w:u w:val="single"/>
+        </w:rPr>
+      </w:pPr>
+    </w:p>
+    <w:p>
+      <w:pPr>
+        <w:rPr>
+          <w:b/>
+          <w:bCs/>
+          <w:color w:val="00B050"/>
+          <w:u w:val="single"/>
+        </w:rPr>
+      </w:pPr>
+    </w:p>
+    <w:p>
+      <w:pPr>
+        <w:rPr>
+          <w:b/>
+          <w:bCs/>
+          <w:color w:val="00B050"/>
+          <w:u w:val="single"/>
+        </w:rPr>
+      </w:pPr>
+    </w:p>
+    <w:p>
+      <w:pPr>
+        <w:rPr>
+          <w:b/>
+          <w:bCs/>
+          <w:color w:val="00B050"/>
+          <w:u w:val="single"/>
+        </w:rPr>
+      </w:pPr>
+    </w:p>
+    <w:p>
+      <w:pPr>
+        <w:rPr>
+          <w:b/>
+          <w:bCs/>
+          <w:color w:val="00B050"/>
+          <w:u w:val="single"/>
+        </w:rPr>
+      </w:pPr>
+    </w:p>
+    <w:p>
+      <w:pPr>
+        <w:rPr>
+          <w:b/>
+          <w:bCs/>
+          <w:color w:val="00B050"/>
+          <w:u w:val="single"/>
+        </w:rPr>
+      </w:pPr>
+    </w:p>
+    <w:p>
+      <w:pPr>
+        <w:rPr>
+          <w:b/>
+          <w:bCs/>
+          <w:color w:val="00B050"/>
+          <w:u w:val="single"/>
+        </w:rPr>
+      </w:pPr>
+    </w:p>
+    <w:p>
+      <w:pPr>
+        <w:rPr>
+          <w:b/>
+          <w:bCs/>
+          <w:color w:val="00B050"/>
+          <w:u w:val="single"/>
+        </w:rPr>
+      </w:pPr>
+    </w:p>
+    <w:p>
+      <w:pPr>
+        <w:rPr>
+          <w:b/>
+          <w:bCs/>
+          <w:color w:val="00B050"/>
+          <w:u w:val="single"/>
+        </w:rPr>
+      </w:pPr>
+    </w:p>
+    <w:p>
+      <w:pPr>
+        <w:rPr>
+          <w:b/>
+          <w:bCs/>
+          <w:color w:val="00B050"/>
+          <w:u w:val="single"/>
+        </w:rPr>
+      </w:pPr>
+    </w:p>
+    <w:p>
+      <w:pPr>
+        <w:rPr>
+          <w:b/>
+          <w:bCs/>
+          <w:color w:val="00B050"/>
+          <w:u w:val="single"/>
+        </w:rPr>
+      </w:pPr>
+    </w:p>
+    <w:p>
+      <w:pPr>
+        <w:rPr>
+          <w:b/>
+          <w:bCs/>
+          <w:color w:val="00B050"/>
+          <w:u w:val="single"/>
+        </w:rPr>
+      </w:pPr>
+    </w:p>
+    <w:p>
+      <w:pPr>
+        <w:rPr>
+          <w:b/>
+          <w:bCs/>
+          <w:color w:val="00B050"/>
+          <w:u w:val="single"/>
+        </w:rPr>
+      </w:pPr>
+      <w:r>
+        <w:rPr>
+          <w:b/>
+          <w:bCs/>
+          <w:color w:val="00B050"/>
+          <w:u w:val="single"/>
+        </w:rPr>
+        <w:lastRenderedPageBreak/>
+        <w:t>Requirements Reference</w:t>
+      </w:r>
+    </w:p>
+    <w:p>
+      <w:pPr>
+        <w:rPr>
+          <w:b/>
+          <w:bCs/>
+          <w:color w:val="00B050"/>
+          <w:u w:val="single"/>
+        </w:rPr>
+      </w:pPr>
+      <w:r>
+        <w:rPr>
+          <w:b/>
+          <w:bCs/>
+          <w:color w:val="FF0000"/>
+        </w:rPr>
+        <w:t xml:space="preserve">Completion of </w:t>
+      </w:r>
+      <w:r>
+        <w:rPr>
+          <w:b/>
+          <w:bCs/>
+          <w:color w:val="FF0000"/>
+        </w:rPr>
+        <w:t>Main Objective:</w:t>
+      </w:r>
+    </w:p>
+    <w:p>
+      <w:pPr>
+        <w:pStyle w:val="ListParagraph"/>
+        <w:numPr>
+          <w:ilvl w:val="0"/>
+          <w:numId w:val="1"/>
+        </w:numPr>
+      </w:pPr>
+      <w:r>
+        <w:rPr>
+          <w:b/>
+          <w:bCs/>
+        </w:rPr>
+        <w:t xml:space="preserve">Main Objective: </w:t>
+      </w:r>
+      <w:r>
+        <w:t xml:space="preserve">Develop a fully playable Brick Breaker game, with core mechanics (E.g. Ball movement, paddle control, brick-breaking, etc.), and side mechanics (E.g. Menu, Sound, Directional Control, Levels, etc.) that is better than </w:t>
+      </w:r>
+      <w:proofErr w:type="spellStart"/>
+      <w:r>
+        <w:t>Arkanoid</w:t>
+      </w:r>
+      <w:proofErr w:type="spellEnd"/>
+      <w:r>
+        <w:t>.</w:t>
+      </w:r>
+    </w:p>
+    <w:p>
+      <w:pPr>
+        <w:pStyle w:val="ListParagraph"/>
+        <w:rPr>
+          <w:b/>
+          <w:bCs/>
+        </w:rPr>
+      </w:pPr>
+    </w:p>
+    <w:p>
+      <w:pPr>
+        <w:pStyle w:val="ListParagraph"/>
+        <w:rPr>
+          <w:b/>
+          <w:bCs/>
+          <w:color w:val="7030A0"/>
+        </w:rPr>
+      </w:pPr>
+      <w:r>
+        <w:rPr>
+          <w:b/>
+          <w:bCs/>
+          <w:color w:val="7030A0"/>
+        </w:rPr>
+        <w:t xml:space="preserve">How It Has Been Completed: </w:t>
+      </w:r>
+    </w:p>
+    <w:p>
+      <w:pPr>
+        <w:pStyle w:val="ListParagraph"/>
+        <w:numPr>
+          <w:ilvl w:val="1"/>
+          <w:numId w:val="1"/>
+        </w:numPr>
+      </w:pPr>
+      <w:r>
+        <w:t>Produced fully playable Brick Breaker game with the core mechanics (E.g. Ball movement, paddle control, brick-breaking, etc.)</w:t>
+      </w:r>
+    </w:p>
+    <w:p>
+      <w:pPr>
+        <w:pStyle w:val="ListParagraph"/>
+        <w:ind w:left="1440"/>
+      </w:pPr>
+    </w:p>
+    <w:p>
+      <w:pPr>
+        <w:pStyle w:val="ListParagraph"/>
+        <w:numPr>
+          <w:ilvl w:val="1"/>
+          <w:numId w:val="1"/>
+        </w:numPr>
+      </w:pPr>
+      <w:r>
+        <w:t>Also have side mechanics (E.g. Menu, Sound, Directional Control, Levels, etc.)</w:t>
+      </w:r>
+    </w:p>
+    <w:p>
+      <w:pPr>
+        <w:pStyle w:val="ListParagraph"/>
+      </w:pPr>
+    </w:p>
+    <w:p/>
+    <w:p>
+      <w:pPr>
+        <w:rPr>
+          <w:b/>
+          <w:bCs/>
+          <w:color w:val="FF0000"/>
+        </w:rPr>
+      </w:pPr>
+      <w:r>
+        <w:rPr>
+          <w:b/>
+          <w:bCs/>
+          <w:color w:val="FF0000"/>
+        </w:rPr>
+        <w:t>Completion</w:t>
+      </w:r>
+      <w:r>
+        <w:rPr>
+          <w:b/>
+          <w:bCs/>
+          <w:color w:val="FF0000"/>
+        </w:rPr>
+        <w:t xml:space="preserve"> of Side Objectives:</w:t>
+      </w:r>
+    </w:p>
+    <w:p>
+      <w:pPr>
+        <w:pStyle w:val="ListParagraph"/>
+        <w:numPr>
+          <w:ilvl w:val="0"/>
+          <w:numId w:val="1"/>
+        </w:numPr>
+      </w:pPr>
+      <w:r>
+        <w:rPr>
+          <w:b/>
+          <w:bCs/>
+        </w:rPr>
+        <w:t xml:space="preserve">Side Objective #1: </w:t>
+      </w:r>
+      <w:r>
+        <w:t>Implement collision detection between ball, paddle, bricks</w:t>
+      </w:r>
+    </w:p>
+    <w:p>
+      <w:pPr>
+        <w:pStyle w:val="ListParagraph"/>
+        <w:rPr>
+          <w:b/>
+          <w:bCs/>
+        </w:rPr>
+      </w:pPr>
+    </w:p>
+    <w:p>
+      <w:pPr>
+        <w:pStyle w:val="ListParagraph"/>
+        <w:ind w:left="1080"/>
+        <w:rPr>
+          <w:b/>
+          <w:bCs/>
+          <w:color w:val="7030A0"/>
+        </w:rPr>
+      </w:pPr>
+      <w:r>
+        <w:rPr>
+          <w:b/>
+          <w:bCs/>
+          <w:color w:val="7030A0"/>
+        </w:rPr>
+        <w:t>How It Has Been Completed:</w:t>
+      </w:r>
+    </w:p>
+    <w:p>
+      <w:pPr>
+        <w:pStyle w:val="ListParagraph"/>
+        <w:numPr>
+          <w:ilvl w:val="1"/>
+          <w:numId w:val="1"/>
+        </w:numPr>
+        <w:ind w:left="1800"/>
+      </w:pPr>
+      <w:r>
+        <w:t>Have collision detection between ball, paddle, bricks</w:t>
+      </w:r>
+    </w:p>
+    <w:p>
+      <w:pPr>
+        <w:pStyle w:val="ListParagraph"/>
+        <w:numPr>
+          <w:ilvl w:val="1"/>
+          <w:numId w:val="1"/>
+        </w:numPr>
+        <w:ind w:left="1800"/>
+      </w:pPr>
+      <w:r>
+        <w:t>Ball and paddle collide, leading to y-direction of ball to be reversed</w:t>
+      </w:r>
+    </w:p>
+    <w:p>
+      <w:pPr>
+        <w:pStyle w:val="ListParagraph"/>
+        <w:numPr>
+          <w:ilvl w:val="1"/>
+          <w:numId w:val="1"/>
+        </w:numPr>
+        <w:ind w:left="1800"/>
+      </w:pPr>
+      <w:r>
+        <w:t>Ball collides with bricks, leading to y-direction of ball to be reversed and brick to be removed from game</w:t>
+      </w:r>
+    </w:p>
+    <w:p>
+      <w:pPr>
+        <w:pStyle w:val="ListParagraph"/>
+      </w:pPr>
+    </w:p>
+    <w:p>
+      <w:pPr>
+        <w:pStyle w:val="ListParagraph"/>
+      </w:pPr>
+    </w:p>
+    <w:p>
+      <w:pPr>
+        <w:pStyle w:val="ListParagraph"/>
+        <w:numPr>
+          <w:ilvl w:val="0"/>
+          <w:numId w:val="1"/>
+        </w:numPr>
+      </w:pPr>
+      <w:r>
+        <w:rPr>
+          <w:b/>
+          <w:bCs/>
+        </w:rPr>
+        <w:t xml:space="preserve">Side Objective #2: </w:t>
+      </w:r>
+      <w:r>
+        <w:t>Design progressive difficulty, where it has multiple levels with increasing challenges</w:t>
+      </w:r>
+    </w:p>
+    <w:p>
+      <w:pPr>
+        <w:pStyle w:val="ListParagraph"/>
+      </w:pPr>
+    </w:p>
+    <w:p>
+      <w:pPr>
+        <w:pStyle w:val="ListParagraph"/>
+        <w:ind w:left="1440"/>
+        <w:rPr>
+          <w:b/>
+          <w:bCs/>
+          <w:color w:val="7030A0"/>
+        </w:rPr>
+      </w:pPr>
+      <w:r>
+        <w:rPr>
+          <w:b/>
+          <w:bCs/>
+          <w:color w:val="7030A0"/>
+        </w:rPr>
+        <w:t>How It Has Been Completed:</w:t>
+      </w:r>
+    </w:p>
+    <w:p>
+      <w:pPr>
+        <w:pStyle w:val="ListParagraph"/>
+        <w:numPr>
+          <w:ilvl w:val="2"/>
+          <w:numId w:val="1"/>
+        </w:numPr>
+        <w:rPr>
+          <w:b/>
+          <w:bCs/>
+        </w:rPr>
+      </w:pPr>
+      <w:r>
+        <w:t>Have 5 levels (1-5), where each level introduces a new type of block, and each level gets progressively harder</w:t>
+      </w:r>
+    </w:p>
+    <w:p>
+      <w:pPr>
+        <w:pStyle w:val="ListParagraph"/>
+        <w:ind w:left="2160"/>
+      </w:pPr>
+    </w:p>
+    <w:p>
+      <w:pPr>
+        <w:pStyle w:val="ListParagraph"/>
+        <w:numPr>
+          <w:ilvl w:val="2"/>
+          <w:numId w:val="1"/>
+        </w:numPr>
+        <w:rPr>
+          <w:b/>
+          <w:bCs/>
+        </w:rPr>
+      </w:pPr>
+      <w:r>
+        <w:t>Where level 5 has a boss level (The hardest level)</w:t>
+      </w:r>
+    </w:p>
+    <w:p>
+      <w:pPr>
+        <w:pStyle w:val="ListParagraph"/>
+        <w:rPr>
+          <w:b/>
+          <w:bCs/>
+        </w:rPr>
+      </w:pPr>
+    </w:p>
+    <w:p>
+      <w:pPr>
+        <w:rPr>
+          <w:b/>
+          <w:bCs/>
+        </w:rPr>
+      </w:pPr>
+    </w:p>
+    <w:p>
+      <w:pPr>
+        <w:pStyle w:val="ListParagraph"/>
+        <w:numPr>
+          <w:ilvl w:val="0"/>
+          <w:numId w:val="1"/>
+        </w:numPr>
+      </w:pPr>
+      <w:r>
+        <w:rPr>
+          <w:b/>
+          <w:bCs/>
+        </w:rPr>
+        <w:t xml:space="preserve">Side Objective #3: </w:t>
+      </w:r>
+      <w:r>
+        <w:t xml:space="preserve">Make power-ups &amp; other mechanics to enhance gameplay </w:t>
+      </w:r>
+    </w:p>
+    <w:p>
+      <w:pPr>
+        <w:pStyle w:val="ListParagraph"/>
+        <w:rPr>
+          <w:b/>
+          <w:bCs/>
+        </w:rPr>
+      </w:pPr>
+    </w:p>
+    <w:p>
+      <w:pPr>
+        <w:pStyle w:val="ListParagraph"/>
+        <w:ind w:left="1440"/>
+        <w:rPr>
+          <w:b/>
+          <w:bCs/>
+          <w:color w:val="7030A0"/>
+        </w:rPr>
+      </w:pPr>
+      <w:r>
+        <w:rPr>
+          <w:b/>
+          <w:bCs/>
+          <w:color w:val="7030A0"/>
+        </w:rPr>
+        <w:t>How It Has Been Completed:</w:t>
+      </w:r>
+    </w:p>
+    <w:p>
+      <w:pPr>
+        <w:pStyle w:val="ListParagraph"/>
+        <w:numPr>
+          <w:ilvl w:val="2"/>
+          <w:numId w:val="1"/>
+        </w:numPr>
+        <w:rPr>
+          <w:b/>
+          <w:bCs/>
+        </w:rPr>
+      </w:pPr>
+      <w:r>
+        <w:t>Have a power-up that has a 1/8 chance of spawning after the breaking of a normal brick, where the power-up spawns an extra ball in game</w:t>
+      </w:r>
+    </w:p>
+    <w:p>
+      <w:pPr>
+        <w:pStyle w:val="ListParagraph"/>
+        <w:ind w:left="2160"/>
+        <w:rPr>
+          <w:b/>
+          <w:bCs/>
+        </w:rPr>
+      </w:pPr>
+    </w:p>
+    <w:p>
+      <w:pPr>
+        <w:pStyle w:val="ListParagraph"/>
+        <w:numPr>
+          <w:ilvl w:val="2"/>
+          <w:numId w:val="1"/>
+        </w:numPr>
+        <w:rPr>
+          <w:b/>
+          <w:bCs/>
+        </w:rPr>
+      </w:pPr>
+      <w:r>
+        <w:t>Other game mechanics include</w:t>
+      </w:r>
+      <w:r>
+        <w:t xml:space="preserve"> different types of blocks, and a boss level, which enhances gameplay</w:t>
+      </w:r>
+    </w:p>
+    <w:p>
+      <w:pPr>
+        <w:rPr>
+          <w:b/>
+          <w:bCs/>
+        </w:rPr>
+      </w:pPr>
+    </w:p>
+    <w:p>
+      <w:pPr>
+        <w:rPr>
+          <w:b/>
+          <w:bCs/>
+        </w:rPr>
+      </w:pPr>
+    </w:p>
+    <w:p>
+      <w:pPr>
+        <w:rPr>
+          <w:b/>
+          <w:bCs/>
+        </w:rPr>
+      </w:pPr>
+    </w:p>
+    <w:p>
+      <w:pPr>
+        <w:rPr>
+          <w:b/>
+          <w:bCs/>
+        </w:rPr>
+      </w:pPr>
+    </w:p>
+    <w:p>
+      <w:pPr>
+        <w:rPr>
+          <w:b/>
+          <w:bCs/>
+        </w:rPr>
+      </w:pPr>
+    </w:p>
+    <w:p>
+      <w:pPr>
+        <w:rPr>
+          <w:b/>
+          <w:bCs/>
+        </w:rPr>
+      </w:pPr>
+    </w:p>
+    <w:p>
+      <w:pPr>
+        <w:pStyle w:val="ListParagraph"/>
+        <w:numPr>
+          <w:ilvl w:val="0"/>
+          <w:numId w:val="1"/>
+        </w:numPr>
+      </w:pPr>
+      <w:r>
+        <w:rPr>
+          <w:b/>
+          <w:bCs/>
+        </w:rPr>
+        <w:lastRenderedPageBreak/>
+        <w:t xml:space="preserve">Side Objective #4: </w:t>
+      </w:r>
+      <w:r>
+        <w:t>Ensure smooth performance, efficient use of memory, and user-friendly control</w:t>
+      </w:r>
+    </w:p>
+    <w:p>
+      <w:pPr>
+        <w:pStyle w:val="ListParagraph"/>
+        <w:ind w:left="1440"/>
+        <w:rPr>
+          <w:b/>
+          <w:bCs/>
+        </w:rPr>
+      </w:pPr>
+    </w:p>
+    <w:p>
+      <w:pPr>
+        <w:pStyle w:val="ListParagraph"/>
+        <w:ind w:left="1440"/>
+        <w:rPr>
+          <w:b/>
+          <w:bCs/>
+          <w:color w:val="7030A0"/>
+        </w:rPr>
+      </w:pPr>
+      <w:r>
+        <w:rPr>
+          <w:b/>
+          <w:bCs/>
+          <w:color w:val="7030A0"/>
+        </w:rPr>
+        <w:t>How It Has Been Completed:</w:t>
+      </w:r>
+    </w:p>
+    <w:p>
+      <w:pPr>
+        <w:pStyle w:val="ListParagraph"/>
+        <w:numPr>
+          <w:ilvl w:val="2"/>
+          <w:numId w:val="1"/>
+        </w:numPr>
+        <w:rPr>
+          <w:b/>
+          <w:bCs/>
+        </w:rPr>
+      </w:pPr>
+      <w:r>
+        <w:t>Code has been optimised with the use of Object-Oriented Programming, to run as smoothly as possible, where this leads to efficient use of memory, and user-friendly control</w:t>
+      </w:r>
+    </w:p>
+    <w:p>
+      <w:pPr>
+        <w:ind w:left="720"/>
+        <w:rPr>
+          <w:b/>
+          <w:bCs/>
+        </w:rPr>
+      </w:pPr>
+    </w:p>
+    <w:p>
+      <w:pPr>
+        <w:pStyle w:val="ListParagraph"/>
+        <w:numPr>
+          <w:ilvl w:val="2"/>
+          <w:numId w:val="1"/>
+        </w:numPr>
+        <w:rPr>
+          <w:b/>
+          <w:bCs/>
+        </w:rPr>
+      </w:pPr>
+      <w:r>
+        <w:t xml:space="preserve">Controls are very user-friendly, with only left and right arrow keys as well as </w:t>
+      </w:r>
+      <w:r>
+        <w:t xml:space="preserve">using a mouse to </w:t>
+      </w:r>
+      <w:r>
+        <w:t>navigate through the main menu</w:t>
+      </w:r>
+    </w:p>
+    <w:p>
+      <w:pPr>
+        <w:pStyle w:val="ListParagraph"/>
+        <w:rPr>
+          <w:b/>
+          <w:bCs/>
+        </w:rPr>
+      </w:pPr>
+    </w:p>
+    <w:p>
+      <w:pPr>
+        <w:pStyle w:val="ListParagraph"/>
+        <w:numPr>
+          <w:ilvl w:val="2"/>
+          <w:numId w:val="1"/>
+        </w:numPr>
+        <w:rPr>
+          <w:b/>
+          <w:bCs/>
+        </w:rPr>
+      </w:pPr>
+      <w:r>
+        <w:t>The screens have also been made to be minimalistic and aesthetic, to further make it user-friendly, with large buttons and large texts to allow for a more diverse audience (Inclusivity)</w:t>
+      </w:r>
+    </w:p>
+    <w:p>
+      <w:pPr>
+        <w:ind w:left="720"/>
+        <w:rPr>
+          <w:b/>
+          <w:bCs/>
+        </w:rPr>
+      </w:pPr>
+    </w:p>
+    <w:p>
+      <w:pPr>
+        <w:pStyle w:val="ListParagraph"/>
+      </w:pPr>
+    </w:p>
+    <w:p>
+      <w:pPr>
+        <w:pStyle w:val="ListParagraph"/>
+        <w:numPr>
+          <w:ilvl w:val="0"/>
+          <w:numId w:val="1"/>
+        </w:numPr>
+      </w:pPr>
+      <w:r>
+        <w:rPr>
+          <w:b/>
+          <w:bCs/>
+        </w:rPr>
+        <w:t xml:space="preserve">Side Objective #4: </w:t>
+      </w:r>
+      <w:r>
+        <w:t>Make clear and aesthetic “Game Over” and “Win” conditions/screens, with menus and such allowing players to start / restart the game</w:t>
+      </w:r>
+    </w:p>
+    <w:p>
+      <w:pPr>
+        <w:pStyle w:val="ListParagraph"/>
+        <w:rPr>
+          <w:b/>
+          <w:bCs/>
+        </w:rPr>
+      </w:pPr>
+    </w:p>
+    <w:p>
+      <w:pPr>
+        <w:pStyle w:val="ListParagraph"/>
+        <w:ind w:left="1440"/>
+        <w:rPr>
+          <w:b/>
+          <w:bCs/>
+          <w:color w:val="7030A0"/>
+        </w:rPr>
+      </w:pPr>
+      <w:r>
+        <w:rPr>
+          <w:b/>
+          <w:bCs/>
+          <w:color w:val="7030A0"/>
+        </w:rPr>
+        <w:t>How It Has Been Completed:</w:t>
+      </w:r>
+    </w:p>
+    <w:p>
+      <w:pPr>
+        <w:pStyle w:val="ListParagraph"/>
+        <w:numPr>
+          <w:ilvl w:val="2"/>
+          <w:numId w:val="1"/>
+        </w:numPr>
+        <w:rPr>
+          <w:b/>
+          <w:bCs/>
+        </w:rPr>
+      </w:pPr>
+      <w:r>
+        <w:t>Have clear and aesthetic “Game Over” and “Win” screens, which are displayed when the game is over, which also displays the final score</w:t>
+      </w:r>
+      <w:r>
+        <w:t>, and has buttons to go back to main menu or to restart the game directly</w:t>
+      </w:r>
+    </w:p>
+    <w:p>
+      <w:pPr>
+        <w:pStyle w:val="ListParagraph"/>
+      </w:pPr>
+    </w:p>
+    <w:p>
+      <w:pPr>
+        <w:pStyle w:val="ListParagraph"/>
+        <w:numPr>
+          <w:ilvl w:val="2"/>
+          <w:numId w:val="1"/>
+        </w:numPr>
+        <w:rPr>
+          <w:b/>
+          <w:bCs/>
+        </w:rPr>
+      </w:pPr>
+      <w:r>
+        <w:t xml:space="preserve">Have a full main menu system, with </w:t>
+      </w:r>
+      <w:r>
+        <w:t>screens allowing users to pause the game and to look at the controls for the game</w:t>
+      </w:r>
+    </w:p>
+    <w:p>
+      <w:pPr>
+        <w:pStyle w:val="ListParagraph"/>
+        <w:rPr>
+          <w:b/>
+          <w:bCs/>
+        </w:rPr>
+      </w:pPr>
+    </w:p>
+    <w:p>
+      <w:pPr>
+        <w:pStyle w:val="ListParagraph"/>
+        <w:numPr>
+          <w:ilvl w:val="2"/>
+          <w:numId w:val="1"/>
+        </w:numPr>
+        <w:rPr>
+          <w:b/>
+          <w:bCs/>
+        </w:rPr>
+      </w:pPr>
+      <w:r>
+        <w:t>Made using a Game State Manager</w:t>
+      </w:r>
+    </w:p>
+    <w:p>
+      <w:pPr>
+        <w:rPr>
+          <w:b/>
+          <w:bCs/>
+        </w:rPr>
+      </w:pPr>
+    </w:p>
     <w:sectPr>
       <w:pgSz w:w="11906" w:h="16838"/>
       <w:pgMar w:top="720" w:right="720" w:bottom="720" w:left="720" w:header="708" w:footer="708" w:gutter="0"/>
@@ -7439,7 +8640,7 @@
         <w:rFonts w:ascii="Wingdings" w:hAnsi="Wingdings" w:hint="default"/>
       </w:rPr>
     </w:lvl>
-    <w:lvl w:ilvl="3" w:tplc="0C090001" w:tentative="1">
+    <w:lvl w:ilvl="3" w:tplc="0C090001">
       <w:start w:val="1"/>
       <w:numFmt w:val="bullet"/>
       <w:lvlText w:val=""/>
@@ -8037,15 +9238,6 @@
   </w:num>
   <w:num w:numId="7" w16cid:durableId="2109692289">
     <w:abstractNumId w:val="0"/>
-    <w:lvlOverride w:ilvl="0"/>
-    <w:lvlOverride w:ilvl="1"/>
-    <w:lvlOverride w:ilvl="2"/>
-    <w:lvlOverride w:ilvl="3"/>
-    <w:lvlOverride w:ilvl="4"/>
-    <w:lvlOverride w:ilvl="5"/>
-    <w:lvlOverride w:ilvl="6"/>
-    <w:lvlOverride w:ilvl="7"/>
-    <w:lvlOverride w:ilvl="8"/>
   </w:num>
 </w:numbering>
 </file>
@@ -8450,6 +9642,7 @@
   <w:style w:type="paragraph" w:default="1" w:styleId="Normal">
     <w:name w:val="Normal"/>
     <w:qFormat/>
+    <w:rsid w:val="00620665"/>
   </w:style>
   <w:style w:type="paragraph" w:styleId="Heading1">
     <w:name w:val="heading 1"/>
@@ -8653,6 +9846,7 @@
   <w:style w:type="character" w:default="1" w:styleId="DefaultParagraphFont">
     <w:name w:val="Default Paragraph Font"/>
     <w:uiPriority w:val="1"/>
+    <w:semiHidden/>
     <w:unhideWhenUsed/>
   </w:style>
   <w:style w:type="table" w:default="1" w:styleId="TableNormal">

</xml_diff>

<commit_message>
Changed level to level 1, now playable
</commit_message>
<xml_diff>
--- a/Brick Blitz Documentation - Berkay Topal.docx
+++ b/Brick Blitz Documentation - Berkay Topal.docx
@@ -8715,11 +8715,703 @@
     </w:p>
     <w:p>
       <w:pPr>
-        <w:rPr>
-          <w:b/>
-          <w:bCs/>
-        </w:rPr>
-      </w:pPr>
+        <w:pStyle w:val="ListParagraph"/>
+        <w:numPr>
+          <w:ilvl w:val="0"/>
+          <w:numId w:val="1"/>
+        </w:numPr>
+        <w:rPr>
+          <w:b/>
+          <w:bCs/>
+        </w:rPr>
+      </w:pPr>
+      <w:r>
+        <w:t>Firstly, game idea (Breakout-Style games) is not copyrighted, where the game mechanics themselves aren’t protected</w:t>
+      </w:r>
+    </w:p>
+    <w:p>
+      <w:pPr>
+        <w:rPr>
+          <w:b/>
+          <w:bCs/>
+        </w:rPr>
+      </w:pPr>
+    </w:p>
+    <w:p>
+      <w:pPr>
+        <w:pStyle w:val="ListParagraph"/>
+        <w:numPr>
+          <w:ilvl w:val="0"/>
+          <w:numId w:val="1"/>
+        </w:numPr>
+        <w:rPr>
+          <w:b/>
+          <w:bCs/>
+        </w:rPr>
+      </w:pPr>
+      <w:r>
+        <w:t>Only used one external asset for this game, which was the background picture for the main menu, where this is sourced from a royalty-free website (Vec</w:t>
+      </w:r>
+      <w:r>
+        <w:t>teezy.com)</w:t>
+      </w:r>
+    </w:p>
+    <w:p>
+      <w:pPr>
+        <w:pStyle w:val="ListParagraph"/>
+        <w:rPr>
+          <w:b/>
+          <w:bCs/>
+        </w:rPr>
+      </w:pPr>
+    </w:p>
+    <w:p>
+      <w:pPr>
+        <w:pStyle w:val="ListParagraph"/>
+        <w:numPr>
+          <w:ilvl w:val="1"/>
+          <w:numId w:val="1"/>
+        </w:numPr>
+        <w:rPr>
+          <w:b/>
+          <w:bCs/>
+        </w:rPr>
+      </w:pPr>
+      <w:r>
+        <w:t>Hence no copyrighted material used without permission</w:t>
+      </w:r>
+    </w:p>
+    <w:p>
+      <w:pPr>
+        <w:rPr>
+          <w:b/>
+          <w:bCs/>
+        </w:rPr>
+      </w:pPr>
+    </w:p>
+    <w:p>
+      <w:pPr>
+        <w:pStyle w:val="ListParagraph"/>
+        <w:numPr>
+          <w:ilvl w:val="0"/>
+          <w:numId w:val="1"/>
+        </w:numPr>
+        <w:rPr>
+          <w:b/>
+          <w:bCs/>
+        </w:rPr>
+      </w:pPr>
+      <w:r>
+        <w:t>Game does not collect and store any personal data</w:t>
+      </w:r>
+    </w:p>
+    <w:p>
+      <w:pPr>
+        <w:pStyle w:val="ListParagraph"/>
+        <w:numPr>
+          <w:ilvl w:val="1"/>
+          <w:numId w:val="1"/>
+        </w:numPr>
+        <w:rPr>
+          <w:b/>
+          <w:bCs/>
+        </w:rPr>
+      </w:pPr>
+      <w:r>
+        <w:t xml:space="preserve">Though for future improvements of the game, and for distribution of the game worldwide, would need to consider </w:t>
+      </w:r>
+      <w:r>
+        <w:t>user privacy and comply with the relevant data protection laws</w:t>
+      </w:r>
+    </w:p>
+    <w:p>
+      <w:pPr>
+        <w:pStyle w:val="ListParagraph"/>
+        <w:ind w:left="1440"/>
+      </w:pPr>
+    </w:p>
+    <w:p>
+      <w:pPr>
+        <w:pStyle w:val="ListParagraph"/>
+        <w:numPr>
+          <w:ilvl w:val="1"/>
+          <w:numId w:val="1"/>
+        </w:numPr>
+        <w:rPr>
+          <w:b/>
+          <w:bCs/>
+        </w:rPr>
+      </w:pPr>
+      <w:r>
+        <w:t>But as of now, does comply with data protection laws such as GDPR (EU) and CCPA (California)</w:t>
+      </w:r>
+    </w:p>
+    <w:p>
+      <w:pPr>
+        <w:pStyle w:val="ListParagraph"/>
+        <w:rPr>
+          <w:b/>
+          <w:bCs/>
+        </w:rPr>
+      </w:pPr>
+    </w:p>
+    <w:p>
+      <w:pPr>
+        <w:pStyle w:val="ListParagraph"/>
+        <w:rPr>
+          <w:b/>
+          <w:bCs/>
+        </w:rPr>
+      </w:pPr>
+    </w:p>
+    <w:p>
+      <w:pPr>
+        <w:pStyle w:val="ListParagraph"/>
+        <w:numPr>
+          <w:ilvl w:val="0"/>
+          <w:numId w:val="1"/>
+        </w:numPr>
+        <w:rPr>
+          <w:b/>
+          <w:bCs/>
+        </w:rPr>
+      </w:pPr>
+      <w:r>
+        <w:t xml:space="preserve">Not planning on selling game for money, or have in-app purchases, though if I </w:t>
+      </w:r>
+      <w:proofErr w:type="gramStart"/>
+      <w:r>
+        <w:t>do;</w:t>
+      </w:r>
+      <w:proofErr w:type="gramEnd"/>
+    </w:p>
+    <w:p>
+      <w:pPr>
+        <w:pStyle w:val="ListParagraph"/>
+        <w:numPr>
+          <w:ilvl w:val="1"/>
+          <w:numId w:val="1"/>
+        </w:numPr>
+        <w:rPr>
+          <w:b/>
+          <w:bCs/>
+        </w:rPr>
+      </w:pPr>
+      <w:r>
+        <w:t>Would need to comply with the monetisation polices of Apple App Store and Google Play</w:t>
+      </w:r>
+    </w:p>
+    <w:p>
+      <w:pPr>
+        <w:pStyle w:val="ListParagraph"/>
+        <w:numPr>
+          <w:ilvl w:val="1"/>
+          <w:numId w:val="1"/>
+        </w:numPr>
+        <w:rPr>
+          <w:b/>
+          <w:bCs/>
+        </w:rPr>
+      </w:pPr>
+      <w:r>
+        <w:t>If I use in-game objects such as loot boxes, must make sure it’s for certain countries, as it is not allowed in some (E.g. Belgium, Netherlands)</w:t>
+      </w:r>
+    </w:p>
+    <w:p>
+      <w:pPr>
+        <w:pStyle w:val="ListParagraph"/>
+      </w:pPr>
+    </w:p>
+    <w:p>
+      <w:pPr>
+        <w:pStyle w:val="ListParagraph"/>
+      </w:pPr>
+    </w:p>
+    <w:p>
+      <w:pPr>
+        <w:pStyle w:val="ListParagraph"/>
+        <w:numPr>
+          <w:ilvl w:val="0"/>
+          <w:numId w:val="1"/>
+        </w:numPr>
+        <w:rPr>
+          <w:b/>
+          <w:bCs/>
+        </w:rPr>
+      </w:pPr>
+      <w:r>
+        <w:t>Have taken into consideration ethical game design, where made only levels 1-5, to ensure that the game does not encourage unhealthy playing</w:t>
+      </w:r>
+    </w:p>
+    <w:p>
+      <w:pPr>
+        <w:ind w:left="360"/>
+        <w:rPr>
+          <w:b/>
+          <w:bCs/>
+        </w:rPr>
+      </w:pPr>
+    </w:p>
+    <w:p>
+      <w:pPr>
+        <w:pStyle w:val="ListParagraph"/>
+        <w:numPr>
+          <w:ilvl w:val="0"/>
+          <w:numId w:val="1"/>
+        </w:numPr>
+        <w:rPr>
+          <w:b/>
+          <w:bCs/>
+        </w:rPr>
+      </w:pPr>
+      <w:r>
+        <w:t>Different bricks are different colours, to allow for easy distinguishing</w:t>
+      </w:r>
+    </w:p>
+    <w:p>
+      <w:pPr>
+        <w:pStyle w:val="ListParagraph"/>
+        <w:numPr>
+          <w:ilvl w:val="1"/>
+          <w:numId w:val="1"/>
+        </w:numPr>
+        <w:rPr>
+          <w:b/>
+          <w:bCs/>
+        </w:rPr>
+      </w:pPr>
+      <w:r>
+        <w:t>Though no structural difference in bricks, hence the game is not colourblind friendly (Would need to fix in future if was to release the game)</w:t>
+      </w:r>
+    </w:p>
+    <w:p>
+      <w:pPr>
+        <w:pStyle w:val="ListParagraph"/>
+        <w:rPr>
+          <w:b/>
+          <w:bCs/>
+        </w:rPr>
+      </w:pPr>
+    </w:p>
+    <w:p>
+      <w:pPr>
+        <w:pStyle w:val="ListParagraph"/>
+        <w:rPr>
+          <w:b/>
+          <w:bCs/>
+        </w:rPr>
+      </w:pPr>
+    </w:p>
+    <w:p>
+      <w:pPr>
+        <w:pStyle w:val="ListParagraph"/>
+        <w:rPr>
+          <w:b/>
+          <w:bCs/>
+        </w:rPr>
+      </w:pPr>
+    </w:p>
+    <w:p>
+      <w:pPr>
+        <w:pStyle w:val="ListParagraph"/>
+        <w:rPr>
+          <w:b/>
+          <w:bCs/>
+        </w:rPr>
+      </w:pPr>
+    </w:p>
+    <w:p>
+      <w:pPr>
+        <w:pStyle w:val="ListParagraph"/>
+        <w:rPr>
+          <w:b/>
+          <w:bCs/>
+        </w:rPr>
+      </w:pPr>
+    </w:p>
+    <w:p>
+      <w:pPr>
+        <w:pStyle w:val="ListParagraph"/>
+        <w:rPr>
+          <w:b/>
+          <w:bCs/>
+        </w:rPr>
+      </w:pPr>
+    </w:p>
+    <w:p>
+      <w:pPr>
+        <w:pStyle w:val="ListParagraph"/>
+        <w:rPr>
+          <w:b/>
+          <w:bCs/>
+        </w:rPr>
+      </w:pPr>
+    </w:p>
+    <w:p>
+      <w:pPr>
+        <w:pStyle w:val="ListParagraph"/>
+        <w:rPr>
+          <w:b/>
+          <w:bCs/>
+        </w:rPr>
+      </w:pPr>
+    </w:p>
+    <w:p>
+      <w:pPr>
+        <w:pStyle w:val="ListParagraph"/>
+        <w:rPr>
+          <w:b/>
+          <w:bCs/>
+        </w:rPr>
+      </w:pPr>
+    </w:p>
+    <w:p>
+      <w:pPr>
+        <w:pStyle w:val="ListParagraph"/>
+        <w:rPr>
+          <w:b/>
+          <w:bCs/>
+        </w:rPr>
+      </w:pPr>
+    </w:p>
+    <w:p>
+      <w:pPr>
+        <w:pStyle w:val="ListParagraph"/>
+        <w:rPr>
+          <w:b/>
+          <w:bCs/>
+        </w:rPr>
+      </w:pPr>
+    </w:p>
+    <w:p>
+      <w:pPr>
+        <w:pStyle w:val="ListParagraph"/>
+        <w:rPr>
+          <w:b/>
+          <w:bCs/>
+        </w:rPr>
+      </w:pPr>
+    </w:p>
+    <w:p>
+      <w:pPr>
+        <w:pStyle w:val="ListParagraph"/>
+        <w:rPr>
+          <w:b/>
+          <w:bCs/>
+        </w:rPr>
+      </w:pPr>
+    </w:p>
+    <w:p>
+      <w:pPr>
+        <w:pStyle w:val="ListParagraph"/>
+        <w:rPr>
+          <w:b/>
+          <w:bCs/>
+        </w:rPr>
+      </w:pPr>
+    </w:p>
+    <w:p>
+      <w:pPr>
+        <w:pStyle w:val="ListParagraph"/>
+        <w:rPr>
+          <w:b/>
+          <w:bCs/>
+        </w:rPr>
+      </w:pPr>
+    </w:p>
+    <w:p>
+      <w:pPr>
+        <w:pStyle w:val="ListParagraph"/>
+        <w:rPr>
+          <w:b/>
+          <w:bCs/>
+        </w:rPr>
+      </w:pPr>
+    </w:p>
+    <w:p>
+      <w:pPr>
+        <w:pStyle w:val="ListParagraph"/>
+        <w:rPr>
+          <w:b/>
+          <w:bCs/>
+        </w:rPr>
+      </w:pPr>
+    </w:p>
+    <w:p>
+      <w:pPr>
+        <w:pStyle w:val="ListParagraph"/>
+        <w:rPr>
+          <w:b/>
+          <w:bCs/>
+        </w:rPr>
+      </w:pPr>
+    </w:p>
+    <w:p>
+      <w:pPr>
+        <w:pStyle w:val="ListParagraph"/>
+        <w:rPr>
+          <w:b/>
+          <w:bCs/>
+        </w:rPr>
+      </w:pPr>
+    </w:p>
+    <w:p>
+      <w:pPr>
+        <w:pStyle w:val="ListParagraph"/>
+        <w:rPr>
+          <w:b/>
+          <w:bCs/>
+        </w:rPr>
+      </w:pPr>
+    </w:p>
+    <w:p>
+      <w:pPr>
+        <w:pStyle w:val="ListParagraph"/>
+        <w:rPr>
+          <w:b/>
+          <w:bCs/>
+        </w:rPr>
+      </w:pPr>
+    </w:p>
+    <w:p>
+      <w:pPr>
+        <w:rPr>
+          <w:b/>
+          <w:bCs/>
+          <w:color w:val="00B050"/>
+          <w:u w:val="single"/>
+        </w:rPr>
+      </w:pPr>
+      <w:r>
+        <w:rPr>
+          <w:b/>
+          <w:bCs/>
+          <w:color w:val="00B050"/>
+          <w:u w:val="single"/>
+        </w:rPr>
+        <w:lastRenderedPageBreak/>
+        <w:t xml:space="preserve">Future Improvements </w:t>
+      </w:r>
+      <w:proofErr w:type="gramStart"/>
+      <w:r>
+        <w:rPr>
+          <w:b/>
+          <w:bCs/>
+          <w:color w:val="00B050"/>
+          <w:u w:val="single"/>
+        </w:rPr>
+        <w:t>To</w:t>
+      </w:r>
+      <w:proofErr w:type="gramEnd"/>
+      <w:r>
+        <w:rPr>
+          <w:b/>
+          <w:bCs/>
+          <w:color w:val="00B050"/>
+          <w:u w:val="single"/>
+        </w:rPr>
+        <w:t xml:space="preserve"> </w:t>
+      </w:r>
+      <w:proofErr w:type="gramStart"/>
+      <w:r>
+        <w:rPr>
+          <w:b/>
+          <w:bCs/>
+          <w:color w:val="00B050"/>
+          <w:u w:val="single"/>
+        </w:rPr>
+        <w:t>The</w:t>
+      </w:r>
+      <w:proofErr w:type="gramEnd"/>
+      <w:r>
+        <w:rPr>
+          <w:b/>
+          <w:bCs/>
+          <w:color w:val="00B050"/>
+          <w:u w:val="single"/>
+        </w:rPr>
+        <w:t xml:space="preserve"> Game</w:t>
+      </w:r>
+    </w:p>
+    <w:p>
+      <w:pPr>
+        <w:pStyle w:val="ListParagraph"/>
+        <w:numPr>
+          <w:ilvl w:val="0"/>
+          <w:numId w:val="1"/>
+        </w:numPr>
+      </w:pPr>
+      <w:r>
+        <w:t>Add music and more graphics for bricks and powerups (Paying attention to legal considerations)</w:t>
+      </w:r>
+    </w:p>
+    <w:p>
+      <w:pPr>
+        <w:pStyle w:val="ListParagraph"/>
+        <w:numPr>
+          <w:ilvl w:val="1"/>
+          <w:numId w:val="1"/>
+        </w:numPr>
+      </w:pPr>
+      <w:proofErr w:type="gramStart"/>
+      <w:r>
+        <w:t>Also</w:t>
+      </w:r>
+      <w:proofErr w:type="gramEnd"/>
+      <w:r>
+        <w:t xml:space="preserve"> sound effects for when hitting a bomb, breaking a block, damaging the boss</w:t>
+      </w:r>
+    </w:p>
+    <w:p>
+      <w:pPr>
+        <w:pStyle w:val="ListParagraph"/>
+        <w:numPr>
+          <w:ilvl w:val="1"/>
+          <w:numId w:val="1"/>
+        </w:numPr>
+      </w:pPr>
+      <w:r>
+        <w:t>Add a graphic for the boss brick</w:t>
+      </w:r>
+    </w:p>
+    <w:p>
+      <w:pPr>
+        <w:pStyle w:val="ListParagraph"/>
+        <w:ind w:left="1440"/>
+      </w:pPr>
+    </w:p>
+    <w:p>
+      <w:pPr>
+        <w:pStyle w:val="ListParagraph"/>
+        <w:numPr>
+          <w:ilvl w:val="0"/>
+          <w:numId w:val="1"/>
+        </w:numPr>
+      </w:pPr>
+      <w:r>
+        <w:t xml:space="preserve">Add further levels to the game, to make it more interesting (Though </w:t>
+      </w:r>
+      <w:proofErr w:type="gramStart"/>
+      <w:r>
+        <w:t>have to</w:t>
+      </w:r>
+      <w:proofErr w:type="gramEnd"/>
+      <w:r>
+        <w:t xml:space="preserve"> </w:t>
+      </w:r>
+      <w:proofErr w:type="spellStart"/>
+      <w:proofErr w:type="gramStart"/>
+      <w:r>
+        <w:t>taken</w:t>
+      </w:r>
+      <w:proofErr w:type="spellEnd"/>
+      <w:r>
+        <w:t xml:space="preserve"> into account</w:t>
+      </w:r>
+      <w:proofErr w:type="gramEnd"/>
+      <w:r>
+        <w:t xml:space="preserve"> unhealthy gameplay)</w:t>
+      </w:r>
+    </w:p>
+    <w:p/>
+    <w:p>
+      <w:pPr>
+        <w:pStyle w:val="ListParagraph"/>
+        <w:numPr>
+          <w:ilvl w:val="0"/>
+          <w:numId w:val="1"/>
+        </w:numPr>
+      </w:pPr>
+      <w:r>
+        <w:t>High score system, where can be linked to an external website</w:t>
+      </w:r>
+    </w:p>
+    <w:p>
+      <w:pPr>
+        <w:pStyle w:val="ListParagraph"/>
+      </w:pPr>
+    </w:p>
+    <w:p>
+      <w:pPr>
+        <w:pStyle w:val="ListParagraph"/>
+        <w:numPr>
+          <w:ilvl w:val="0"/>
+          <w:numId w:val="1"/>
+        </w:numPr>
+      </w:pPr>
+      <w:r>
+        <w:t>Add a colourblind mode, or change the structural features of bricks, so colourblind people can distinguish between them</w:t>
+      </w:r>
+    </w:p>
+    <w:p>
+      <w:pPr>
+        <w:pStyle w:val="ListParagraph"/>
+      </w:pPr>
+    </w:p>
+    <w:p>
+      <w:pPr>
+        <w:pStyle w:val="ListParagraph"/>
+        <w:numPr>
+          <w:ilvl w:val="0"/>
+          <w:numId w:val="1"/>
+        </w:numPr>
+      </w:pPr>
+      <w:r>
+        <w:t>Add an unlimited mode (Though may foster unhealthy gameplay)</w:t>
+      </w:r>
+    </w:p>
+    <w:p>
+      <w:pPr>
+        <w:pStyle w:val="ListParagraph"/>
+      </w:pPr>
+    </w:p>
+    <w:p/>
+    <w:p/>
+    <w:p>
+      <w:pPr>
+        <w:rPr>
+          <w:sz w:val="30"/>
+          <w:szCs w:val="30"/>
+        </w:rPr>
+      </w:pPr>
+      <w:r>
+        <w:rPr>
+          <w:b/>
+          <w:bCs/>
+          <w:color w:val="FF0000"/>
+          <w:sz w:val="30"/>
+          <w:szCs w:val="30"/>
+        </w:rPr>
+        <w:t>Date of Finishing Project:</w:t>
+      </w:r>
+      <w:r>
+        <w:rPr>
+          <w:b/>
+          <w:bCs/>
+          <w:sz w:val="30"/>
+          <w:szCs w:val="30"/>
+        </w:rPr>
+        <w:t xml:space="preserve"> </w:t>
+      </w:r>
+      <w:r>
+        <w:rPr>
+          <w:sz w:val="30"/>
+          <w:szCs w:val="30"/>
+        </w:rPr>
+        <w:t>11/04/2025</w:t>
+      </w:r>
+    </w:p>
+    <w:p>
+      <w:pPr>
+        <w:pStyle w:val="ListParagraph"/>
+        <w:numPr>
+          <w:ilvl w:val="0"/>
+          <w:numId w:val="1"/>
+        </w:numPr>
+      </w:pPr>
+      <w:r>
+        <w:t>Berkay Topal</w:t>
+      </w:r>
     </w:p>
     <w:sectPr>
       <w:pgSz w:w="11906" w:h="16838"/>

</xml_diff>